<commit_message>
Update Tailoring commentary - additional materials.docx
</commit_message>
<xml_diff>
--- a/Tailoring commentary - additional materials.docx
+++ b/Tailoring commentary - additional materials.docx
@@ -260,16 +260,7 @@
     </w:p>
     <w:p>
       <w:r>
-        <w:t xml:space="preserve">or </w:t>
-      </w:r>
-      <w:r>
-        <w:t xml:space="preserve">to </w:t>
-      </w:r>
-      <w:r>
-        <w:t>40%</w:t>
-      </w:r>
-      <w:r>
-        <w:t>:</w:t>
+        <w:t>or to 40%:</w:t>
       </w:r>
     </w:p>
     <w:p>
@@ -290,7 +281,27 @@
     </w:p>
     <w:p>
       <w:r>
-        <w:t>We computed this with the user-written software bayesSS (available at …). The command</w:t>
+        <w:t>We computed this with the user-written software bayes</w:t>
+      </w:r>
+      <w:r>
+        <w:t>power</w:t>
+      </w:r>
+      <w:r>
+        <w:t xml:space="preserve"> (available at </w:t>
+      </w:r>
+      <w:hyperlink r:id="rId8" w:history="1">
+        <w:r>
+          <w:rPr>
+            <w:rStyle w:val="Hyperlink"/>
+          </w:rPr>
+          <w:t>https://github.com/CoRE-CTI/Tailoring</w:t>
+        </w:r>
+      </w:hyperlink>
+      <w:r>
+        <w:t>).</w:t>
+      </w:r>
+      <w:r>
+        <w:t xml:space="preserve"> The command</w:t>
       </w:r>
       <w:r>
         <w:t xml:space="preserve"> below </w:t>
@@ -316,10 +327,25 @@
         <w:pStyle w:val="Typeface"/>
       </w:pPr>
       <w:r>
-        <w:t>bayesSS, n1(890) n2(890) priormeand1(.5) priormeand2(.55) reps(1000000) seed(3) nofreq nograph criteria(.80)</w:t>
+        <w:t>bayespower, n1(890) n0(890) priorspec(ms)</w:t>
       </w:r>
       <w:r>
         <w:t xml:space="preserve"> </w:t>
+      </w:r>
+      <w:r>
+        <w:t>prior1d(.55 .001) prior0d(.5 .001)</w:t>
+      </w:r>
+      <w:r>
+        <w:t xml:space="preserve"> </w:t>
+      </w:r>
+      <w:r>
+        <w:t>prior1a(.5 .28867513) prior0a(.5 .28867513)</w:t>
+      </w:r>
+      <w:r>
+        <w:t xml:space="preserve"> </w:t>
+      </w:r>
+      <w:r>
+        <w:t xml:space="preserve">seed(3) criteria(.80) </w:t>
       </w:r>
     </w:p>
     <w:p>
@@ -359,7 +385,26 @@
         <w:pStyle w:val="Typeface"/>
       </w:pPr>
       <w:r>
-        <w:t>bayesSS, n1(282) n2(282) priormeand1(.5) priormeand2(.55) reps(1000000) seed(3) nofreq nograph</w:t>
+        <w:lastRenderedPageBreak/>
+        <w:t>bayespower, n1(</w:t>
+      </w:r>
+      <w:r>
+        <w:t>282</w:t>
+      </w:r>
+      <w:r>
+        <w:t>) n0(</w:t>
+      </w:r>
+      <w:r>
+        <w:t>282</w:t>
+      </w:r>
+      <w:r>
+        <w:t>) priorspec(ms)</w:t>
+      </w:r>
+      <w:r>
+        <w:t xml:space="preserve"> </w:t>
+      </w:r>
+      <w:r>
+        <w:t xml:space="preserve">prior1d(.55 .001) prior0d(.5 .001) prior1a(.5 .28867513) prior0a(.5 .28867513) seed(3) criteria(.80) </w:t>
       </w:r>
     </w:p>
     <w:p>
@@ -367,7 +412,6 @@
         <w:pStyle w:val="Heading3"/>
       </w:pPr>
       <w:r>
-        <w:lastRenderedPageBreak/>
         <w:t>Decision-based approach</w:t>
       </w:r>
     </w:p>
@@ -545,7 +589,7 @@
     <w:p>
       <w:pPr>
         <w:sectPr>
-          <w:footerReference w:type="default" r:id="rId8"/>
+          <w:footerReference w:type="default" r:id="rId9"/>
           <w:pgSz w:w="11906" w:h="16838" w:code="9"/>
           <w:pgMar w:top="1440" w:right="1440" w:bottom="1440" w:left="1440" w:header="709" w:footer="709" w:gutter="0"/>
           <w:cols w:space="708"/>
@@ -4817,6 +4861,7 @@
   <w:style w:type="character" w:default="1" w:styleId="DefaultParagraphFont">
     <w:name w:val="Default Paragraph Font"/>
     <w:uiPriority w:val="1"/>
+    <w:semiHidden/>
     <w:unhideWhenUsed/>
   </w:style>
   <w:style w:type="table" w:default="1" w:styleId="TableNormal">

</xml_diff>

<commit_message>
Round SDs to 2dp
more reader-friendly, and doesn't change results
</commit_message>
<xml_diff>
--- a/Tailoring commentary - additional materials.docx
+++ b/Tailoring commentary - additional materials.docx
@@ -45,6 +45,14 @@
     <w:p>
       <w:pPr>
         <w:pStyle w:val="Heading3"/>
+        <w:rPr>
+          <w:ins w:id="1" w:author="Matt Sydes" w:date="2026-07-03T17:23:00Z" w16du:dateUtc="2026-07-03T16:23:00Z"/>
+        </w:rPr>
+      </w:pPr>
+    </w:p>
+    <w:p>
+      <w:pPr>
+        <w:pStyle w:val="Heading3"/>
       </w:pPr>
       <w:r>
         <w:t>Superiority of either of NACRT or NACT over the other</w:t>
@@ -144,150 +152,415 @@
         <w:pStyle w:val="Typeface"/>
       </w:pPr>
       <w:r>
-        <w:t>artbin, pr(.5 .55) power(.9) alpha(.05)</w:t>
+        <w:t>artbin, pr(</w:t>
+      </w:r>
+      <w:del w:id="2" w:author="Matt Sydes" w:date="2026-07-03T17:23:00Z" w16du:dateUtc="2026-07-03T16:23:00Z">
+        <w:r>
+          <w:delText xml:space="preserve">.5 </w:delText>
+        </w:r>
+      </w:del>
+      <w:ins w:id="3" w:author="Matt Sydes" w:date="2026-07-03T17:23:00Z" w16du:dateUtc="2026-07-03T16:23:00Z">
+        <w:r>
+          <w:t xml:space="preserve">0.50 </w:t>
+        </w:r>
+      </w:ins>
+      <w:del w:id="4" w:author="Matt Sydes" w:date="2026-07-03T17:24:00Z" w16du:dateUtc="2026-07-03T16:24:00Z">
+        <w:r>
+          <w:delText>.55</w:delText>
+        </w:r>
+      </w:del>
+      <w:ins w:id="5" w:author="Matt Sydes" w:date="2026-07-03T17:24:00Z" w16du:dateUtc="2026-07-03T16:24:00Z">
+        <w:r>
+          <w:t>0.55</w:t>
+        </w:r>
+      </w:ins>
+      <w:r>
+        <w:t>) power(</w:t>
+      </w:r>
+      <w:del w:id="6" w:author="Matt Sydes" w:date="2026-07-03T17:24:00Z" w16du:dateUtc="2026-07-03T16:24:00Z">
+        <w:r>
+          <w:delText>.9</w:delText>
+        </w:r>
+      </w:del>
+      <w:ins w:id="7" w:author="Matt Sydes" w:date="2026-07-03T17:24:00Z" w16du:dateUtc="2026-07-03T16:24:00Z">
+        <w:r>
+          <w:t>0.90</w:t>
+        </w:r>
+      </w:ins>
+      <w:r>
+        <w:t>) alpha(</w:t>
+      </w:r>
+      <w:ins w:id="8" w:author="Matt Sydes" w:date="2026-07-03T17:28:00Z" w16du:dateUtc="2026-07-03T16:28:00Z">
+        <w:r>
+          <w:t>0</w:t>
+        </w:r>
+      </w:ins>
+      <w:r>
+        <w:t>.05)</w:t>
       </w:r>
     </w:p>
     <w:p>
       <w:pPr>
         <w:pStyle w:val="Heading3"/>
-      </w:pPr>
-      <w:r>
-        <w:t xml:space="preserve">Superiority of NACRT over NACT </w:t>
-      </w:r>
-      <w:r>
-        <w:t>or</w:t>
-      </w:r>
-      <w:r>
-        <w:t xml:space="preserve"> of NACT over NACRT</w:t>
-      </w:r>
+        <w:rPr>
+          <w:ins w:id="9" w:author="Matt Sydes" w:date="2026-07-03T17:23:00Z" w16du:dateUtc="2026-07-03T16:23:00Z"/>
+        </w:rPr>
+      </w:pPr>
     </w:p>
     <w:p>
-      <w:r>
-        <w:t xml:space="preserve">The previous sample size calculation is </w:t>
-      </w:r>
-      <w:r>
-        <w:t>changed to test at the one-sided, rather than two-sided, 5% level</w:t>
-      </w:r>
-      <w:r>
-        <w:t>:</w:t>
+      <w:pPr>
+        <w:pStyle w:val="Heading3"/>
+      </w:pPr>
+      <w:r>
+        <w:t xml:space="preserve">Superiority of NACRT over NACT </w:t>
+      </w:r>
+      <w:r>
+        <w:t>or</w:t>
+      </w:r>
+      <w:r>
+        <w:t xml:space="preserve"> of NACT over NACRT</w:t>
       </w:r>
     </w:p>
     <w:p>
-      <w:pPr>
-        <w:pStyle w:val="Typeface"/>
-      </w:pPr>
-      <w:r>
-        <w:t>artbin, pr(.5 .55) power(.9) alpha(.05) onesided</w:t>
+      <w:r>
+        <w:t xml:space="preserve">The previous sample size calculation is </w:t>
+      </w:r>
+      <w:r>
+        <w:t>changed to test at the one-sided, rather than two-sided, 5% level</w:t>
+      </w:r>
+      <w:r>
+        <w:t>:</w:t>
       </w:r>
     </w:p>
     <w:p>
       <w:pPr>
-        <w:pStyle w:val="Heading3"/>
-      </w:pPr>
-      <w:r>
-        <w:t>Non-inferiority of NACT to NACRT OR Non-inferiority of NACRT to NACT</w:t>
+        <w:pStyle w:val="Typeface"/>
+      </w:pPr>
+      <w:r>
+        <w:t>artbin, pr(</w:t>
+      </w:r>
+      <w:del w:id="10" w:author="Matt Sydes" w:date="2026-07-03T17:23:00Z" w16du:dateUtc="2026-07-03T16:23:00Z">
+        <w:r>
+          <w:delText xml:space="preserve">.5 </w:delText>
+        </w:r>
+      </w:del>
+      <w:ins w:id="11" w:author="Matt Sydes" w:date="2026-07-03T17:23:00Z" w16du:dateUtc="2026-07-03T16:23:00Z">
+        <w:r>
+          <w:t xml:space="preserve">0.50 </w:t>
+        </w:r>
+      </w:ins>
+      <w:del w:id="12" w:author="Matt Sydes" w:date="2026-07-03T17:24:00Z" w16du:dateUtc="2026-07-03T16:24:00Z">
+        <w:r>
+          <w:delText>.55</w:delText>
+        </w:r>
+      </w:del>
+      <w:ins w:id="13" w:author="Matt Sydes" w:date="2026-07-03T17:24:00Z" w16du:dateUtc="2026-07-03T16:24:00Z">
+        <w:r>
+          <w:t>0.55</w:t>
+        </w:r>
+      </w:ins>
+      <w:r>
+        <w:t>) power(</w:t>
+      </w:r>
+      <w:del w:id="14" w:author="Matt Sydes" w:date="2026-07-03T17:24:00Z" w16du:dateUtc="2026-07-03T16:24:00Z">
+        <w:r>
+          <w:delText>.9</w:delText>
+        </w:r>
+      </w:del>
+      <w:ins w:id="15" w:author="Matt Sydes" w:date="2026-07-03T17:24:00Z" w16du:dateUtc="2026-07-03T16:24:00Z">
+        <w:r>
+          <w:t>0.90</w:t>
+        </w:r>
+      </w:ins>
+      <w:r>
+        <w:t>) alpha(.05) onesided</w:t>
       </w:r>
     </w:p>
     <w:p>
-      <w:r>
-        <w:t>The previous sample size calculation is changed to</w:t>
-      </w:r>
-      <w:r>
-        <w:t xml:space="preserve"> give 90% power to show </w:t>
-      </w:r>
-      <w:r>
-        <w:t xml:space="preserve">statistically significant </w:t>
-      </w:r>
-      <w:r>
-        <w:t>evidence of superiority of</w:t>
-      </w:r>
-      <w:r>
-        <w:t xml:space="preserve"> </w:t>
-      </w:r>
-      <w:r>
-        <w:t xml:space="preserve">one treatment, with a non-inferiority margin </w:t>
-      </w:r>
-      <w:r>
-        <w:t xml:space="preserve">of a 5% </w:t>
-      </w:r>
-      <w:r>
-        <w:t xml:space="preserve">risk </w:t>
-      </w:r>
-      <w:r>
-        <w:t>difference</w:t>
-      </w:r>
-      <w:r>
-        <w:t>:</w:t>
-      </w:r>
+      <w:pPr>
+        <w:pStyle w:val="Heading3"/>
+        <w:rPr>
+          <w:ins w:id="16" w:author="Matt Sydes" w:date="2026-07-03T17:23:00Z" w16du:dateUtc="2026-07-03T16:23:00Z"/>
+        </w:rPr>
+      </w:pPr>
     </w:p>
     <w:p>
       <w:pPr>
-        <w:pStyle w:val="Typeface"/>
-      </w:pPr>
-      <w:r>
-        <w:t>artbin, pr(.5 .5) power(.9) margin(-.05) onesided</w:t>
+        <w:pStyle w:val="Heading3"/>
+      </w:pPr>
+      <w:r>
+        <w:t>Non-inferiority of NACT to NACRT OR Non-inferiority of NACRT to NACT</w:t>
       </w:r>
     </w:p>
     <w:p>
-      <w:pPr>
-        <w:pStyle w:val="Heading3"/>
-      </w:pPr>
-      <w:r>
-        <w:t>Novel</w:t>
-      </w:r>
-      <w:r>
-        <w:t xml:space="preserve"> f</w:t>
-      </w:r>
-      <w:r>
-        <w:t>requentist</w:t>
+      <w:r>
+        <w:t>The previous sample size calculation is changed to</w:t>
+      </w:r>
+      <w:r>
+        <w:t xml:space="preserve"> give 90% power to show </w:t>
+      </w:r>
+      <w:r>
+        <w:t xml:space="preserve">statistically significant </w:t>
+      </w:r>
+      <w:r>
+        <w:t>evidence of superiority of</w:t>
+      </w:r>
+      <w:r>
+        <w:t xml:space="preserve"> </w:t>
+      </w:r>
+      <w:r>
+        <w:t xml:space="preserve">one treatment, with a non-inferiority margin </w:t>
+      </w:r>
+      <w:r>
+        <w:t xml:space="preserve">of a 5% </w:t>
+      </w:r>
+      <w:r>
+        <w:t xml:space="preserve">risk </w:t>
+      </w:r>
+      <w:r>
+        <w:t>difference</w:t>
+      </w:r>
+      <w:r>
+        <w:t>:</w:t>
       </w:r>
     </w:p>
     <w:p>
-      <w:r>
-        <w:t>This is the same as the original sample size calculation, but with the two-sided type 1 error rate increased to 20%</w:t>
-      </w:r>
-      <w:r>
-        <w:t>:</w:t>
+      <w:pPr>
+        <w:pStyle w:val="Typeface"/>
+      </w:pPr>
+      <w:r>
+        <w:t>artbin, pr(</w:t>
+      </w:r>
+      <w:del w:id="17" w:author="Matt Sydes" w:date="2026-07-03T17:23:00Z" w16du:dateUtc="2026-07-03T16:23:00Z">
+        <w:r>
+          <w:delText xml:space="preserve">.5 </w:delText>
+        </w:r>
+      </w:del>
+      <w:ins w:id="18" w:author="Matt Sydes" w:date="2026-07-03T17:23:00Z" w16du:dateUtc="2026-07-03T16:23:00Z">
+        <w:r>
+          <w:t xml:space="preserve">0.50 </w:t>
+        </w:r>
+      </w:ins>
+      <w:r>
+        <w:t>.5) power(</w:t>
+      </w:r>
+      <w:del w:id="19" w:author="Matt Sydes" w:date="2026-07-03T17:24:00Z" w16du:dateUtc="2026-07-03T16:24:00Z">
+        <w:r>
+          <w:delText>.9</w:delText>
+        </w:r>
+      </w:del>
+      <w:ins w:id="20" w:author="Matt Sydes" w:date="2026-07-03T17:24:00Z" w16du:dateUtc="2026-07-03T16:24:00Z">
+        <w:r>
+          <w:t>0.90</w:t>
+        </w:r>
+      </w:ins>
+      <w:r>
+        <w:t>) margin(-.05) onesided</w:t>
       </w:r>
     </w:p>
     <w:p>
       <w:pPr>
-        <w:pStyle w:val="Typeface"/>
-      </w:pPr>
-      <w:r>
-        <w:t>artbin, pr(.5 .55) power(.9) alpha(.2)</w:t>
-      </w:r>
+        <w:pStyle w:val="Heading3"/>
+        <w:rPr>
+          <w:ins w:id="21" w:author="Matt Sydes" w:date="2026-07-03T17:23:00Z" w16du:dateUtc="2026-07-03T16:23:00Z"/>
+        </w:rPr>
+      </w:pPr>
     </w:p>
     <w:p>
-      <w:r>
-        <w:t>or to 40%:</w:t>
+      <w:pPr>
+        <w:pStyle w:val="Heading3"/>
+      </w:pPr>
+      <w:r>
+        <w:t>Novel</w:t>
+      </w:r>
+      <w:r>
+        <w:t xml:space="preserve"> f</w:t>
+      </w:r>
+      <w:r>
+        <w:t>requentist</w:t>
       </w:r>
     </w:p>
     <w:p>
-      <w:pPr>
-        <w:pStyle w:val="Typeface"/>
-      </w:pPr>
-      <w:r>
-        <w:t>artbin, pr(.5 .55) power(.9) alpha(.4)</w:t>
+      <w:r>
+        <w:t>This is the same as the original sample size calculation, but with the two-sided type 1 error rate increased to 20%</w:t>
+      </w:r>
+      <w:r>
+        <w:t>:</w:t>
       </w:r>
     </w:p>
     <w:p>
       <w:pPr>
-        <w:pStyle w:val="Heading3"/>
-      </w:pPr>
-      <w:r>
-        <w:t>Bayesian design (non-informative prior)</w:t>
+        <w:pStyle w:val="Typeface"/>
+      </w:pPr>
+      <w:r>
+        <w:t>artbin, pr(</w:t>
+      </w:r>
+      <w:del w:id="22" w:author="Matt Sydes" w:date="2026-07-03T17:23:00Z" w16du:dateUtc="2026-07-03T16:23:00Z">
+        <w:r>
+          <w:delText xml:space="preserve">.5 </w:delText>
+        </w:r>
+      </w:del>
+      <w:ins w:id="23" w:author="Matt Sydes" w:date="2026-07-03T17:23:00Z" w16du:dateUtc="2026-07-03T16:23:00Z">
+        <w:r>
+          <w:t xml:space="preserve">0.50 </w:t>
+        </w:r>
+      </w:ins>
+      <w:del w:id="24" w:author="Matt Sydes" w:date="2026-07-03T17:24:00Z" w16du:dateUtc="2026-07-03T16:24:00Z">
+        <w:r>
+          <w:delText>.55</w:delText>
+        </w:r>
+      </w:del>
+      <w:ins w:id="25" w:author="Matt Sydes" w:date="2026-07-03T17:24:00Z" w16du:dateUtc="2026-07-03T16:24:00Z">
+        <w:r>
+          <w:t>0.55</w:t>
+        </w:r>
+      </w:ins>
+      <w:r>
+        <w:t>) power(</w:t>
+      </w:r>
+      <w:del w:id="26" w:author="Matt Sydes" w:date="2026-07-03T17:24:00Z" w16du:dateUtc="2026-07-03T16:24:00Z">
+        <w:r>
+          <w:delText>.9</w:delText>
+        </w:r>
+      </w:del>
+      <w:ins w:id="27" w:author="Matt Sydes" w:date="2026-07-03T17:24:00Z" w16du:dateUtc="2026-07-03T16:24:00Z">
+        <w:r>
+          <w:t>0.90</w:t>
+        </w:r>
+      </w:ins>
+      <w:r>
+        <w:t xml:space="preserve">) </w:t>
+      </w:r>
+      <w:r>
+        <w:t>alpha</w:t>
+      </w:r>
+      <w:r>
+        <w:t>(.2)</w:t>
       </w:r>
     </w:p>
     <w:p>
       <w:r>
-        <w:t>We computed this with the user-written software bayes</w:t>
-      </w:r>
-      <w:r>
+        <w:t>or to 40%:</w:t>
+      </w:r>
+    </w:p>
+    <w:p>
+      <w:pPr>
+        <w:pStyle w:val="Typeface"/>
+      </w:pPr>
+      <w:r>
+        <w:t>artbin, pr(</w:t>
+      </w:r>
+      <w:del w:id="28" w:author="Matt Sydes" w:date="2026-07-03T17:23:00Z" w16du:dateUtc="2026-07-03T16:23:00Z">
+        <w:r>
+          <w:delText xml:space="preserve">.5 </w:delText>
+        </w:r>
+      </w:del>
+      <w:ins w:id="29" w:author="Matt Sydes" w:date="2026-07-03T17:23:00Z" w16du:dateUtc="2026-07-03T16:23:00Z">
+        <w:r>
+          <w:t xml:space="preserve">0.50 </w:t>
+        </w:r>
+      </w:ins>
+      <w:del w:id="30" w:author="Matt Sydes" w:date="2026-07-03T17:24:00Z" w16du:dateUtc="2026-07-03T16:24:00Z">
+        <w:r>
+          <w:delText>.55</w:delText>
+        </w:r>
+      </w:del>
+      <w:ins w:id="31" w:author="Matt Sydes" w:date="2026-07-03T17:24:00Z" w16du:dateUtc="2026-07-03T16:24:00Z">
+        <w:r>
+          <w:t>0.55</w:t>
+        </w:r>
+      </w:ins>
+      <w:r>
+        <w:t>) power(</w:t>
+      </w:r>
+      <w:del w:id="32" w:author="Matt Sydes" w:date="2026-07-03T17:24:00Z" w16du:dateUtc="2026-07-03T16:24:00Z">
+        <w:r>
+          <w:delText>.9</w:delText>
+        </w:r>
+      </w:del>
+      <w:ins w:id="33" w:author="Matt Sydes" w:date="2026-07-03T17:24:00Z" w16du:dateUtc="2026-07-03T16:24:00Z">
+        <w:r>
+          <w:t>0.90</w:t>
+        </w:r>
+      </w:ins>
+      <w:r>
+        <w:t>) alpha(.4)</w:t>
+      </w:r>
+    </w:p>
+    <w:p>
+      <w:pPr>
+        <w:pStyle w:val="Heading3"/>
+        <w:rPr>
+          <w:ins w:id="34" w:author="Matt Sydes" w:date="2026-07-03T17:23:00Z" w16du:dateUtc="2026-07-03T16:23:00Z"/>
+        </w:rPr>
+      </w:pPr>
+    </w:p>
+    <w:p>
+      <w:pPr>
+        <w:pStyle w:val="Heading3"/>
+      </w:pPr>
+      <w:r>
+        <w:t>Bayesian design (non-informative prior)</w:t>
+      </w:r>
+    </w:p>
+    <w:p>
+      <w:r>
+        <w:t xml:space="preserve">We computed this with the user-written software </w:t>
+      </w:r>
+      <w:commentRangeStart w:id="35"/>
+      <w:commentRangeStart w:id="36"/>
+      <w:r>
+        <w:rPr>
+          <w:rFonts w:ascii="Courier New" w:hAnsi="Courier New" w:cs="Courier New"/>
+          <w:rPrChange w:id="37" w:author="Ian White" w:date="2026-07-06T10:36:00Z" w16du:dateUtc="2026-07-06T09:36:00Z">
+            <w:rPr/>
+          </w:rPrChange>
+        </w:rPr>
+        <w:t>bayes</w:t>
+      </w:r>
+      <w:r>
+        <w:rPr>
+          <w:rFonts w:ascii="Courier New" w:hAnsi="Courier New" w:cs="Courier New"/>
+          <w:rPrChange w:id="38" w:author="Ian White" w:date="2026-07-06T10:36:00Z" w16du:dateUtc="2026-07-06T09:36:00Z">
+            <w:rPr/>
+          </w:rPrChange>
+        </w:rPr>
         <w:t>power</w:t>
       </w:r>
       <w:r>
-        <w:t xml:space="preserve"> (available at </w:t>
+        <w:t xml:space="preserve"> (</w:t>
+      </w:r>
+      <w:ins w:id="39" w:author="Ian White" w:date="2026-07-06T10:35:00Z" w16du:dateUtc="2026-07-06T09:35:00Z">
+        <w:r>
+          <w:t>based on the methods of Turner et al</w:t>
+        </w:r>
+      </w:ins>
+      <w:r>
+        <w:fldChar w:fldCharType="begin"/>
+      </w:r>
+      <w:r>
+        <w:instrText xml:space="preserve"> ADDIN ZOTERO_ITEM CSL_CITATION {"citationID":"DX7UXWbv","properties":{"unsorted":false,"formattedCitation":"\\super 2\\nosupersub{}","plainCitation":"2","noteIndex":0},"citationItems":[{"id":4246,"uris":["http://zotero.org/users/14244340/items/NMQXJ72G"],"itemData":{"id":4246,"type":"article-journal","abstract":"Bayesian analysis of a non‐inferiority trial is advantageous in allowing direct probability statements to be made about the relative treatment difference rather than relying on an arbitrary and often poorly justified non‐inferiority margin. When the primary analysis will be Bayesian, a Bayesian approach to sample size determination will often be appropriate for consistency with the analysis. We demonstrate three Bayesian approaches to choosing sample size for non‐inferiority trials with binary outcomes and review their advantages and disadvantages. First, we present a predictive power approach for determining sample size using the probability that the trial will produce a convincing result in the final analysis. Next, we determine sample size by considering the expected posterior probability of non‐inferiority in the trial. Finally, we demonstrate a precision‐based approach. We apply these methods to a non‐inferiority trial in antiretroviral therapy for treatment of HIV‐infected children. A predictive power approach would be most accessible in practical settings, because it is analogous to the standard frequentist approach. Sample sizes are larger than with frequentist calculations unless an informative analysis prior is specified, because appropriate allowance is made for uncertainty in the assumed design parameters, ignored in frequentist calculations. An expected posterior probability approach will lead to a smaller sample size and is appropriate when the focus is on estimating posterior probability rather than on testing. A precision‐based approach would be useful when sample size is restricted by limits on recruitment or costs, but it would be difficult to decide on sample size using this approach alone.","citation-key":"turnerPracticalApproachesBayesian2023","container-title":"Statistics in Medicine","DOI":"10.1002/sim.9661","ISSN":"0277-6715","issue":"8","page":"1127-1138","title":"Practical approaches to Bayesian sample size determination in non‐inferiority trials with binary outcomes","URL":"https://onlinelibrary.wiley.com/doi/10.1002/sim.9661","volume":"42","author":[{"family":"Turner","given":"Rebecca M"},{"family":"Clements","given":"Michelle N"},{"family":"Quartagno","given":"Matteo"},{"family":"Cornelius","given":"Victoria"},{"family":"Cro","given":"Suzie"},{"family":"Ford","given":"Deborah"},{"family":"Tweed","given":"Conor D"},{"family":"Walker","given":"A Sarah"},{"family":"White","given":"Ian R"}],"issued":{"date-parts":[["2023",4,15]]}}}],"schema":"https://github.com/citation-style-language/schema/raw/master/csl-citation.json"} </w:instrText>
+      </w:r>
+      <w:r>
+        <w:fldChar w:fldCharType="separate"/>
+      </w:r>
+      <w:r>
+        <w:rPr>
+          <w:rFonts w:ascii="Calibri" w:hAnsi="Calibri" w:cs="Calibri"/>
+          <w:vertAlign w:val="superscript"/>
+        </w:rPr>
+        <w:t>2</w:t>
+      </w:r>
+      <w:r>
+        <w:fldChar w:fldCharType="end"/>
+      </w:r>
+      <w:ins w:id="40" w:author="Ian White" w:date="2026-07-06T10:35:00Z" w16du:dateUtc="2026-07-06T09:35:00Z">
+        <w:r>
+          <w:t xml:space="preserve"> and </w:t>
+        </w:r>
+      </w:ins>
+      <w:r>
+        <w:t xml:space="preserve">available at </w:t>
       </w:r>
       <w:hyperlink r:id="rId8" w:history="1">
         <w:r>
@@ -297,6 +570,24 @@
           <w:t>https://github.com/CoRE-CTI/Tailoring</w:t>
         </w:r>
       </w:hyperlink>
+      <w:commentRangeEnd w:id="35"/>
+      <w:r>
+        <w:rPr>
+          <w:rStyle w:val="CommentReference"/>
+          <w:sz w:val="24"/>
+          <w:szCs w:val="22"/>
+        </w:rPr>
+        <w:commentReference w:id="35"/>
+      </w:r>
+      <w:commentRangeEnd w:id="36"/>
+      <w:r>
+        <w:rPr>
+          <w:rStyle w:val="CommentReference"/>
+          <w:sz w:val="24"/>
+          <w:szCs w:val="22"/>
+        </w:rPr>
+        <w:commentReference w:id="36"/>
+      </w:r>
       <w:r>
         <w:t>).</w:t>
       </w:r>
@@ -307,9 +598,18 @@
         <w:t xml:space="preserve"> below </w:t>
       </w:r>
       <w:r>
-        <w:t xml:space="preserve">demonstrates that the total sample size of 1780 is enough to give 90% probability </w:t>
-      </w:r>
-      <w:r>
+        <w:t xml:space="preserve">demonstrates that the total sample size of 1780 </w:t>
+      </w:r>
+      <w:ins w:id="41" w:author="Ian White" w:date="2026-07-06T10:49:00Z" w16du:dateUtc="2026-07-06T09:49:00Z">
+        <w:r>
+          <w:t xml:space="preserve">(890+890) </w:t>
+        </w:r>
+      </w:ins>
+      <w:r>
+        <w:t xml:space="preserve">is enough to give 90% probability </w:t>
+      </w:r>
+      <w:r>
+        <w:lastRenderedPageBreak/>
         <w:t>that the posterior probability of benefit</w:t>
       </w:r>
       <w:r>
@@ -325,67 +625,446 @@
     <w:p>
       <w:pPr>
         <w:pStyle w:val="Typeface"/>
-      </w:pPr>
-      <w:r>
-        <w:t>bayespower, n1(890) n0(890) priorspec(ms)</w:t>
-      </w:r>
-      <w:r>
-        <w:t xml:space="preserve"> </w:t>
-      </w:r>
-      <w:r>
-        <w:t>prior1d(.55 .001) prior0d(.5 .001)</w:t>
-      </w:r>
-      <w:r>
-        <w:t xml:space="preserve"> </w:t>
-      </w:r>
-      <w:r>
-        <w:t>prior1a(.5 .28867513) prior0a(.5 .28867513)</w:t>
-      </w:r>
-      <w:r>
-        <w:t xml:space="preserve"> </w:t>
-      </w:r>
-      <w:r>
-        <w:t xml:space="preserve">seed(3) criteria(.80) </w:t>
-      </w:r>
+        <w:rPr>
+          <w:ins w:id="42" w:author="Ian White" w:date="2026-07-06T10:29:00Z" w16du:dateUtc="2026-07-06T09:29:00Z"/>
+        </w:rPr>
+      </w:pPr>
+      <w:r>
+        <w:t xml:space="preserve">bayespower, n1(890) n0(890) </w:t>
+      </w:r>
+      <w:ins w:id="43" w:author="Ian White" w:date="2026-07-06T10:29:00Z" w16du:dateUtc="2026-07-06T09:29:00Z">
+        <w:r>
+          <w:t>///</w:t>
+        </w:r>
+      </w:ins>
     </w:p>
     <w:p>
-      <w:r>
-        <w:t>The</w:t>
-      </w:r>
-      <w:r>
-        <w:t xml:space="preserve"> command </w:t>
-      </w:r>
-      <w:r>
-        <w:t xml:space="preserve">below </w:t>
-      </w:r>
-      <w:r>
-        <w:t xml:space="preserve">demonstrates that the total sample size of </w:t>
-      </w:r>
-      <w:r>
-        <w:t xml:space="preserve">564 </w:t>
-      </w:r>
-      <w:r>
-        <w:t>is enough to give 90% probability that the posterior probability of benefit</w:t>
-      </w:r>
-      <w:r>
-        <w:t>, calculated with non-informative priors,</w:t>
-      </w:r>
-      <w:r>
-        <w:t xml:space="preserve"> will </w:t>
-      </w:r>
-      <w:r>
-        <w:t>have mean</w:t>
-      </w:r>
-      <w:r>
-        <w:t xml:space="preserve"> 0.8:</w:t>
-      </w:r>
+      <w:pPr>
+        <w:pStyle w:val="Typeface"/>
+        <w:ind w:left="1440"/>
+        <w:rPr>
+          <w:ins w:id="44" w:author="Ian White" w:date="2026-07-06T10:30:00Z" w16du:dateUtc="2026-07-06T09:30:00Z"/>
+        </w:rPr>
+        <w:pPrChange w:id="45" w:author="Ian White" w:date="2026-07-06T10:52:00Z" w16du:dateUtc="2026-07-06T09:52:00Z">
+          <w:pPr>
+            <w:pStyle w:val="Typeface"/>
+          </w:pPr>
+        </w:pPrChange>
+      </w:pPr>
+      <w:r>
+        <w:t xml:space="preserve">priorspec(ms) </w:t>
+      </w:r>
+      <w:ins w:id="46" w:author="Ian White" w:date="2026-07-06T10:30:00Z" w16du:dateUtc="2026-07-06T09:30:00Z">
+        <w:r>
+          <w:t>///</w:t>
+        </w:r>
+      </w:ins>
     </w:p>
     <w:p>
       <w:pPr>
         <w:pStyle w:val="Typeface"/>
-      </w:pPr>
-      <w:r>
-        <w:lastRenderedPageBreak/>
+        <w:ind w:left="1440"/>
+        <w:rPr>
+          <w:ins w:id="47" w:author="Ian White" w:date="2026-07-06T10:29:00Z" w16du:dateUtc="2026-07-06T09:29:00Z"/>
+        </w:rPr>
+        <w:pPrChange w:id="48" w:author="Ian White" w:date="2026-07-06T10:52:00Z" w16du:dateUtc="2026-07-06T09:52:00Z">
+          <w:pPr>
+            <w:pStyle w:val="Typeface"/>
+          </w:pPr>
+        </w:pPrChange>
+      </w:pPr>
+      <w:r>
+        <w:t>prior1d(</w:t>
+      </w:r>
+      <w:del w:id="49" w:author="Matt Sydes" w:date="2026-07-03T17:24:00Z" w16du:dateUtc="2026-07-03T16:24:00Z">
+        <w:r>
+          <w:delText>.55</w:delText>
+        </w:r>
+      </w:del>
+      <w:ins w:id="50" w:author="Matt Sydes" w:date="2026-07-03T17:24:00Z" w16du:dateUtc="2026-07-03T16:24:00Z">
+        <w:r>
+          <w:t>0.55</w:t>
+        </w:r>
+      </w:ins>
+      <w:r>
+        <w:t xml:space="preserve"> </w:t>
+      </w:r>
+      <w:ins w:id="51" w:author="Matt Sydes" w:date="2026-07-03T17:25:00Z" w16du:dateUtc="2026-07-03T16:25:00Z">
+        <w:del w:id="52" w:author="Ian White" w:date="2026-07-06T10:46:00Z" w16du:dateUtc="2026-07-06T09:46:00Z">
+          <w:r>
+            <w:delText>0</w:delText>
+          </w:r>
+        </w:del>
+      </w:ins>
+      <w:del w:id="53" w:author="Ian White" w:date="2026-07-06T10:46:00Z" w16du:dateUtc="2026-07-06T09:46:00Z">
+        <w:r>
+          <w:delText>.</w:delText>
+        </w:r>
+      </w:del>
+      <w:r>
+        <w:t>0</w:t>
+      </w:r>
+      <w:del w:id="54" w:author="Ian White" w:date="2026-07-06T10:46:00Z" w16du:dateUtc="2026-07-06T09:46:00Z">
+        <w:r>
+          <w:delText>01</w:delText>
+        </w:r>
+      </w:del>
+      <w:r>
+        <w:t>) prior0d(</w:t>
+      </w:r>
+      <w:del w:id="55" w:author="Matt Sydes" w:date="2026-07-03T17:23:00Z" w16du:dateUtc="2026-07-03T16:23:00Z">
+        <w:r>
+          <w:delText xml:space="preserve">.5 </w:delText>
+        </w:r>
+      </w:del>
+      <w:ins w:id="56" w:author="Matt Sydes" w:date="2026-07-03T17:23:00Z" w16du:dateUtc="2026-07-03T16:23:00Z">
+        <w:r>
+          <w:t xml:space="preserve">0.50 </w:t>
+        </w:r>
+      </w:ins>
+      <w:del w:id="57" w:author="Ian White" w:date="2026-07-06T10:46:00Z" w16du:dateUtc="2026-07-06T09:46:00Z">
+        <w:r>
+          <w:delText>.</w:delText>
+        </w:r>
+      </w:del>
+      <w:r>
+        <w:t>0</w:t>
+      </w:r>
+      <w:del w:id="58" w:author="Ian White" w:date="2026-07-06T10:46:00Z" w16du:dateUtc="2026-07-06T09:46:00Z">
+        <w:r>
+          <w:delText>01</w:delText>
+        </w:r>
+      </w:del>
+      <w:r>
+        <w:t>)</w:t>
+      </w:r>
+      <w:ins w:id="59" w:author="Ian White" w:date="2026-07-06T10:29:00Z" w16du:dateUtc="2026-07-06T09:29:00Z">
+        <w:r>
+          <w:t xml:space="preserve"> ///</w:t>
+        </w:r>
+      </w:ins>
+      <w:r>
+        <w:t xml:space="preserve"> </w:t>
+      </w:r>
+    </w:p>
+    <w:p>
+      <w:pPr>
+        <w:pStyle w:val="Typeface"/>
+        <w:ind w:left="1440"/>
+        <w:rPr>
+          <w:ins w:id="60" w:author="Ian White" w:date="2026-07-06T10:30:00Z" w16du:dateUtc="2026-07-06T09:30:00Z"/>
+        </w:rPr>
+        <w:pPrChange w:id="61" w:author="Ian White" w:date="2026-07-06T10:52:00Z" w16du:dateUtc="2026-07-06T09:52:00Z">
+          <w:pPr>
+            <w:pStyle w:val="Typeface"/>
+          </w:pPr>
+        </w:pPrChange>
+      </w:pPr>
+      <w:r>
+        <w:t>prior1a(</w:t>
+      </w:r>
+      <w:del w:id="62" w:author="Matt Sydes" w:date="2026-07-03T17:23:00Z" w16du:dateUtc="2026-07-03T16:23:00Z">
+        <w:r>
+          <w:delText xml:space="preserve">.5 </w:delText>
+        </w:r>
+      </w:del>
+      <w:ins w:id="63" w:author="Matt Sydes" w:date="2026-07-03T17:23:00Z" w16du:dateUtc="2026-07-03T16:23:00Z">
+        <w:r>
+          <w:t xml:space="preserve">0.50 </w:t>
+        </w:r>
+      </w:ins>
+      <w:ins w:id="64" w:author="Matt Sydes" w:date="2026-07-03T17:25:00Z" w16du:dateUtc="2026-07-03T16:25:00Z">
+        <w:r>
+          <w:t>0</w:t>
+        </w:r>
+      </w:ins>
+      <w:r>
+        <w:t>.2</w:t>
+      </w:r>
+      <w:ins w:id="65" w:author="Ian White" w:date="2026-07-06T10:33:00Z" w16du:dateUtc="2026-07-06T09:33:00Z">
+        <w:r>
+          <w:t>9</w:t>
+        </w:r>
+      </w:ins>
+      <w:del w:id="66" w:author="Ian White" w:date="2026-07-06T10:33:00Z" w16du:dateUtc="2026-07-06T09:33:00Z">
+        <w:r>
+          <w:delText>8867513</w:delText>
+        </w:r>
+      </w:del>
+      <w:r>
+        <w:t>) prior0a(</w:t>
+      </w:r>
+      <w:del w:id="67" w:author="Matt Sydes" w:date="2026-07-03T17:23:00Z" w16du:dateUtc="2026-07-03T16:23:00Z">
+        <w:r>
+          <w:delText xml:space="preserve">.5 </w:delText>
+        </w:r>
+      </w:del>
+      <w:ins w:id="68" w:author="Matt Sydes" w:date="2026-07-03T17:23:00Z" w16du:dateUtc="2026-07-03T16:23:00Z">
+        <w:r>
+          <w:t xml:space="preserve">0.50 </w:t>
+        </w:r>
+      </w:ins>
+      <w:ins w:id="69" w:author="Matt Sydes" w:date="2026-07-03T17:25:00Z" w16du:dateUtc="2026-07-03T16:25:00Z">
+        <w:r>
+          <w:t>0</w:t>
+        </w:r>
+      </w:ins>
+      <w:r>
+        <w:t>.2</w:t>
+      </w:r>
+      <w:ins w:id="70" w:author="Ian White" w:date="2026-07-06T10:33:00Z" w16du:dateUtc="2026-07-06T09:33:00Z">
+        <w:r>
+          <w:t>9</w:t>
+        </w:r>
+      </w:ins>
+      <w:del w:id="71" w:author="Ian White" w:date="2026-07-06T10:33:00Z" w16du:dateUtc="2026-07-06T09:33:00Z">
+        <w:r>
+          <w:delText>8867513</w:delText>
+        </w:r>
+      </w:del>
+      <w:r>
+        <w:t xml:space="preserve">) </w:t>
+      </w:r>
+      <w:ins w:id="72" w:author="Ian White" w:date="2026-07-06T10:29:00Z" w16du:dateUtc="2026-07-06T09:29:00Z">
+        <w:r>
+          <w:t>///</w:t>
+        </w:r>
+      </w:ins>
+    </w:p>
+    <w:p>
+      <w:pPr>
+        <w:pStyle w:val="Typeface"/>
+        <w:ind w:left="1440"/>
+        <w:pPrChange w:id="73" w:author="Ian White" w:date="2026-07-06T10:52:00Z" w16du:dateUtc="2026-07-06T09:52:00Z">
+          <w:pPr>
+            <w:pStyle w:val="Typeface"/>
+          </w:pPr>
+        </w:pPrChange>
+      </w:pPr>
+      <w:r>
+        <w:t>seed(3) criteria(</w:t>
+      </w:r>
+      <w:ins w:id="74" w:author="Matt Sydes" w:date="2026-07-03T17:25:00Z" w16du:dateUtc="2026-07-03T16:25:00Z">
+        <w:r>
+          <w:t>0</w:t>
+        </w:r>
+      </w:ins>
+      <w:r>
+        <w:t xml:space="preserve">.80) </w:t>
+      </w:r>
+    </w:p>
+    <w:p>
+      <w:pPr>
+        <w:rPr>
+          <w:ins w:id="75" w:author="Ian White" w:date="2026-07-06T10:34:00Z" w16du:dateUtc="2026-07-06T09:34:00Z"/>
+        </w:rPr>
+      </w:pPr>
+      <w:ins w:id="76" w:author="Ian White" w:date="2026-07-06T10:37:00Z" w16du:dateUtc="2026-07-06T09:37:00Z">
+        <w:r>
+          <w:t>In t</w:t>
+        </w:r>
+        <w:r>
+          <w:t>his command</w:t>
+        </w:r>
+      </w:ins>
+      <w:ins w:id="77" w:author="Ian White" w:date="2026-07-06T10:38:00Z" w16du:dateUtc="2026-07-06T09:38:00Z">
+        <w:r>
+          <w:t xml:space="preserve">, </w:t>
+        </w:r>
+        <w:r>
+          <w:rPr>
+            <w:rFonts w:ascii="Courier New" w:hAnsi="Courier New" w:cs="Courier New"/>
+            <w:rPrChange w:id="78" w:author="Ian White" w:date="2026-07-06T10:47:00Z" w16du:dateUtc="2026-07-06T09:47:00Z">
+              <w:rPr/>
+            </w:rPrChange>
+          </w:rPr>
+          <w:t>priorspec(ms)</w:t>
+        </w:r>
+        <w:r>
+          <w:t xml:space="preserve"> specifies that the design and analysis priors for the true outcome probabilities in the two arms will be specified by their mean and standard deviation</w:t>
+        </w:r>
+      </w:ins>
+      <w:ins w:id="79" w:author="Ian White" w:date="2026-07-06T10:47:00Z" w16du:dateUtc="2026-07-06T09:47:00Z">
+        <w:r>
+          <w:t xml:space="preserve"> (SD)</w:t>
+        </w:r>
+      </w:ins>
+      <w:ins w:id="80" w:author="Ian White" w:date="2026-07-06T10:38:00Z" w16du:dateUtc="2026-07-06T09:38:00Z">
+        <w:r>
+          <w:t xml:space="preserve">. The design priors specified by </w:t>
+        </w:r>
+        <w:r>
+          <w:rPr>
+            <w:rFonts w:ascii="Courier New" w:hAnsi="Courier New" w:cs="Courier New"/>
+            <w:rPrChange w:id="81" w:author="Ian White" w:date="2026-07-06T10:48:00Z" w16du:dateUtc="2026-07-06T09:48:00Z">
+              <w:rPr/>
+            </w:rPrChange>
+          </w:rPr>
+          <w:t>prior1d()</w:t>
+        </w:r>
+        <w:r>
+          <w:t xml:space="preserve"> a</w:t>
+        </w:r>
+      </w:ins>
+      <w:ins w:id="82" w:author="Ian White" w:date="2026-07-06T10:46:00Z" w16du:dateUtc="2026-07-06T09:46:00Z">
+        <w:r>
+          <w:t>n</w:t>
+        </w:r>
+      </w:ins>
+      <w:ins w:id="83" w:author="Ian White" w:date="2026-07-06T10:38:00Z" w16du:dateUtc="2026-07-06T09:38:00Z">
+        <w:r>
+          <w:t xml:space="preserve">d </w:t>
+        </w:r>
+        <w:r>
+          <w:rPr>
+            <w:rFonts w:ascii="Courier New" w:hAnsi="Courier New" w:cs="Courier New"/>
+            <w:rPrChange w:id="84" w:author="Ian White" w:date="2026-07-06T10:48:00Z" w16du:dateUtc="2026-07-06T09:48:00Z">
+              <w:rPr/>
+            </w:rPrChange>
+          </w:rPr>
+          <w:t>prior</w:t>
+        </w:r>
+      </w:ins>
+      <w:ins w:id="85" w:author="Ian White" w:date="2026-07-06T10:39:00Z" w16du:dateUtc="2026-07-06T09:39:00Z">
+        <w:r>
+          <w:rPr>
+            <w:rFonts w:ascii="Courier New" w:hAnsi="Courier New" w:cs="Courier New"/>
+            <w:rPrChange w:id="86" w:author="Ian White" w:date="2026-07-06T10:48:00Z" w16du:dateUtc="2026-07-06T09:48:00Z">
+              <w:rPr/>
+            </w:rPrChange>
+          </w:rPr>
+          <w:t>0d()</w:t>
+        </w:r>
+        <w:r>
+          <w:t xml:space="preserve"> are given </w:t>
+        </w:r>
+      </w:ins>
+      <w:ins w:id="87" w:author="Ian White" w:date="2026-07-06T10:47:00Z" w16du:dateUtc="2026-07-06T09:47:00Z">
+        <w:r>
+          <w:t xml:space="preserve">zero SD, indicating that the outcome probabilities are fixed (as in the frequentist calculation). </w:t>
+        </w:r>
+      </w:ins>
+      <w:ins w:id="88" w:author="Ian White" w:date="2026-07-06T10:34:00Z" w16du:dateUtc="2026-07-06T09:34:00Z">
+        <w:r>
+          <w:t>The n</w:t>
+        </w:r>
+        <w:r>
+          <w:t xml:space="preserve">on-informative analysis priors </w:t>
+        </w:r>
+      </w:ins>
+      <w:ins w:id="89" w:author="Ian White" w:date="2026-07-06T10:48:00Z" w16du:dateUtc="2026-07-06T09:48:00Z">
+        <w:r>
+          <w:t xml:space="preserve">specified by </w:t>
+        </w:r>
+        <w:r>
+          <w:rPr>
+            <w:rFonts w:ascii="Courier New" w:hAnsi="Courier New" w:cs="Courier New"/>
+          </w:rPr>
+          <w:t>prior1</w:t>
+        </w:r>
+        <w:r>
+          <w:rPr>
+            <w:rFonts w:ascii="Courier New" w:hAnsi="Courier New" w:cs="Courier New"/>
+          </w:rPr>
+          <w:t>a</w:t>
+        </w:r>
+        <w:r>
+          <w:rPr>
+            <w:rFonts w:ascii="Courier New" w:hAnsi="Courier New" w:cs="Courier New"/>
+          </w:rPr>
+          <w:t>()</w:t>
+        </w:r>
+        <w:r>
+          <w:t xml:space="preserve"> and </w:t>
+        </w:r>
+        <w:r>
+          <w:rPr>
+            <w:rFonts w:ascii="Courier New" w:hAnsi="Courier New" w:cs="Courier New"/>
+          </w:rPr>
+          <w:t>prior0</w:t>
+        </w:r>
+        <w:r>
+          <w:rPr>
+            <w:rFonts w:ascii="Courier New" w:hAnsi="Courier New" w:cs="Courier New"/>
+          </w:rPr>
+          <w:t>a</w:t>
+        </w:r>
+        <w:r>
+          <w:rPr>
+            <w:rFonts w:ascii="Courier New" w:hAnsi="Courier New" w:cs="Courier New"/>
+          </w:rPr>
+          <w:t>()</w:t>
+        </w:r>
+        <w:r>
+          <w:t xml:space="preserve"> </w:t>
+        </w:r>
+      </w:ins>
+      <w:ins w:id="90" w:author="Ian White" w:date="2026-07-06T10:34:00Z" w16du:dateUtc="2026-07-06T09:34:00Z">
+        <w:r>
+          <w:t xml:space="preserve">are </w:t>
+        </w:r>
+      </w:ins>
+      <w:ins w:id="91" w:author="Ian White" w:date="2026-07-06T10:36:00Z" w16du:dateUtc="2026-07-06T09:36:00Z">
+        <w:r>
+          <w:t>taken as beta(1,1)</w:t>
+        </w:r>
+      </w:ins>
+      <w:ins w:id="92" w:author="Ian White" w:date="2026-07-06T10:48:00Z" w16du:dateUtc="2026-07-06T09:48:00Z">
+        <w:r>
+          <w:t>,</w:t>
+        </w:r>
+      </w:ins>
+      <w:ins w:id="93" w:author="Ian White" w:date="2026-07-06T10:36:00Z" w16du:dateUtc="2026-07-06T09:36:00Z">
+        <w:r>
+          <w:t xml:space="preserve"> which has mean 0.50 and standard deviation 0.29.</w:t>
+        </w:r>
+      </w:ins>
+    </w:p>
+    <w:p>
+      <w:r>
+        <w:t>The</w:t>
+      </w:r>
+      <w:r>
+        <w:t xml:space="preserve"> command </w:t>
+      </w:r>
+      <w:r>
+        <w:t xml:space="preserve">below </w:t>
+      </w:r>
+      <w:r>
+        <w:t xml:space="preserve">demonstrates that the total sample size of </w:t>
+      </w:r>
+      <w:r>
+        <w:t xml:space="preserve">564 </w:t>
+      </w:r>
+      <w:ins w:id="94" w:author="Ian White" w:date="2026-07-06T10:49:00Z" w16du:dateUtc="2026-07-06T09:49:00Z">
+        <w:r>
+          <w:t xml:space="preserve">(282+282) </w:t>
+        </w:r>
+      </w:ins>
+      <w:r>
+        <w:t>is enough to give 90% probability that the posterior probability of benefit</w:t>
+      </w:r>
+      <w:r>
+        <w:t>, calculated with non-informative priors,</w:t>
+      </w:r>
+      <w:r>
+        <w:t xml:space="preserve"> will </w:t>
+      </w:r>
+      <w:r>
+        <w:t>have mean</w:t>
+      </w:r>
+      <w:r>
+        <w:t xml:space="preserve"> 0.8:</w:t>
+      </w:r>
+    </w:p>
+    <w:p>
+      <w:pPr>
+        <w:pStyle w:val="Typeface"/>
+        <w:rPr>
+          <w:ins w:id="95" w:author="Ian White" w:date="2026-07-06T10:29:00Z" w16du:dateUtc="2026-07-06T09:29:00Z"/>
+        </w:rPr>
+      </w:pPr>
+      <w:r>
         <w:t>bayespower, n1(</w:t>
       </w:r>
       <w:r>
@@ -398,14 +1077,232 @@
         <w:t>282</w:t>
       </w:r>
       <w:r>
-        <w:t>) priorspec(ms)</w:t>
-      </w:r>
+        <w:t xml:space="preserve">) </w:t>
+      </w:r>
+      <w:ins w:id="96" w:author="Ian White" w:date="2026-07-06T10:29:00Z" w16du:dateUtc="2026-07-06T09:29:00Z">
+        <w:r>
+          <w:t>///</w:t>
+        </w:r>
+      </w:ins>
+    </w:p>
+    <w:p>
+      <w:pPr>
+        <w:pStyle w:val="Typeface"/>
+        <w:ind w:left="1440"/>
+        <w:rPr>
+          <w:ins w:id="97" w:author="Ian White" w:date="2026-07-06T10:48:00Z" w16du:dateUtc="2026-07-06T09:48:00Z"/>
+        </w:rPr>
+        <w:pPrChange w:id="98" w:author="Ian White" w:date="2026-07-06T10:52:00Z" w16du:dateUtc="2026-07-06T09:52:00Z">
+          <w:pPr>
+            <w:pStyle w:val="Typeface"/>
+          </w:pPr>
+        </w:pPrChange>
+      </w:pPr>
+      <w:r>
+        <w:t xml:space="preserve">priorspec(ms) </w:t>
+      </w:r>
+      <w:ins w:id="99" w:author="Ian White" w:date="2026-07-06T10:48:00Z" w16du:dateUtc="2026-07-06T09:48:00Z">
+        <w:r>
+          <w:t>///</w:t>
+        </w:r>
+      </w:ins>
+    </w:p>
+    <w:p>
+      <w:pPr>
+        <w:pStyle w:val="Typeface"/>
+        <w:ind w:left="1440"/>
+        <w:rPr>
+          <w:ins w:id="100" w:author="Ian White" w:date="2026-07-06T10:29:00Z" w16du:dateUtc="2026-07-06T09:29:00Z"/>
+        </w:rPr>
+        <w:pPrChange w:id="101" w:author="Ian White" w:date="2026-07-06T10:52:00Z" w16du:dateUtc="2026-07-06T09:52:00Z">
+          <w:pPr>
+            <w:pStyle w:val="Typeface"/>
+          </w:pPr>
+        </w:pPrChange>
+      </w:pPr>
+      <w:r>
+        <w:t>prior1d(</w:t>
+      </w:r>
+      <w:del w:id="102" w:author="Matt Sydes" w:date="2026-07-03T17:24:00Z" w16du:dateUtc="2026-07-03T16:24:00Z">
+        <w:r>
+          <w:delText>.55</w:delText>
+        </w:r>
+      </w:del>
+      <w:ins w:id="103" w:author="Matt Sydes" w:date="2026-07-03T17:24:00Z" w16du:dateUtc="2026-07-03T16:24:00Z">
+        <w:r>
+          <w:t>0.55</w:t>
+        </w:r>
+      </w:ins>
       <w:r>
         <w:t xml:space="preserve"> </w:t>
       </w:r>
-      <w:r>
-        <w:t xml:space="preserve">prior1d(.55 .001) prior0d(.5 .001) prior1a(.5 .28867513) prior0a(.5 .28867513) seed(3) criteria(.80) </w:t>
-      </w:r>
+      <w:ins w:id="104" w:author="Matt Sydes" w:date="2026-07-03T17:25:00Z" w16du:dateUtc="2026-07-03T16:25:00Z">
+        <w:r>
+          <w:t>0</w:t>
+        </w:r>
+        <w:del w:id="105" w:author="Ian White" w:date="2026-07-06T10:46:00Z" w16du:dateUtc="2026-07-06T09:46:00Z">
+          <w:r>
+            <w:delText>.001</w:delText>
+          </w:r>
+        </w:del>
+      </w:ins>
+      <w:del w:id="106" w:author="Matt Sydes" w:date="2026-07-03T17:25:00Z" w16du:dateUtc="2026-07-03T16:25:00Z">
+        <w:r>
+          <w:delText>.001</w:delText>
+        </w:r>
+      </w:del>
+      <w:r>
+        <w:t>) prior0d(</w:t>
+      </w:r>
+      <w:del w:id="107" w:author="Matt Sydes" w:date="2026-07-03T17:23:00Z" w16du:dateUtc="2026-07-03T16:23:00Z">
+        <w:r>
+          <w:delText xml:space="preserve">.5 </w:delText>
+        </w:r>
+      </w:del>
+      <w:ins w:id="108" w:author="Matt Sydes" w:date="2026-07-03T17:23:00Z" w16du:dateUtc="2026-07-03T16:23:00Z">
+        <w:r>
+          <w:t xml:space="preserve">0.50 </w:t>
+        </w:r>
+      </w:ins>
+      <w:ins w:id="109" w:author="Matt Sydes" w:date="2026-07-03T17:24:00Z" w16du:dateUtc="2026-07-03T16:24:00Z">
+        <w:r>
+          <w:t>0</w:t>
+        </w:r>
+      </w:ins>
+      <w:ins w:id="110" w:author="Matt Sydes" w:date="2026-07-03T17:25:00Z" w16du:dateUtc="2026-07-03T16:25:00Z">
+        <w:del w:id="111" w:author="Ian White" w:date="2026-07-06T10:46:00Z" w16du:dateUtc="2026-07-06T09:46:00Z">
+          <w:r>
+            <w:delText>.001</w:delText>
+          </w:r>
+        </w:del>
+      </w:ins>
+      <w:del w:id="112" w:author="Matt Sydes" w:date="2026-07-03T17:25:00Z" w16du:dateUtc="2026-07-03T16:25:00Z">
+        <w:r>
+          <w:delText>.001</w:delText>
+        </w:r>
+      </w:del>
+      <w:r>
+        <w:t xml:space="preserve">) </w:t>
+      </w:r>
+      <w:ins w:id="113" w:author="Ian White" w:date="2026-07-06T10:29:00Z" w16du:dateUtc="2026-07-06T09:29:00Z">
+        <w:r>
+          <w:t>///</w:t>
+        </w:r>
+      </w:ins>
+    </w:p>
+    <w:p>
+      <w:pPr>
+        <w:pStyle w:val="Typeface"/>
+        <w:ind w:left="1440"/>
+        <w:rPr>
+          <w:ins w:id="114" w:author="Ian White" w:date="2026-07-06T10:30:00Z" w16du:dateUtc="2026-07-06T09:30:00Z"/>
+        </w:rPr>
+        <w:pPrChange w:id="115" w:author="Ian White" w:date="2026-07-06T10:52:00Z" w16du:dateUtc="2026-07-06T09:52:00Z">
+          <w:pPr>
+            <w:pStyle w:val="Typeface"/>
+          </w:pPr>
+        </w:pPrChange>
+      </w:pPr>
+      <w:r>
+        <w:t>prior1a(</w:t>
+      </w:r>
+      <w:del w:id="116" w:author="Matt Sydes" w:date="2026-07-03T17:23:00Z" w16du:dateUtc="2026-07-03T16:23:00Z">
+        <w:r>
+          <w:delText xml:space="preserve">.5 </w:delText>
+        </w:r>
+      </w:del>
+      <w:ins w:id="117" w:author="Matt Sydes" w:date="2026-07-03T17:23:00Z" w16du:dateUtc="2026-07-03T16:23:00Z">
+        <w:r>
+          <w:t xml:space="preserve">0.50 </w:t>
+        </w:r>
+      </w:ins>
+      <w:ins w:id="118" w:author="Matt Sydes" w:date="2026-07-03T17:25:00Z" w16du:dateUtc="2026-07-03T16:25:00Z">
+        <w:r>
+          <w:t>0</w:t>
+        </w:r>
+      </w:ins>
+      <w:r>
+        <w:t>.2</w:t>
+      </w:r>
+      <w:ins w:id="119" w:author="Ian White" w:date="2026-07-06T10:33:00Z" w16du:dateUtc="2026-07-06T09:33:00Z">
+        <w:r>
+          <w:t>9</w:t>
+        </w:r>
+      </w:ins>
+      <w:del w:id="120" w:author="Ian White" w:date="2026-07-06T10:33:00Z" w16du:dateUtc="2026-07-06T09:33:00Z">
+        <w:r>
+          <w:delText>8867513</w:delText>
+        </w:r>
+      </w:del>
+      <w:r>
+        <w:t>) prior0a(</w:t>
+      </w:r>
+      <w:del w:id="121" w:author="Matt Sydes" w:date="2026-07-03T17:23:00Z" w16du:dateUtc="2026-07-03T16:23:00Z">
+        <w:r>
+          <w:delText xml:space="preserve">.5 </w:delText>
+        </w:r>
+      </w:del>
+      <w:ins w:id="122" w:author="Matt Sydes" w:date="2026-07-03T17:23:00Z" w16du:dateUtc="2026-07-03T16:23:00Z">
+        <w:r>
+          <w:t xml:space="preserve">0.50 </w:t>
+        </w:r>
+      </w:ins>
+      <w:ins w:id="123" w:author="Matt Sydes" w:date="2026-07-03T17:25:00Z" w16du:dateUtc="2026-07-03T16:25:00Z">
+        <w:r>
+          <w:t>0</w:t>
+        </w:r>
+      </w:ins>
+      <w:r>
+        <w:t>.2</w:t>
+      </w:r>
+      <w:ins w:id="124" w:author="Ian White" w:date="2026-07-06T10:33:00Z" w16du:dateUtc="2026-07-06T09:33:00Z">
+        <w:r>
+          <w:t>9</w:t>
+        </w:r>
+      </w:ins>
+      <w:del w:id="125" w:author="Ian White" w:date="2026-07-06T10:33:00Z" w16du:dateUtc="2026-07-06T09:33:00Z">
+        <w:r>
+          <w:delText>8867513</w:delText>
+        </w:r>
+      </w:del>
+      <w:r>
+        <w:t xml:space="preserve">) </w:t>
+      </w:r>
+      <w:ins w:id="126" w:author="Ian White" w:date="2026-07-06T10:30:00Z" w16du:dateUtc="2026-07-06T09:30:00Z">
+        <w:r>
+          <w:t>///</w:t>
+        </w:r>
+      </w:ins>
+    </w:p>
+    <w:p>
+      <w:pPr>
+        <w:pStyle w:val="Typeface"/>
+        <w:ind w:left="1440"/>
+        <w:pPrChange w:id="127" w:author="Ian White" w:date="2026-07-06T10:52:00Z" w16du:dateUtc="2026-07-06T09:52:00Z">
+          <w:pPr>
+            <w:pStyle w:val="Typeface"/>
+          </w:pPr>
+        </w:pPrChange>
+      </w:pPr>
+      <w:r>
+        <w:t>seed(3) criteria(</w:t>
+      </w:r>
+      <w:ins w:id="128" w:author="Matt Sydes" w:date="2026-07-03T17:25:00Z" w16du:dateUtc="2026-07-03T16:25:00Z">
+        <w:r>
+          <w:t>0</w:t>
+        </w:r>
+      </w:ins>
+      <w:r>
+        <w:t xml:space="preserve">.80) </w:t>
+      </w:r>
+    </w:p>
+    <w:p>
+      <w:pPr>
+        <w:pStyle w:val="Heading3"/>
+        <w:rPr>
+          <w:ins w:id="129" w:author="Matt Sydes" w:date="2026-07-03T17:23:00Z" w16du:dateUtc="2026-07-03T16:23:00Z"/>
+        </w:rPr>
+      </w:pPr>
     </w:p>
     <w:p>
       <w:pPr>
@@ -435,7 +1332,33 @@
         <w:t>dentifying the better treatment based on point estimate alone</w:t>
       </w:r>
       <w:r>
-        <w:t xml:space="preserve"> is equivalent to testing at a highly non-standard 50% one-sided level. So the </w:t>
+        <w:t xml:space="preserve"> is equivalent to testing at a highly non-standard </w:t>
+      </w:r>
+      <w:commentRangeStart w:id="130"/>
+      <w:commentRangeStart w:id="131"/>
+      <w:r>
+        <w:t>50% one-sided level</w:t>
+      </w:r>
+      <w:commentRangeEnd w:id="130"/>
+      <w:r>
+        <w:rPr>
+          <w:rStyle w:val="CommentReference"/>
+          <w:sz w:val="24"/>
+          <w:szCs w:val="22"/>
+        </w:rPr>
+        <w:commentReference w:id="130"/>
+      </w:r>
+      <w:commentRangeEnd w:id="131"/>
+      <w:r>
+        <w:rPr>
+          <w:rStyle w:val="CommentReference"/>
+          <w:sz w:val="24"/>
+          <w:szCs w:val="22"/>
+        </w:rPr>
+        <w:commentReference w:id="131"/>
+      </w:r>
+      <w:r>
+        <w:t xml:space="preserve">. So the </w:t>
       </w:r>
       <w:r>
         <w:t xml:space="preserve">probability of correctly identifying the better treatment </w:t>
@@ -530,8 +1453,18 @@
       <w:r>
         <w:t xml:space="preserve"> with the power set to </w:t>
       </w:r>
-      <w:r>
-        <w:t>.9:</w:t>
+      <w:del w:id="132" w:author="Matt Sydes" w:date="2026-07-03T17:24:00Z" w16du:dateUtc="2026-07-03T16:24:00Z">
+        <w:r>
+          <w:delText>.9</w:delText>
+        </w:r>
+      </w:del>
+      <w:ins w:id="133" w:author="Matt Sydes" w:date="2026-07-03T17:24:00Z" w16du:dateUtc="2026-07-03T16:24:00Z">
+        <w:r>
+          <w:t>90%</w:t>
+        </w:r>
+      </w:ins>
+      <w:r>
+        <w:t>:</w:t>
       </w:r>
     </w:p>
     <w:p>
@@ -539,7 +1472,56 @@
         <w:pStyle w:val="Typeface"/>
       </w:pPr>
       <w:r>
-        <w:t>artbin, pr(.5 .55) power(.9) alpha(.5) onesided</w:t>
+        <w:t>artbin, pr(</w:t>
+      </w:r>
+      <w:del w:id="134" w:author="Matt Sydes" w:date="2026-07-03T17:23:00Z" w16du:dateUtc="2026-07-03T16:23:00Z">
+        <w:r>
+          <w:delText xml:space="preserve">.5 </w:delText>
+        </w:r>
+      </w:del>
+      <w:ins w:id="135" w:author="Matt Sydes" w:date="2026-07-03T17:23:00Z" w16du:dateUtc="2026-07-03T16:23:00Z">
+        <w:r>
+          <w:t xml:space="preserve">0.50 </w:t>
+        </w:r>
+      </w:ins>
+      <w:del w:id="136" w:author="Matt Sydes" w:date="2026-07-03T17:24:00Z" w16du:dateUtc="2026-07-03T16:24:00Z">
+        <w:r>
+          <w:delText>.55</w:delText>
+        </w:r>
+      </w:del>
+      <w:ins w:id="137" w:author="Matt Sydes" w:date="2026-07-03T17:24:00Z" w16du:dateUtc="2026-07-03T16:24:00Z">
+        <w:r>
+          <w:t>0.55</w:t>
+        </w:r>
+      </w:ins>
+      <w:r>
+        <w:t>) power(</w:t>
+      </w:r>
+      <w:del w:id="138" w:author="Matt Sydes" w:date="2026-07-03T17:24:00Z" w16du:dateUtc="2026-07-03T16:24:00Z">
+        <w:r>
+          <w:delText>.9</w:delText>
+        </w:r>
+      </w:del>
+      <w:ins w:id="139" w:author="Matt Sydes" w:date="2026-07-03T17:24:00Z" w16du:dateUtc="2026-07-03T16:24:00Z">
+        <w:r>
+          <w:t>0.90</w:t>
+        </w:r>
+      </w:ins>
+      <w:r>
+        <w:t>) alpha(</w:t>
+      </w:r>
+      <w:del w:id="140" w:author="Matt Sydes" w:date="2026-07-03T17:24:00Z" w16du:dateUtc="2026-07-03T16:24:00Z">
+        <w:r>
+          <w:delText>.5</w:delText>
+        </w:r>
+      </w:del>
+      <w:ins w:id="141" w:author="Matt Sydes" w:date="2026-07-03T17:24:00Z" w16du:dateUtc="2026-07-03T16:24:00Z">
+        <w:r>
+          <w:t>0.50</w:t>
+        </w:r>
+      </w:ins>
+      <w:r>
+        <w:t>) onesided</w:t>
       </w:r>
     </w:p>
     <w:p>
@@ -588,8 +1570,31 @@
     </w:p>
     <w:p>
       <w:pPr>
+        <w:pStyle w:val="Bibliography"/>
+      </w:pPr>
+      <w:r>
+        <w:lastRenderedPageBreak/>
+        <w:t>2.</w:t>
+      </w:r>
+      <w:r>
+        <w:tab/>
+        <w:t xml:space="preserve">Turner RM, Clements MN, Quartagno M, et al. Practical approaches to Bayesian sample size determination in non‐inferiority trials with binary outcomes. </w:t>
+      </w:r>
+      <w:r>
+        <w:rPr>
+          <w:i/>
+          <w:iCs/>
+        </w:rPr>
+        <w:t>Stat Med</w:t>
+      </w:r>
+      <w:r>
+        <w:t>. 2023;42(8):1127-1138. doi:10.1002/sim.9661</w:t>
+      </w:r>
+    </w:p>
+    <w:p>
+      <w:pPr>
         <w:sectPr>
-          <w:footerReference w:type="default" r:id="rId9"/>
+          <w:footerReference w:type="default" r:id="rId13"/>
           <w:pgSz w:w="11906" w:h="16838" w:code="9"/>
           <w:pgMar w:top="1440" w:right="1440" w:bottom="1440" w:left="1440" w:header="709" w:footer="709" w:gutter="0"/>
           <w:cols w:space="708"/>
@@ -1635,7 +2640,7 @@
       <w:r>
         <w:t>should be considered as reference intervention</w:t>
       </w:r>
-      <w:bookmarkStart w:id="1" w:name="_Ref169885346"/>
+      <w:bookmarkStart w:id="142" w:name="_Ref169885346"/>
       <w:r>
         <w:t>.</w:t>
       </w:r>
@@ -1643,7 +2648,7 @@
         <w:br w:type="page"/>
       </w:r>
     </w:p>
-    <w:bookmarkEnd w:id="1"/>
+    <w:bookmarkEnd w:id="142"/>
     <w:p>
       <w:pPr>
         <w:pStyle w:val="Caption"/>
@@ -1680,7 +2685,7 @@
       <w:r>
         <w:t>more or less appropriate than a standard approach</w:t>
       </w:r>
-      <w:bookmarkStart w:id="2" w:name="_Ref169884017"/>
+      <w:bookmarkStart w:id="143" w:name="_Ref169884017"/>
       <w:r>
         <w:t>.</w:t>
       </w:r>
@@ -2038,7 +3043,7 @@
           </w:p>
         </w:tc>
       </w:tr>
-      <w:bookmarkEnd w:id="2"/>
+      <w:bookmarkEnd w:id="143"/>
     </w:tbl>
     <w:p>
       <w:pPr>
@@ -2054,6 +3059,134 @@
     </w:sectPr>
   </w:body>
 </w:document>
+</file>
+
+<file path=word/comments.xml><?xml version="1.0" encoding="utf-8"?>
+<w:comments xmlns:wpc="http://schemas.microsoft.com/office/word/2010/wordprocessingCanvas" xmlns:cx="http://schemas.microsoft.com/office/drawing/2014/chartex" xmlns:cx1="http://schemas.microsoft.com/office/drawing/2015/9/8/chartex" xmlns:cx2="http://schemas.microsoft.com/office/drawing/2015/10/21/chartex" xmlns:cx3="http://schemas.microsoft.com/office/drawing/2016/5/9/chartex" xmlns:cx4="http://schemas.microsoft.com/office/drawing/2016/5/10/chartex" xmlns:cx5="http://schemas.microsoft.com/office/drawing/2016/5/11/chartex" xmlns:cx6="http://schemas.microsoft.com/office/drawing/2016/5/12/chartex" xmlns:cx7="http://schemas.microsoft.com/office/drawing/2016/5/13/chartex" xmlns:cx8="http://schemas.microsoft.com/office/drawing/2016/5/14/chartex" xmlns:mc="http://schemas.openxmlformats.org/markup-compatibility/2006" xmlns:aink="http://schemas.microsoft.com/office/drawing/2016/ink" xmlns:am3d="http://schemas.microsoft.com/office/drawing/2017/model3d" xmlns:o="urn:schemas-microsoft-com:office:office" xmlns:oel="http://schemas.microsoft.com/office/2019/extlst" xmlns:r="http://schemas.openxmlformats.org/officeDocument/2006/relationships" xmlns:m="http://schemas.openxmlformats.org/officeDocument/2006/math" xmlns:v="urn:schemas-microsoft-com:vml" xmlns:wp14="http://schemas.microsoft.com/office/word/2010/wordprocessingDrawing" xmlns:wp="http://schemas.openxmlformats.org/drawingml/2006/wordprocessingDrawing" xmlns:w10="urn:schemas-microsoft-com:office:word" xmlns:w="http://schemas.openxmlformats.org/wordprocessingml/2006/main" xmlns:w14="http://schemas.microsoft.com/office/word/2010/wordml" xmlns:w15="http://schemas.microsoft.com/office/word/2012/wordml" xmlns:w16cex="http://schemas.microsoft.com/office/word/2018/wordml/cex" xmlns:w16cid="http://schemas.microsoft.com/office/word/2016/wordml/cid" xmlns:w16="http://schemas.microsoft.com/office/word/2018/wordml" xmlns:w16du="http://schemas.microsoft.com/office/word/2023/wordml/word16du" xmlns:w16sdtdh="http://schemas.microsoft.com/office/word/2020/wordml/sdtdatahash" xmlns:w16sdtfl="http://schemas.microsoft.com/office/word/2024/wordml/sdtformatlock" xmlns:w16se="http://schemas.microsoft.com/office/word/2015/wordml/symex" xmlns:wpg="http://schemas.microsoft.com/office/word/2010/wordprocessingGroup" xmlns:wpi="http://schemas.microsoft.com/office/word/2010/wordprocessingInk" xmlns:wne="http://schemas.microsoft.com/office/word/2006/wordml" xmlns:wps="http://schemas.microsoft.com/office/word/2010/wordprocessingShape" mc:Ignorable="w14 w15 w16se w16cid w16 w16cex w16sdtdh w16sdtfl w16du wp14">
+  <w:comment w:id="35" w:author="Matt Sydes" w:date="2026-07-03T17:29:00Z" w:initials="MSy">
+    <w:p>
+      <w:pPr>
+        <w:pStyle w:val="CommentText"/>
+      </w:pPr>
+      <w:r>
+        <w:rPr>
+          <w:rStyle w:val="CommentReference"/>
+        </w:rPr>
+        <w:annotationRef/>
+      </w:r>
+      <w:r>
+        <w:rPr>
+          <w:b/>
+          <w:bCs/>
+        </w:rPr>
+        <w:t>NOTE</w:t>
+      </w:r>
+    </w:p>
+    <w:p>
+      <w:pPr>
+        <w:pStyle w:val="CommentText"/>
+      </w:pPr>
+      <w:r>
+        <w:t>This link gives me a 404 error</w:t>
+      </w:r>
+    </w:p>
+    <w:p>
+      <w:pPr>
+        <w:pStyle w:val="CommentText"/>
+      </w:pPr>
+      <w:r>
+        <w:t>Is this also going into SSC?</w:t>
+      </w:r>
+    </w:p>
+  </w:comment>
+  <w:comment w:id="36" w:author="Ian White" w:date="2026-07-06T10:28:00Z" w:initials="IW">
+    <w:p>
+      <w:pPr>
+        <w:pStyle w:val="CommentText"/>
+      </w:pPr>
+      <w:r>
+        <w:rPr>
+          <w:rStyle w:val="CommentReference"/>
+        </w:rPr>
+        <w:annotationRef/>
+      </w:r>
+      <w:r>
+        <w:t>The repo is not yet public, but I can give access to anyone who sends me their github id</w:t>
+      </w:r>
+    </w:p>
+  </w:comment>
+  <w:comment w:id="130" w:author="Matt Sydes" w:date="2026-07-03T17:30:00Z" w:initials="MSy">
+    <w:p>
+      <w:pPr>
+        <w:pStyle w:val="CommentText"/>
+      </w:pPr>
+      <w:r>
+        <w:rPr>
+          <w:rStyle w:val="CommentReference"/>
+        </w:rPr>
+        <w:annotationRef/>
+      </w:r>
+      <w:r>
+        <w:rPr>
+          <w:b/>
+          <w:bCs/>
+        </w:rPr>
+        <w:t>SUGGESTION</w:t>
+      </w:r>
+    </w:p>
+    <w:p>
+      <w:pPr>
+        <w:pStyle w:val="CommentText"/>
+      </w:pPr>
+      <w:r>
+        <w:t>Should this be 0.05 rather than 50%?</w:t>
+      </w:r>
+    </w:p>
+  </w:comment>
+  <w:comment w:id="131" w:author="Ian White" w:date="2026-07-06T10:51:00Z" w:initials="IW">
+    <w:p>
+      <w:pPr>
+        <w:pStyle w:val="CommentText"/>
+      </w:pPr>
+      <w:r>
+        <w:rPr>
+          <w:rStyle w:val="CommentReference"/>
+        </w:rPr>
+        <w:annotationRef/>
+      </w:r>
+      <w:r>
+        <w:t>No, it really is 50%</w:t>
+      </w:r>
+    </w:p>
+  </w:comment>
+</w:comments>
+</file>
+
+<file path=word/commentsExtended.xml><?xml version="1.0" encoding="utf-8"?>
+<w15:commentsEx xmlns:wpc="http://schemas.microsoft.com/office/word/2010/wordprocessingCanvas" xmlns:cx="http://schemas.microsoft.com/office/drawing/2014/chartex" xmlns:cx1="http://schemas.microsoft.com/office/drawing/2015/9/8/chartex" xmlns:cx2="http://schemas.microsoft.com/office/drawing/2015/10/21/chartex" xmlns:cx3="http://schemas.microsoft.com/office/drawing/2016/5/9/chartex" xmlns:cx4="http://schemas.microsoft.com/office/drawing/2016/5/10/chartex" xmlns:cx5="http://schemas.microsoft.com/office/drawing/2016/5/11/chartex" xmlns:cx6="http://schemas.microsoft.com/office/drawing/2016/5/12/chartex" xmlns:cx7="http://schemas.microsoft.com/office/drawing/2016/5/13/chartex" xmlns:cx8="http://schemas.microsoft.com/office/drawing/2016/5/14/chartex" xmlns:mc="http://schemas.openxmlformats.org/markup-compatibility/2006" xmlns:aink="http://schemas.microsoft.com/office/drawing/2016/ink" xmlns:am3d="http://schemas.microsoft.com/office/drawing/2017/model3d" xmlns:o="urn:schemas-microsoft-com:office:office" xmlns:oel="http://schemas.microsoft.com/office/2019/extlst" xmlns:r="http://schemas.openxmlformats.org/officeDocument/2006/relationships" xmlns:m="http://schemas.openxmlformats.org/officeDocument/2006/math" xmlns:v="urn:schemas-microsoft-com:vml" xmlns:wp14="http://schemas.microsoft.com/office/word/2010/wordprocessingDrawing" xmlns:wp="http://schemas.openxmlformats.org/drawingml/2006/wordprocessingDrawing" xmlns:w10="urn:schemas-microsoft-com:office:word" xmlns:w="http://schemas.openxmlformats.org/wordprocessingml/2006/main" xmlns:w14="http://schemas.microsoft.com/office/word/2010/wordml" xmlns:w15="http://schemas.microsoft.com/office/word/2012/wordml" xmlns:w16cex="http://schemas.microsoft.com/office/word/2018/wordml/cex" xmlns:w16cid="http://schemas.microsoft.com/office/word/2016/wordml/cid" xmlns:w16="http://schemas.microsoft.com/office/word/2018/wordml" xmlns:w16du="http://schemas.microsoft.com/office/word/2023/wordml/word16du" xmlns:w16sdtdh="http://schemas.microsoft.com/office/word/2020/wordml/sdtdatahash" xmlns:w16sdtfl="http://schemas.microsoft.com/office/word/2024/wordml/sdtformatlock" xmlns:w16se="http://schemas.microsoft.com/office/word/2015/wordml/symex" xmlns:wpg="http://schemas.microsoft.com/office/word/2010/wordprocessingGroup" xmlns:wpi="http://schemas.microsoft.com/office/word/2010/wordprocessingInk" xmlns:wne="http://schemas.microsoft.com/office/word/2006/wordml" xmlns:wps="http://schemas.microsoft.com/office/word/2010/wordprocessingShape" mc:Ignorable="w14 w15 w16se w16cid w16 w16cex w16sdtdh w16sdtfl w16du wp14">
+  <w15:commentEx w15:paraId="73708A25" w15:done="0"/>
+  <w15:commentEx w15:paraId="5BFF4A43" w15:paraIdParent="73708A25" w15:done="0"/>
+  <w15:commentEx w15:paraId="02E71140" w15:done="0"/>
+  <w15:commentEx w15:paraId="07BDD65C" w15:paraIdParent="02E71140" w15:done="0"/>
+</w15:commentsEx>
+</file>
+
+<file path=word/commentsExtensible.xml><?xml version="1.0" encoding="utf-8"?>
+<w16cex:commentsExtensible xmlns:wpc="http://schemas.microsoft.com/office/word/2010/wordprocessingCanvas" xmlns:cx="http://schemas.microsoft.com/office/drawing/2014/chartex" xmlns:cx1="http://schemas.microsoft.com/office/drawing/2015/9/8/chartex" xmlns:cx2="http://schemas.microsoft.com/office/drawing/2015/10/21/chartex" xmlns:cx3="http://schemas.microsoft.com/office/drawing/2016/5/9/chartex" xmlns:cx4="http://schemas.microsoft.com/office/drawing/2016/5/10/chartex" xmlns:cx5="http://schemas.microsoft.com/office/drawing/2016/5/11/chartex" xmlns:cx6="http://schemas.microsoft.com/office/drawing/2016/5/12/chartex" xmlns:cx7="http://schemas.microsoft.com/office/drawing/2016/5/13/chartex" xmlns:cx8="http://schemas.microsoft.com/office/drawing/2016/5/14/chartex" xmlns:cr="http://schemas.microsoft.com/office/comments/2020/reactions" xmlns:mc="http://schemas.openxmlformats.org/markup-compatibility/2006" xmlns:aink="http://schemas.microsoft.com/office/drawing/2016/ink" xmlns:am3d="http://schemas.microsoft.com/office/drawing/2017/model3d" xmlns:o="urn:schemas-microsoft-com:office:office" xmlns:oel="http://schemas.microsoft.com/office/2019/extlst" xmlns:r="http://schemas.openxmlformats.org/officeDocument/2006/relationships" xmlns:m="http://schemas.openxmlformats.org/officeDocument/2006/math" xmlns:v="urn:schemas-microsoft-com:vml" xmlns:wp14="http://schemas.microsoft.com/office/word/2010/wordprocessingDrawing" xmlns:wp="http://schemas.openxmlformats.org/drawingml/2006/wordprocessingDrawing" xmlns:w10="urn:schemas-microsoft-com:office:word" xmlns:w="http://schemas.openxmlformats.org/wordprocessingml/2006/main" xmlns:w14="http://schemas.microsoft.com/office/word/2010/wordml" xmlns:w15="http://schemas.microsoft.com/office/word/2012/wordml" xmlns:w16cex="http://schemas.microsoft.com/office/word/2018/wordml/cex" xmlns:w16cid="http://schemas.microsoft.com/office/word/2016/wordml/cid" xmlns:w16="http://schemas.microsoft.com/office/word/2018/wordml" xmlns:w16du="http://schemas.microsoft.com/office/word/2023/wordml/word16du" xmlns:w16sdtdh="http://schemas.microsoft.com/office/word/2020/wordml/sdtdatahash" xmlns:w16sdtfl="http://schemas.microsoft.com/office/word/2024/wordml/sdtformatlock" xmlns:w16se="http://schemas.microsoft.com/office/word/2015/wordml/symex" xmlns:wpg="http://schemas.microsoft.com/office/word/2010/wordprocessingGroup" xmlns:wpi="http://schemas.microsoft.com/office/word/2010/wordprocessingInk" xmlns:wne="http://schemas.microsoft.com/office/word/2006/wordml" xmlns:wps="http://schemas.microsoft.com/office/word/2010/wordprocessingShape" mc:Ignorable="w14 w15 w16se w16cid w16 w16cex w16sdtdh w16sdtfl cr w16du wp14">
+  <w16cex:commentExtensible w16cex:durableId="3E9AB7B5" w16cex:dateUtc="2026-07-03T16:29:00Z"/>
+  <w16cex:commentExtensible w16cex:durableId="52CEFB89" w16cex:dateUtc="2026-07-06T09:28:00Z"/>
+  <w16cex:commentExtensible w16cex:durableId="556B1CC6" w16cex:dateUtc="2026-07-03T16:30:00Z"/>
+  <w16cex:commentExtensible w16cex:durableId="75CE6124" w16cex:dateUtc="2026-07-06T09:51:00Z"/>
+</w16cex:commentsExtensible>
+</file>
+
+<file path=word/commentsIds.xml><?xml version="1.0" encoding="utf-8"?>
+<w16cid:commentsIds xmlns:wpc="http://schemas.microsoft.com/office/word/2010/wordprocessingCanvas" xmlns:cx="http://schemas.microsoft.com/office/drawing/2014/chartex" xmlns:cx1="http://schemas.microsoft.com/office/drawing/2015/9/8/chartex" xmlns:cx2="http://schemas.microsoft.com/office/drawing/2015/10/21/chartex" xmlns:cx3="http://schemas.microsoft.com/office/drawing/2016/5/9/chartex" xmlns:cx4="http://schemas.microsoft.com/office/drawing/2016/5/10/chartex" xmlns:cx5="http://schemas.microsoft.com/office/drawing/2016/5/11/chartex" xmlns:cx6="http://schemas.microsoft.com/office/drawing/2016/5/12/chartex" xmlns:cx7="http://schemas.microsoft.com/office/drawing/2016/5/13/chartex" xmlns:cx8="http://schemas.microsoft.com/office/drawing/2016/5/14/chartex" xmlns:mc="http://schemas.openxmlformats.org/markup-compatibility/2006" xmlns:aink="http://schemas.microsoft.com/office/drawing/2016/ink" xmlns:am3d="http://schemas.microsoft.com/office/drawing/2017/model3d" xmlns:o="urn:schemas-microsoft-com:office:office" xmlns:oel="http://schemas.microsoft.com/office/2019/extlst" xmlns:r="http://schemas.openxmlformats.org/officeDocument/2006/relationships" xmlns:m="http://schemas.openxmlformats.org/officeDocument/2006/math" xmlns:v="urn:schemas-microsoft-com:vml" xmlns:wp14="http://schemas.microsoft.com/office/word/2010/wordprocessingDrawing" xmlns:wp="http://schemas.openxmlformats.org/drawingml/2006/wordprocessingDrawing" xmlns:w10="urn:schemas-microsoft-com:office:word" xmlns:w="http://schemas.openxmlformats.org/wordprocessingml/2006/main" xmlns:w14="http://schemas.microsoft.com/office/word/2010/wordml" xmlns:w15="http://schemas.microsoft.com/office/word/2012/wordml" xmlns:w16cex="http://schemas.microsoft.com/office/word/2018/wordml/cex" xmlns:w16cid="http://schemas.microsoft.com/office/word/2016/wordml/cid" xmlns:w16="http://schemas.microsoft.com/office/word/2018/wordml" xmlns:w16du="http://schemas.microsoft.com/office/word/2023/wordml/word16du" xmlns:w16sdtdh="http://schemas.microsoft.com/office/word/2020/wordml/sdtdatahash" xmlns:w16sdtfl="http://schemas.microsoft.com/office/word/2024/wordml/sdtformatlock" xmlns:w16se="http://schemas.microsoft.com/office/word/2015/wordml/symex" xmlns:wpg="http://schemas.microsoft.com/office/word/2010/wordprocessingGroup" xmlns:wpi="http://schemas.microsoft.com/office/word/2010/wordprocessingInk" xmlns:wne="http://schemas.microsoft.com/office/word/2006/wordml" xmlns:wps="http://schemas.microsoft.com/office/word/2010/wordprocessingShape" mc:Ignorable="w14 w15 w16se w16cid w16 w16cex w16sdtdh w16sdtfl w16du wp14">
+  <w16cid:commentId w16cid:paraId="73708A25" w16cid:durableId="3E9AB7B5"/>
+  <w16cid:commentId w16cid:paraId="5BFF4A43" w16cid:durableId="52CEFB89"/>
+  <w16cid:commentId w16cid:paraId="02E71140" w16cid:durableId="556B1CC6"/>
+  <w16cid:commentId w16cid:paraId="07BDD65C" w16cid:durableId="75CE6124"/>
+</w16cid:commentsIds>
 </file>
 
 <file path=word/endnotes.xml><?xml version="1.0" encoding="utf-8"?>
@@ -4328,6 +5461,17 @@
     <w:abstractNumId w:val="0"/>
   </w:num>
 </w:numbering>
+</file>
+
+<file path=word/people.xml><?xml version="1.0" encoding="utf-8"?>
+<w15:people xmlns:wpc="http://schemas.microsoft.com/office/word/2010/wordprocessingCanvas" xmlns:cx="http://schemas.microsoft.com/office/drawing/2014/chartex" xmlns:cx1="http://schemas.microsoft.com/office/drawing/2015/9/8/chartex" xmlns:cx2="http://schemas.microsoft.com/office/drawing/2015/10/21/chartex" xmlns:cx3="http://schemas.microsoft.com/office/drawing/2016/5/9/chartex" xmlns:cx4="http://schemas.microsoft.com/office/drawing/2016/5/10/chartex" xmlns:cx5="http://schemas.microsoft.com/office/drawing/2016/5/11/chartex" xmlns:cx6="http://schemas.microsoft.com/office/drawing/2016/5/12/chartex" xmlns:cx7="http://schemas.microsoft.com/office/drawing/2016/5/13/chartex" xmlns:cx8="http://schemas.microsoft.com/office/drawing/2016/5/14/chartex" xmlns:mc="http://schemas.openxmlformats.org/markup-compatibility/2006" xmlns:aink="http://schemas.microsoft.com/office/drawing/2016/ink" xmlns:am3d="http://schemas.microsoft.com/office/drawing/2017/model3d" xmlns:o="urn:schemas-microsoft-com:office:office" xmlns:oel="http://schemas.microsoft.com/office/2019/extlst" xmlns:r="http://schemas.openxmlformats.org/officeDocument/2006/relationships" xmlns:m="http://schemas.openxmlformats.org/officeDocument/2006/math" xmlns:v="urn:schemas-microsoft-com:vml" xmlns:wp14="http://schemas.microsoft.com/office/word/2010/wordprocessingDrawing" xmlns:wp="http://schemas.openxmlformats.org/drawingml/2006/wordprocessingDrawing" xmlns:w10="urn:schemas-microsoft-com:office:word" xmlns:w="http://schemas.openxmlformats.org/wordprocessingml/2006/main" xmlns:w14="http://schemas.microsoft.com/office/word/2010/wordml" xmlns:w15="http://schemas.microsoft.com/office/word/2012/wordml" xmlns:w16cex="http://schemas.microsoft.com/office/word/2018/wordml/cex" xmlns:w16cid="http://schemas.microsoft.com/office/word/2016/wordml/cid" xmlns:w16="http://schemas.microsoft.com/office/word/2018/wordml" xmlns:w16du="http://schemas.microsoft.com/office/word/2023/wordml/word16du" xmlns:w16sdtdh="http://schemas.microsoft.com/office/word/2020/wordml/sdtdatahash" xmlns:w16sdtfl="http://schemas.microsoft.com/office/word/2024/wordml/sdtformatlock" xmlns:w16se="http://schemas.microsoft.com/office/word/2015/wordml/symex" xmlns:wpg="http://schemas.microsoft.com/office/word/2010/wordprocessingGroup" xmlns:wpi="http://schemas.microsoft.com/office/word/2010/wordprocessingInk" xmlns:wne="http://schemas.microsoft.com/office/word/2006/wordml" xmlns:wps="http://schemas.microsoft.com/office/word/2010/wordprocessingShape" mc:Ignorable="w14 w15 w16se w16cid w16 w16cex w16sdtdh w16sdtfl w16du wp14">
+  <w15:person w15:author="Matt Sydes">
+    <w15:presenceInfo w15:providerId="None" w15:userId="Matt Sydes"/>
+  </w15:person>
+  <w15:person w15:author="Ian White">
+    <w15:presenceInfo w15:providerId="None" w15:userId="Ian White"/>
+  </w15:person>
+</w15:people>
 </file>
 
 <file path=word/styles.xml><?xml version="1.0" encoding="utf-8"?>
@@ -5011,10 +6155,11 @@
     <w:name w:val="Typeface"/>
     <w:basedOn w:val="Normal"/>
     <w:qFormat/>
-    <w:rsid w:val="00042704"/>
+    <w:rsid w:val="00271FF0"/>
     <w:pPr>
-      <w:spacing w:after="0"/>
+      <w:keepNext/>
       <w:ind w:left="720"/>
+      <w:contextualSpacing/>
     </w:pPr>
     <w:rPr>
       <w:rFonts w:ascii="Courier New" w:hAnsi="Courier New" w:cs="Courier New"/>
@@ -5603,5 +6748,6 @@
 <file path=docMetadata/LabelInfo.xml><?xml version="1.0" encoding="utf-8"?>
 <clbl:labelList xmlns:clbl="http://schemas.microsoft.com/office/2020/mipLabelMetadata">
   <clbl:label id="{1faf88fe-a998-4c5b-93c9-210a11d9a5c2}" enabled="0" method="" siteId="{1faf88fe-a998-4c5b-93c9-210a11d9a5c2}" removed="1"/>
+  <clbl:label id="{37c354b2-85b0-47f5-b222-07b48d774ee3}" enabled="0" method="" siteId="{37c354b2-85b0-47f5-b222-07b48d774ee3}" removed="1"/>
 </clbl:labelList>
 </file>
</xml_diff>

<commit_message>
more detail on decision theory approach
</commit_message>
<xml_diff>
--- a/Tailoring commentary - additional materials.docx
+++ b/Tailoring commentary - additional materials.docx
@@ -45,9 +45,6 @@
     <w:p>
       <w:pPr>
         <w:pStyle w:val="Heading3"/>
-        <w:rPr>
-          <w:ins w:id="1" w:author="Matt Sydes" w:date="2026-07-03T17:23:00Z" w16du:dateUtc="2026-07-03T16:23:00Z"/>
-        </w:rPr>
       </w:pPr>
     </w:p>
     <w:p>
@@ -154,47 +151,21 @@
       <w:r>
         <w:t>artbin, pr(</w:t>
       </w:r>
-      <w:del w:id="2" w:author="Matt Sydes" w:date="2026-07-03T17:23:00Z" w16du:dateUtc="2026-07-03T16:23:00Z">
-        <w:r>
-          <w:delText xml:space="preserve">.5 </w:delText>
-        </w:r>
-      </w:del>
-      <w:ins w:id="3" w:author="Matt Sydes" w:date="2026-07-03T17:23:00Z" w16du:dateUtc="2026-07-03T16:23:00Z">
-        <w:r>
-          <w:t xml:space="preserve">0.50 </w:t>
-        </w:r>
-      </w:ins>
-      <w:del w:id="4" w:author="Matt Sydes" w:date="2026-07-03T17:24:00Z" w16du:dateUtc="2026-07-03T16:24:00Z">
-        <w:r>
-          <w:delText>.55</w:delText>
-        </w:r>
-      </w:del>
-      <w:ins w:id="5" w:author="Matt Sydes" w:date="2026-07-03T17:24:00Z" w16du:dateUtc="2026-07-03T16:24:00Z">
-        <w:r>
-          <w:t>0.55</w:t>
-        </w:r>
-      </w:ins>
+      <w:r>
+        <w:t>0.50 0.55</w:t>
+      </w:r>
       <w:r>
         <w:t>) power(</w:t>
       </w:r>
-      <w:del w:id="6" w:author="Matt Sydes" w:date="2026-07-03T17:24:00Z" w16du:dateUtc="2026-07-03T16:24:00Z">
-        <w:r>
-          <w:delText>.9</w:delText>
-        </w:r>
-      </w:del>
-      <w:ins w:id="7" w:author="Matt Sydes" w:date="2026-07-03T17:24:00Z" w16du:dateUtc="2026-07-03T16:24:00Z">
-        <w:r>
-          <w:t>0.90</w:t>
-        </w:r>
-      </w:ins>
+      <w:r>
+        <w:t>0.90</w:t>
+      </w:r>
       <w:r>
         <w:t>) alpha(</w:t>
       </w:r>
-      <w:ins w:id="8" w:author="Matt Sydes" w:date="2026-07-03T17:28:00Z" w16du:dateUtc="2026-07-03T16:28:00Z">
-        <w:r>
-          <w:t>0</w:t>
-        </w:r>
-      </w:ins>
+      <w:r>
+        <w:t>0</w:t>
+      </w:r>
       <w:r>
         <w:t>.05)</w:t>
       </w:r>
@@ -202,9 +173,6 @@
     <w:p>
       <w:pPr>
         <w:pStyle w:val="Heading3"/>
-        <w:rPr>
-          <w:ins w:id="9" w:author="Matt Sydes" w:date="2026-07-03T17:23:00Z" w16du:dateUtc="2026-07-03T16:23:00Z"/>
-        </w:rPr>
       </w:pPr>
     </w:p>
     <w:p>
@@ -239,39 +207,15 @@
       <w:r>
         <w:t>artbin, pr(</w:t>
       </w:r>
-      <w:del w:id="10" w:author="Matt Sydes" w:date="2026-07-03T17:23:00Z" w16du:dateUtc="2026-07-03T16:23:00Z">
-        <w:r>
-          <w:delText xml:space="preserve">.5 </w:delText>
-        </w:r>
-      </w:del>
-      <w:ins w:id="11" w:author="Matt Sydes" w:date="2026-07-03T17:23:00Z" w16du:dateUtc="2026-07-03T16:23:00Z">
-        <w:r>
-          <w:t xml:space="preserve">0.50 </w:t>
-        </w:r>
-      </w:ins>
-      <w:del w:id="12" w:author="Matt Sydes" w:date="2026-07-03T17:24:00Z" w16du:dateUtc="2026-07-03T16:24:00Z">
-        <w:r>
-          <w:delText>.55</w:delText>
-        </w:r>
-      </w:del>
-      <w:ins w:id="13" w:author="Matt Sydes" w:date="2026-07-03T17:24:00Z" w16du:dateUtc="2026-07-03T16:24:00Z">
-        <w:r>
-          <w:t>0.55</w:t>
-        </w:r>
-      </w:ins>
+      <w:r>
+        <w:t>0.50 0.55</w:t>
+      </w:r>
       <w:r>
         <w:t>) power(</w:t>
       </w:r>
-      <w:del w:id="14" w:author="Matt Sydes" w:date="2026-07-03T17:24:00Z" w16du:dateUtc="2026-07-03T16:24:00Z">
-        <w:r>
-          <w:delText>.9</w:delText>
-        </w:r>
-      </w:del>
-      <w:ins w:id="15" w:author="Matt Sydes" w:date="2026-07-03T17:24:00Z" w16du:dateUtc="2026-07-03T16:24:00Z">
-        <w:r>
-          <w:t>0.90</w:t>
-        </w:r>
-      </w:ins>
+      <w:r>
+        <w:t>0.90</w:t>
+      </w:r>
       <w:r>
         <w:t>) alpha(.05) onesided</w:t>
       </w:r>
@@ -279,9 +223,6 @@
     <w:p>
       <w:pPr>
         <w:pStyle w:val="Heading3"/>
-        <w:rPr>
-          <w:ins w:id="16" w:author="Matt Sydes" w:date="2026-07-03T17:23:00Z" w16du:dateUtc="2026-07-03T16:23:00Z"/>
-        </w:rPr>
       </w:pPr>
     </w:p>
     <w:p>
@@ -331,29 +272,15 @@
       <w:r>
         <w:t>artbin, pr(</w:t>
       </w:r>
-      <w:del w:id="17" w:author="Matt Sydes" w:date="2026-07-03T17:23:00Z" w16du:dateUtc="2026-07-03T16:23:00Z">
-        <w:r>
-          <w:delText xml:space="preserve">.5 </w:delText>
-        </w:r>
-      </w:del>
-      <w:ins w:id="18" w:author="Matt Sydes" w:date="2026-07-03T17:23:00Z" w16du:dateUtc="2026-07-03T16:23:00Z">
-        <w:r>
-          <w:t xml:space="preserve">0.50 </w:t>
-        </w:r>
-      </w:ins>
+      <w:r>
+        <w:t xml:space="preserve">0.50 </w:t>
+      </w:r>
       <w:r>
         <w:t>.5) power(</w:t>
       </w:r>
-      <w:del w:id="19" w:author="Matt Sydes" w:date="2026-07-03T17:24:00Z" w16du:dateUtc="2026-07-03T16:24:00Z">
-        <w:r>
-          <w:delText>.9</w:delText>
-        </w:r>
-      </w:del>
-      <w:ins w:id="20" w:author="Matt Sydes" w:date="2026-07-03T17:24:00Z" w16du:dateUtc="2026-07-03T16:24:00Z">
-        <w:r>
-          <w:t>0.90</w:t>
-        </w:r>
-      </w:ins>
+      <w:r>
+        <w:t>0.90</w:t>
+      </w:r>
       <w:r>
         <w:t>) margin(-.05) onesided</w:t>
       </w:r>
@@ -361,9 +288,6 @@
     <w:p>
       <w:pPr>
         <w:pStyle w:val="Heading3"/>
-        <w:rPr>
-          <w:ins w:id="21" w:author="Matt Sydes" w:date="2026-07-03T17:23:00Z" w16du:dateUtc="2026-07-03T16:23:00Z"/>
-        </w:rPr>
       </w:pPr>
     </w:p>
     <w:p>
@@ -395,39 +319,15 @@
       <w:r>
         <w:t>artbin, pr(</w:t>
       </w:r>
-      <w:del w:id="22" w:author="Matt Sydes" w:date="2026-07-03T17:23:00Z" w16du:dateUtc="2026-07-03T16:23:00Z">
-        <w:r>
-          <w:delText xml:space="preserve">.5 </w:delText>
-        </w:r>
-      </w:del>
-      <w:ins w:id="23" w:author="Matt Sydes" w:date="2026-07-03T17:23:00Z" w16du:dateUtc="2026-07-03T16:23:00Z">
-        <w:r>
-          <w:t xml:space="preserve">0.50 </w:t>
-        </w:r>
-      </w:ins>
-      <w:del w:id="24" w:author="Matt Sydes" w:date="2026-07-03T17:24:00Z" w16du:dateUtc="2026-07-03T16:24:00Z">
-        <w:r>
-          <w:delText>.55</w:delText>
-        </w:r>
-      </w:del>
-      <w:ins w:id="25" w:author="Matt Sydes" w:date="2026-07-03T17:24:00Z" w16du:dateUtc="2026-07-03T16:24:00Z">
-        <w:r>
-          <w:t>0.55</w:t>
-        </w:r>
-      </w:ins>
+      <w:r>
+        <w:t>0.50 0.55</w:t>
+      </w:r>
       <w:r>
         <w:t>) power(</w:t>
       </w:r>
-      <w:del w:id="26" w:author="Matt Sydes" w:date="2026-07-03T17:24:00Z" w16du:dateUtc="2026-07-03T16:24:00Z">
-        <w:r>
-          <w:delText>.9</w:delText>
-        </w:r>
-      </w:del>
-      <w:ins w:id="27" w:author="Matt Sydes" w:date="2026-07-03T17:24:00Z" w16du:dateUtc="2026-07-03T16:24:00Z">
-        <w:r>
-          <w:t>0.90</w:t>
-        </w:r>
-      </w:ins>
+      <w:r>
+        <w:t>0.90</w:t>
+      </w:r>
       <w:r>
         <w:t xml:space="preserve">) </w:t>
       </w:r>
@@ -450,39 +350,15 @@
       <w:r>
         <w:t>artbin, pr(</w:t>
       </w:r>
-      <w:del w:id="28" w:author="Matt Sydes" w:date="2026-07-03T17:23:00Z" w16du:dateUtc="2026-07-03T16:23:00Z">
-        <w:r>
-          <w:delText xml:space="preserve">.5 </w:delText>
-        </w:r>
-      </w:del>
-      <w:ins w:id="29" w:author="Matt Sydes" w:date="2026-07-03T17:23:00Z" w16du:dateUtc="2026-07-03T16:23:00Z">
-        <w:r>
-          <w:t xml:space="preserve">0.50 </w:t>
-        </w:r>
-      </w:ins>
-      <w:del w:id="30" w:author="Matt Sydes" w:date="2026-07-03T17:24:00Z" w16du:dateUtc="2026-07-03T16:24:00Z">
-        <w:r>
-          <w:delText>.55</w:delText>
-        </w:r>
-      </w:del>
-      <w:ins w:id="31" w:author="Matt Sydes" w:date="2026-07-03T17:24:00Z" w16du:dateUtc="2026-07-03T16:24:00Z">
-        <w:r>
-          <w:t>0.55</w:t>
-        </w:r>
-      </w:ins>
+      <w:r>
+        <w:t>0.50 0.55</w:t>
+      </w:r>
       <w:r>
         <w:t>) power(</w:t>
       </w:r>
-      <w:del w:id="32" w:author="Matt Sydes" w:date="2026-07-03T17:24:00Z" w16du:dateUtc="2026-07-03T16:24:00Z">
-        <w:r>
-          <w:delText>.9</w:delText>
-        </w:r>
-      </w:del>
-      <w:ins w:id="33" w:author="Matt Sydes" w:date="2026-07-03T17:24:00Z" w16du:dateUtc="2026-07-03T16:24:00Z">
-        <w:r>
-          <w:t>0.90</w:t>
-        </w:r>
-      </w:ins>
+      <w:r>
+        <w:t>0.90</w:t>
+      </w:r>
       <w:r>
         <w:t>) alpha(.4)</w:t>
       </w:r>
@@ -490,9 +366,6 @@
     <w:p>
       <w:pPr>
         <w:pStyle w:val="Heading3"/>
-        <w:rPr>
-          <w:ins w:id="34" w:author="Matt Sydes" w:date="2026-07-03T17:23:00Z" w16du:dateUtc="2026-07-03T16:23:00Z"/>
-        </w:rPr>
       </w:pPr>
     </w:p>
     <w:p>
@@ -507,34 +380,24 @@
       <w:r>
         <w:t xml:space="preserve">We computed this with the user-written software </w:t>
       </w:r>
-      <w:commentRangeStart w:id="35"/>
-      <w:commentRangeStart w:id="36"/>
       <w:r>
         <w:rPr>
           <w:rFonts w:ascii="Courier New" w:hAnsi="Courier New" w:cs="Courier New"/>
-          <w:rPrChange w:id="37" w:author="Ian White" w:date="2026-07-06T10:36:00Z" w16du:dateUtc="2026-07-06T09:36:00Z">
-            <w:rPr/>
-          </w:rPrChange>
         </w:rPr>
         <w:t>bayes</w:t>
       </w:r>
       <w:r>
         <w:rPr>
           <w:rFonts w:ascii="Courier New" w:hAnsi="Courier New" w:cs="Courier New"/>
-          <w:rPrChange w:id="38" w:author="Ian White" w:date="2026-07-06T10:36:00Z" w16du:dateUtc="2026-07-06T09:36:00Z">
-            <w:rPr/>
-          </w:rPrChange>
         </w:rPr>
         <w:t>power</w:t>
       </w:r>
       <w:r>
         <w:t xml:space="preserve"> (</w:t>
       </w:r>
-      <w:ins w:id="39" w:author="Ian White" w:date="2026-07-06T10:35:00Z" w16du:dateUtc="2026-07-06T09:35:00Z">
-        <w:r>
-          <w:t>based on the methods of Turner et al</w:t>
-        </w:r>
-      </w:ins>
+      <w:r>
+        <w:t>based on the methods of Turner et al</w:t>
+      </w:r>
       <w:r>
         <w:fldChar w:fldCharType="begin"/>
       </w:r>
@@ -554,11 +417,9 @@
       <w:r>
         <w:fldChar w:fldCharType="end"/>
       </w:r>
-      <w:ins w:id="40" w:author="Ian White" w:date="2026-07-06T10:35:00Z" w16du:dateUtc="2026-07-06T09:35:00Z">
-        <w:r>
-          <w:t xml:space="preserve"> and </w:t>
-        </w:r>
-      </w:ins>
+      <w:r>
+        <w:t xml:space="preserve"> and </w:t>
+      </w:r>
       <w:r>
         <w:t xml:space="preserve">available at </w:t>
       </w:r>
@@ -570,24 +431,6 @@
           <w:t>https://github.com/CoRE-CTI/Tailoring</w:t>
         </w:r>
       </w:hyperlink>
-      <w:commentRangeEnd w:id="35"/>
-      <w:r>
-        <w:rPr>
-          <w:rStyle w:val="CommentReference"/>
-          <w:sz w:val="24"/>
-          <w:szCs w:val="22"/>
-        </w:rPr>
-        <w:commentReference w:id="35"/>
-      </w:r>
-      <w:commentRangeEnd w:id="36"/>
-      <w:r>
-        <w:rPr>
-          <w:rStyle w:val="CommentReference"/>
-          <w:sz w:val="24"/>
-          <w:szCs w:val="22"/>
-        </w:rPr>
-        <w:commentReference w:id="36"/>
-      </w:r>
       <w:r>
         <w:t>).</w:t>
       </w:r>
@@ -600,11 +443,9 @@
       <w:r>
         <w:t xml:space="preserve">demonstrates that the total sample size of 1780 </w:t>
       </w:r>
-      <w:ins w:id="41" w:author="Ian White" w:date="2026-07-06T10:49:00Z" w16du:dateUtc="2026-07-06T09:49:00Z">
-        <w:r>
-          <w:t xml:space="preserve">(890+890) </w:t>
-        </w:r>
-      </w:ins>
+      <w:r>
+        <w:t xml:space="preserve">(890+890) </w:t>
+      </w:r>
       <w:r>
         <w:t xml:space="preserve">is enough to give 90% probability </w:t>
       </w:r>
@@ -625,124 +466,49 @@
     <w:p>
       <w:pPr>
         <w:pStyle w:val="Typeface"/>
-        <w:rPr>
-          <w:ins w:id="42" w:author="Ian White" w:date="2026-07-06T10:29:00Z" w16du:dateUtc="2026-07-06T09:29:00Z"/>
-        </w:rPr>
       </w:pPr>
       <w:r>
         <w:t xml:space="preserve">bayespower, n1(890) n0(890) </w:t>
       </w:r>
-      <w:ins w:id="43" w:author="Ian White" w:date="2026-07-06T10:29:00Z" w16du:dateUtc="2026-07-06T09:29:00Z">
-        <w:r>
-          <w:t>///</w:t>
-        </w:r>
-      </w:ins>
+      <w:r>
+        <w:t>///</w:t>
+      </w:r>
     </w:p>
     <w:p>
       <w:pPr>
         <w:pStyle w:val="Typeface"/>
         <w:ind w:left="1440"/>
-        <w:rPr>
-          <w:ins w:id="44" w:author="Ian White" w:date="2026-07-06T10:30:00Z" w16du:dateUtc="2026-07-06T09:30:00Z"/>
-        </w:rPr>
-        <w:pPrChange w:id="45" w:author="Ian White" w:date="2026-07-06T10:52:00Z" w16du:dateUtc="2026-07-06T09:52:00Z">
-          <w:pPr>
-            <w:pStyle w:val="Typeface"/>
-          </w:pPr>
-        </w:pPrChange>
       </w:pPr>
       <w:r>
         <w:t xml:space="preserve">priorspec(ms) </w:t>
       </w:r>
-      <w:ins w:id="46" w:author="Ian White" w:date="2026-07-06T10:30:00Z" w16du:dateUtc="2026-07-06T09:30:00Z">
-        <w:r>
-          <w:t>///</w:t>
-        </w:r>
-      </w:ins>
+      <w:r>
+        <w:t>///</w:t>
+      </w:r>
     </w:p>
     <w:p>
       <w:pPr>
         <w:pStyle w:val="Typeface"/>
         <w:ind w:left="1440"/>
-        <w:rPr>
-          <w:ins w:id="47" w:author="Ian White" w:date="2026-07-06T10:29:00Z" w16du:dateUtc="2026-07-06T09:29:00Z"/>
-        </w:rPr>
-        <w:pPrChange w:id="48" w:author="Ian White" w:date="2026-07-06T10:52:00Z" w16du:dateUtc="2026-07-06T09:52:00Z">
-          <w:pPr>
-            <w:pStyle w:val="Typeface"/>
-          </w:pPr>
-        </w:pPrChange>
       </w:pPr>
       <w:r>
         <w:t>prior1d(</w:t>
       </w:r>
-      <w:del w:id="49" w:author="Matt Sydes" w:date="2026-07-03T17:24:00Z" w16du:dateUtc="2026-07-03T16:24:00Z">
-        <w:r>
-          <w:delText>.55</w:delText>
-        </w:r>
-      </w:del>
-      <w:ins w:id="50" w:author="Matt Sydes" w:date="2026-07-03T17:24:00Z" w16du:dateUtc="2026-07-03T16:24:00Z">
-        <w:r>
-          <w:t>0.55</w:t>
-        </w:r>
-      </w:ins>
-      <w:r>
-        <w:t xml:space="preserve"> </w:t>
-      </w:r>
-      <w:ins w:id="51" w:author="Matt Sydes" w:date="2026-07-03T17:25:00Z" w16du:dateUtc="2026-07-03T16:25:00Z">
-        <w:del w:id="52" w:author="Ian White" w:date="2026-07-06T10:46:00Z" w16du:dateUtc="2026-07-06T09:46:00Z">
-          <w:r>
-            <w:delText>0</w:delText>
-          </w:r>
-        </w:del>
-      </w:ins>
-      <w:del w:id="53" w:author="Ian White" w:date="2026-07-06T10:46:00Z" w16du:dateUtc="2026-07-06T09:46:00Z">
-        <w:r>
-          <w:delText>.</w:delText>
-        </w:r>
-      </w:del>
-      <w:r>
-        <w:t>0</w:t>
-      </w:r>
-      <w:del w:id="54" w:author="Ian White" w:date="2026-07-06T10:46:00Z" w16du:dateUtc="2026-07-06T09:46:00Z">
-        <w:r>
-          <w:delText>01</w:delText>
-        </w:r>
-      </w:del>
-      <w:r>
-        <w:t>) prior0d(</w:t>
-      </w:r>
-      <w:del w:id="55" w:author="Matt Sydes" w:date="2026-07-03T17:23:00Z" w16du:dateUtc="2026-07-03T16:23:00Z">
-        <w:r>
-          <w:delText xml:space="preserve">.5 </w:delText>
-        </w:r>
-      </w:del>
-      <w:ins w:id="56" w:author="Matt Sydes" w:date="2026-07-03T17:23:00Z" w16du:dateUtc="2026-07-03T16:23:00Z">
-        <w:r>
-          <w:t xml:space="preserve">0.50 </w:t>
-        </w:r>
-      </w:ins>
-      <w:del w:id="57" w:author="Ian White" w:date="2026-07-06T10:46:00Z" w16du:dateUtc="2026-07-06T09:46:00Z">
-        <w:r>
-          <w:delText>.</w:delText>
-        </w:r>
-      </w:del>
-      <w:r>
-        <w:t>0</w:t>
-      </w:r>
-      <w:del w:id="58" w:author="Ian White" w:date="2026-07-06T10:46:00Z" w16du:dateUtc="2026-07-06T09:46:00Z">
-        <w:r>
-          <w:delText>01</w:delText>
-        </w:r>
-      </w:del>
-      <w:r>
-        <w:t>)</w:t>
-      </w:r>
-      <w:ins w:id="59" w:author="Ian White" w:date="2026-07-06T10:29:00Z" w16du:dateUtc="2026-07-06T09:29:00Z">
-        <w:r>
-          <w:t xml:space="preserve"> ///</w:t>
-        </w:r>
-      </w:ins>
+      <w:r>
+        <w:t>0.55</w:t>
+      </w:r>
+      <w:r>
+        <w:t xml:space="preserve"> 0) prior0d(</w:t>
+      </w:r>
+      <w:r>
+        <w:t xml:space="preserve">0.50 </w:t>
+      </w:r>
+      <w:r>
+        <w:t>0)</w:t>
+      </w:r>
+      <w:r>
+        <w:t xml:space="preserve"> ///</w:t>
+      </w:r>
       <w:r>
         <w:t xml:space="preserve"> </w:t>
       </w:r>
@@ -751,274 +517,153 @@
       <w:pPr>
         <w:pStyle w:val="Typeface"/>
         <w:ind w:left="1440"/>
-        <w:rPr>
-          <w:ins w:id="60" w:author="Ian White" w:date="2026-07-06T10:30:00Z" w16du:dateUtc="2026-07-06T09:30:00Z"/>
-        </w:rPr>
-        <w:pPrChange w:id="61" w:author="Ian White" w:date="2026-07-06T10:52:00Z" w16du:dateUtc="2026-07-06T09:52:00Z">
-          <w:pPr>
-            <w:pStyle w:val="Typeface"/>
-          </w:pPr>
-        </w:pPrChange>
       </w:pPr>
       <w:r>
         <w:t>prior1a(</w:t>
       </w:r>
-      <w:del w:id="62" w:author="Matt Sydes" w:date="2026-07-03T17:23:00Z" w16du:dateUtc="2026-07-03T16:23:00Z">
-        <w:r>
-          <w:delText xml:space="preserve">.5 </w:delText>
-        </w:r>
-      </w:del>
-      <w:ins w:id="63" w:author="Matt Sydes" w:date="2026-07-03T17:23:00Z" w16du:dateUtc="2026-07-03T16:23:00Z">
-        <w:r>
-          <w:t xml:space="preserve">0.50 </w:t>
-        </w:r>
-      </w:ins>
-      <w:ins w:id="64" w:author="Matt Sydes" w:date="2026-07-03T17:25:00Z" w16du:dateUtc="2026-07-03T16:25:00Z">
-        <w:r>
-          <w:t>0</w:t>
-        </w:r>
-      </w:ins>
+      <w:r>
+        <w:t xml:space="preserve">0.50 </w:t>
+      </w:r>
+      <w:r>
+        <w:t>0</w:t>
+      </w:r>
       <w:r>
         <w:t>.2</w:t>
       </w:r>
-      <w:ins w:id="65" w:author="Ian White" w:date="2026-07-06T10:33:00Z" w16du:dateUtc="2026-07-06T09:33:00Z">
-        <w:r>
-          <w:t>9</w:t>
-        </w:r>
-      </w:ins>
-      <w:del w:id="66" w:author="Ian White" w:date="2026-07-06T10:33:00Z" w16du:dateUtc="2026-07-06T09:33:00Z">
-        <w:r>
-          <w:delText>8867513</w:delText>
-        </w:r>
-      </w:del>
+      <w:r>
+        <w:t>9</w:t>
+      </w:r>
       <w:r>
         <w:t>) prior0a(</w:t>
       </w:r>
-      <w:del w:id="67" w:author="Matt Sydes" w:date="2026-07-03T17:23:00Z" w16du:dateUtc="2026-07-03T16:23:00Z">
-        <w:r>
-          <w:delText xml:space="preserve">.5 </w:delText>
-        </w:r>
-      </w:del>
-      <w:ins w:id="68" w:author="Matt Sydes" w:date="2026-07-03T17:23:00Z" w16du:dateUtc="2026-07-03T16:23:00Z">
-        <w:r>
-          <w:t xml:space="preserve">0.50 </w:t>
-        </w:r>
-      </w:ins>
-      <w:ins w:id="69" w:author="Matt Sydes" w:date="2026-07-03T17:25:00Z" w16du:dateUtc="2026-07-03T16:25:00Z">
-        <w:r>
-          <w:t>0</w:t>
-        </w:r>
-      </w:ins>
+      <w:r>
+        <w:t xml:space="preserve">0.50 </w:t>
+      </w:r>
+      <w:r>
+        <w:t>0</w:t>
+      </w:r>
       <w:r>
         <w:t>.2</w:t>
       </w:r>
-      <w:ins w:id="70" w:author="Ian White" w:date="2026-07-06T10:33:00Z" w16du:dateUtc="2026-07-06T09:33:00Z">
-        <w:r>
-          <w:t>9</w:t>
-        </w:r>
-      </w:ins>
-      <w:del w:id="71" w:author="Ian White" w:date="2026-07-06T10:33:00Z" w16du:dateUtc="2026-07-06T09:33:00Z">
-        <w:r>
-          <w:delText>8867513</w:delText>
-        </w:r>
-      </w:del>
+      <w:r>
+        <w:t>9</w:t>
+      </w:r>
       <w:r>
         <w:t xml:space="preserve">) </w:t>
       </w:r>
-      <w:ins w:id="72" w:author="Ian White" w:date="2026-07-06T10:29:00Z" w16du:dateUtc="2026-07-06T09:29:00Z">
-        <w:r>
-          <w:t>///</w:t>
-        </w:r>
-      </w:ins>
+      <w:r>
+        <w:t>///</w:t>
+      </w:r>
     </w:p>
     <w:p>
       <w:pPr>
         <w:pStyle w:val="Typeface"/>
         <w:ind w:left="1440"/>
-        <w:pPrChange w:id="73" w:author="Ian White" w:date="2026-07-06T10:52:00Z" w16du:dateUtc="2026-07-06T09:52:00Z">
-          <w:pPr>
-            <w:pStyle w:val="Typeface"/>
-          </w:pPr>
-        </w:pPrChange>
       </w:pPr>
       <w:r>
         <w:t>seed(3) criteria(</w:t>
       </w:r>
-      <w:ins w:id="74" w:author="Matt Sydes" w:date="2026-07-03T17:25:00Z" w16du:dateUtc="2026-07-03T16:25:00Z">
-        <w:r>
-          <w:t>0</w:t>
-        </w:r>
-      </w:ins>
+      <w:r>
+        <w:t>0</w:t>
+      </w:r>
       <w:r>
         <w:t xml:space="preserve">.80) </w:t>
       </w:r>
     </w:p>
     <w:p>
-      <w:pPr>
+      <w:r>
+        <w:t>In t</w:t>
+      </w:r>
+      <w:r>
+        <w:t>his command</w:t>
+      </w:r>
+      <w:r>
+        <w:t xml:space="preserve">, </w:t>
+      </w:r>
+      <w:r>
         <w:rPr>
-          <w:ins w:id="75" w:author="Ian White" w:date="2026-07-06T10:34:00Z" w16du:dateUtc="2026-07-06T09:34:00Z"/>
+          <w:rFonts w:ascii="Courier New" w:hAnsi="Courier New" w:cs="Courier New"/>
         </w:rPr>
-      </w:pPr>
-      <w:ins w:id="76" w:author="Ian White" w:date="2026-07-06T10:37:00Z" w16du:dateUtc="2026-07-06T09:37:00Z">
-        <w:r>
-          <w:t>In t</w:t>
-        </w:r>
-        <w:r>
-          <w:t>his command</w:t>
-        </w:r>
-      </w:ins>
-      <w:ins w:id="77" w:author="Ian White" w:date="2026-07-06T10:38:00Z" w16du:dateUtc="2026-07-06T09:38:00Z">
-        <w:r>
-          <w:t xml:space="preserve">, </w:t>
-        </w:r>
-        <w:r>
-          <w:rPr>
-            <w:rFonts w:ascii="Courier New" w:hAnsi="Courier New" w:cs="Courier New"/>
-            <w:rPrChange w:id="78" w:author="Ian White" w:date="2026-07-06T10:47:00Z" w16du:dateUtc="2026-07-06T09:47:00Z">
-              <w:rPr/>
-            </w:rPrChange>
-          </w:rPr>
-          <w:t>priorspec(ms)</w:t>
-        </w:r>
-        <w:r>
-          <w:t xml:space="preserve"> specifies that the design and analysis priors for the true outcome probabilities in the two arms will be specified by their mean and standard deviation</w:t>
-        </w:r>
-      </w:ins>
-      <w:ins w:id="79" w:author="Ian White" w:date="2026-07-06T10:47:00Z" w16du:dateUtc="2026-07-06T09:47:00Z">
-        <w:r>
-          <w:t xml:space="preserve"> (SD)</w:t>
-        </w:r>
-      </w:ins>
-      <w:ins w:id="80" w:author="Ian White" w:date="2026-07-06T10:38:00Z" w16du:dateUtc="2026-07-06T09:38:00Z">
-        <w:r>
-          <w:t xml:space="preserve">. The design priors specified by </w:t>
-        </w:r>
-        <w:r>
-          <w:rPr>
-            <w:rFonts w:ascii="Courier New" w:hAnsi="Courier New" w:cs="Courier New"/>
-            <w:rPrChange w:id="81" w:author="Ian White" w:date="2026-07-06T10:48:00Z" w16du:dateUtc="2026-07-06T09:48:00Z">
-              <w:rPr/>
-            </w:rPrChange>
-          </w:rPr>
-          <w:t>prior1d()</w:t>
-        </w:r>
-        <w:r>
-          <w:t xml:space="preserve"> a</w:t>
-        </w:r>
-      </w:ins>
-      <w:ins w:id="82" w:author="Ian White" w:date="2026-07-06T10:46:00Z" w16du:dateUtc="2026-07-06T09:46:00Z">
-        <w:r>
-          <w:t>n</w:t>
-        </w:r>
-      </w:ins>
-      <w:ins w:id="83" w:author="Ian White" w:date="2026-07-06T10:38:00Z" w16du:dateUtc="2026-07-06T09:38:00Z">
-        <w:r>
-          <w:t xml:space="preserve">d </w:t>
-        </w:r>
-        <w:r>
-          <w:rPr>
-            <w:rFonts w:ascii="Courier New" w:hAnsi="Courier New" w:cs="Courier New"/>
-            <w:rPrChange w:id="84" w:author="Ian White" w:date="2026-07-06T10:48:00Z" w16du:dateUtc="2026-07-06T09:48:00Z">
-              <w:rPr/>
-            </w:rPrChange>
-          </w:rPr>
-          <w:t>prior</w:t>
-        </w:r>
-      </w:ins>
-      <w:ins w:id="85" w:author="Ian White" w:date="2026-07-06T10:39:00Z" w16du:dateUtc="2026-07-06T09:39:00Z">
-        <w:r>
-          <w:rPr>
-            <w:rFonts w:ascii="Courier New" w:hAnsi="Courier New" w:cs="Courier New"/>
-            <w:rPrChange w:id="86" w:author="Ian White" w:date="2026-07-06T10:48:00Z" w16du:dateUtc="2026-07-06T09:48:00Z">
-              <w:rPr/>
-            </w:rPrChange>
-          </w:rPr>
-          <w:t>0d()</w:t>
-        </w:r>
-        <w:r>
-          <w:t xml:space="preserve"> are given </w:t>
-        </w:r>
-      </w:ins>
-      <w:ins w:id="87" w:author="Ian White" w:date="2026-07-06T10:47:00Z" w16du:dateUtc="2026-07-06T09:47:00Z">
-        <w:r>
-          <w:t xml:space="preserve">zero SD, indicating that the outcome probabilities are fixed (as in the frequentist calculation). </w:t>
-        </w:r>
-      </w:ins>
-      <w:ins w:id="88" w:author="Ian White" w:date="2026-07-06T10:34:00Z" w16du:dateUtc="2026-07-06T09:34:00Z">
-        <w:r>
-          <w:t>The n</w:t>
-        </w:r>
-        <w:r>
-          <w:t xml:space="preserve">on-informative analysis priors </w:t>
-        </w:r>
-      </w:ins>
-      <w:ins w:id="89" w:author="Ian White" w:date="2026-07-06T10:48:00Z" w16du:dateUtc="2026-07-06T09:48:00Z">
-        <w:r>
-          <w:t xml:space="preserve">specified by </w:t>
-        </w:r>
-        <w:r>
-          <w:rPr>
-            <w:rFonts w:ascii="Courier New" w:hAnsi="Courier New" w:cs="Courier New"/>
-          </w:rPr>
-          <w:t>prior1</w:t>
-        </w:r>
-        <w:r>
-          <w:rPr>
-            <w:rFonts w:ascii="Courier New" w:hAnsi="Courier New" w:cs="Courier New"/>
-          </w:rPr>
-          <w:t>a</w:t>
-        </w:r>
-        <w:r>
-          <w:rPr>
-            <w:rFonts w:ascii="Courier New" w:hAnsi="Courier New" w:cs="Courier New"/>
-          </w:rPr>
-          <w:t>()</w:t>
-        </w:r>
-        <w:r>
-          <w:t xml:space="preserve"> and </w:t>
-        </w:r>
-        <w:r>
-          <w:rPr>
-            <w:rFonts w:ascii="Courier New" w:hAnsi="Courier New" w:cs="Courier New"/>
-          </w:rPr>
-          <w:t>prior0</w:t>
-        </w:r>
-        <w:r>
-          <w:rPr>
-            <w:rFonts w:ascii="Courier New" w:hAnsi="Courier New" w:cs="Courier New"/>
-          </w:rPr>
-          <w:t>a</w:t>
-        </w:r>
-        <w:r>
-          <w:rPr>
-            <w:rFonts w:ascii="Courier New" w:hAnsi="Courier New" w:cs="Courier New"/>
-          </w:rPr>
-          <w:t>()</w:t>
-        </w:r>
-        <w:r>
-          <w:t xml:space="preserve"> </w:t>
-        </w:r>
-      </w:ins>
-      <w:ins w:id="90" w:author="Ian White" w:date="2026-07-06T10:34:00Z" w16du:dateUtc="2026-07-06T09:34:00Z">
-        <w:r>
-          <w:t xml:space="preserve">are </w:t>
-        </w:r>
-      </w:ins>
-      <w:ins w:id="91" w:author="Ian White" w:date="2026-07-06T10:36:00Z" w16du:dateUtc="2026-07-06T09:36:00Z">
-        <w:r>
-          <w:t>taken as beta(1,1)</w:t>
-        </w:r>
-      </w:ins>
-      <w:ins w:id="92" w:author="Ian White" w:date="2026-07-06T10:48:00Z" w16du:dateUtc="2026-07-06T09:48:00Z">
-        <w:r>
-          <w:t>,</w:t>
-        </w:r>
-      </w:ins>
-      <w:ins w:id="93" w:author="Ian White" w:date="2026-07-06T10:36:00Z" w16du:dateUtc="2026-07-06T09:36:00Z">
-        <w:r>
-          <w:t xml:space="preserve"> which has mean 0.50 and standard deviation 0.29.</w:t>
-        </w:r>
-      </w:ins>
+        <w:t>priorspec(ms)</w:t>
+      </w:r>
+      <w:r>
+        <w:t xml:space="preserve"> specifies that the design and analysis priors for the true outcome probabilities in the two arms will be specified by their mean and standard deviation (SD). The design priors specified by </w:t>
+      </w:r>
+      <w:r>
+        <w:rPr>
+          <w:rFonts w:ascii="Courier New" w:hAnsi="Courier New" w:cs="Courier New"/>
+        </w:rPr>
+        <w:t>prior1d()</w:t>
+      </w:r>
+      <w:r>
+        <w:t xml:space="preserve"> and </w:t>
+      </w:r>
+      <w:r>
+        <w:rPr>
+          <w:rFonts w:ascii="Courier New" w:hAnsi="Courier New" w:cs="Courier New"/>
+        </w:rPr>
+        <w:t>prior0d()</w:t>
+      </w:r>
+      <w:r>
+        <w:t xml:space="preserve"> are given zero SD, indicating that the outcome probabilities are fixed (as in the frequentist calculation). </w:t>
+      </w:r>
+      <w:r>
+        <w:t xml:space="preserve">The non-informative analysis priors </w:t>
+      </w:r>
+      <w:r>
+        <w:t xml:space="preserve">specified by </w:t>
+      </w:r>
+      <w:r>
+        <w:rPr>
+          <w:rFonts w:ascii="Courier New" w:hAnsi="Courier New" w:cs="Courier New"/>
+        </w:rPr>
+        <w:t>prior1</w:t>
+      </w:r>
+      <w:r>
+        <w:rPr>
+          <w:rFonts w:ascii="Courier New" w:hAnsi="Courier New" w:cs="Courier New"/>
+        </w:rPr>
+        <w:t>a</w:t>
+      </w:r>
+      <w:r>
+        <w:rPr>
+          <w:rFonts w:ascii="Courier New" w:hAnsi="Courier New" w:cs="Courier New"/>
+        </w:rPr>
+        <w:t>()</w:t>
+      </w:r>
+      <w:r>
+        <w:t xml:space="preserve"> and </w:t>
+      </w:r>
+      <w:r>
+        <w:rPr>
+          <w:rFonts w:ascii="Courier New" w:hAnsi="Courier New" w:cs="Courier New"/>
+        </w:rPr>
+        <w:t>prior0</w:t>
+      </w:r>
+      <w:r>
+        <w:rPr>
+          <w:rFonts w:ascii="Courier New" w:hAnsi="Courier New" w:cs="Courier New"/>
+        </w:rPr>
+        <w:t>a</w:t>
+      </w:r>
+      <w:r>
+        <w:rPr>
+          <w:rFonts w:ascii="Courier New" w:hAnsi="Courier New" w:cs="Courier New"/>
+        </w:rPr>
+        <w:t>()</w:t>
+      </w:r>
+      <w:r>
+        <w:t xml:space="preserve"> </w:t>
+      </w:r>
+      <w:r>
+        <w:t>are taken as beta(1,1)</w:t>
+      </w:r>
+      <w:r>
+        <w:t>,</w:t>
+      </w:r>
+      <w:r>
+        <w:t xml:space="preserve"> which has mean 0.50 and standard deviation 0.29.</w:t>
+      </w:r>
     </w:p>
     <w:p>
       <w:r>
@@ -1036,11 +681,9 @@
       <w:r>
         <w:t xml:space="preserve">564 </w:t>
       </w:r>
-      <w:ins w:id="94" w:author="Ian White" w:date="2026-07-06T10:49:00Z" w16du:dateUtc="2026-07-06T09:49:00Z">
-        <w:r>
-          <w:t xml:space="preserve">(282+282) </w:t>
-        </w:r>
-      </w:ins>
+      <w:r>
+        <w:t xml:space="preserve">(282+282) </w:t>
+      </w:r>
       <w:r>
         <w:t>is enough to give 90% probability that the posterior probability of benefit</w:t>
       </w:r>
@@ -1060,9 +703,6 @@
     <w:p>
       <w:pPr>
         <w:pStyle w:val="Typeface"/>
-        <w:rPr>
-          <w:ins w:id="95" w:author="Ian White" w:date="2026-07-06T10:29:00Z" w16du:dateUtc="2026-07-06T09:29:00Z"/>
-        </w:rPr>
       </w:pPr>
       <w:r>
         <w:t>bayespower, n1(</w:t>
@@ -1079,219 +719,108 @@
       <w:r>
         <w:t xml:space="preserve">) </w:t>
       </w:r>
-      <w:ins w:id="96" w:author="Ian White" w:date="2026-07-06T10:29:00Z" w16du:dateUtc="2026-07-06T09:29:00Z">
-        <w:r>
-          <w:t>///</w:t>
-        </w:r>
-      </w:ins>
+      <w:r>
+        <w:t>///</w:t>
+      </w:r>
     </w:p>
     <w:p>
       <w:pPr>
         <w:pStyle w:val="Typeface"/>
         <w:ind w:left="1440"/>
-        <w:rPr>
-          <w:ins w:id="97" w:author="Ian White" w:date="2026-07-06T10:48:00Z" w16du:dateUtc="2026-07-06T09:48:00Z"/>
-        </w:rPr>
-        <w:pPrChange w:id="98" w:author="Ian White" w:date="2026-07-06T10:52:00Z" w16du:dateUtc="2026-07-06T09:52:00Z">
-          <w:pPr>
-            <w:pStyle w:val="Typeface"/>
-          </w:pPr>
-        </w:pPrChange>
       </w:pPr>
       <w:r>
         <w:t xml:space="preserve">priorspec(ms) </w:t>
       </w:r>
-      <w:ins w:id="99" w:author="Ian White" w:date="2026-07-06T10:48:00Z" w16du:dateUtc="2026-07-06T09:48:00Z">
-        <w:r>
-          <w:t>///</w:t>
-        </w:r>
-      </w:ins>
+      <w:r>
+        <w:t>///</w:t>
+      </w:r>
     </w:p>
     <w:p>
       <w:pPr>
         <w:pStyle w:val="Typeface"/>
         <w:ind w:left="1440"/>
-        <w:rPr>
-          <w:ins w:id="100" w:author="Ian White" w:date="2026-07-06T10:29:00Z" w16du:dateUtc="2026-07-06T09:29:00Z"/>
-        </w:rPr>
-        <w:pPrChange w:id="101" w:author="Ian White" w:date="2026-07-06T10:52:00Z" w16du:dateUtc="2026-07-06T09:52:00Z">
-          <w:pPr>
-            <w:pStyle w:val="Typeface"/>
-          </w:pPr>
-        </w:pPrChange>
       </w:pPr>
       <w:r>
         <w:t>prior1d(</w:t>
       </w:r>
-      <w:del w:id="102" w:author="Matt Sydes" w:date="2026-07-03T17:24:00Z" w16du:dateUtc="2026-07-03T16:24:00Z">
-        <w:r>
-          <w:delText>.55</w:delText>
-        </w:r>
-      </w:del>
-      <w:ins w:id="103" w:author="Matt Sydes" w:date="2026-07-03T17:24:00Z" w16du:dateUtc="2026-07-03T16:24:00Z">
-        <w:r>
-          <w:t>0.55</w:t>
-        </w:r>
-      </w:ins>
+      <w:r>
+        <w:t>0.55</w:t>
+      </w:r>
       <w:r>
         <w:t xml:space="preserve"> </w:t>
       </w:r>
-      <w:ins w:id="104" w:author="Matt Sydes" w:date="2026-07-03T17:25:00Z" w16du:dateUtc="2026-07-03T16:25:00Z">
-        <w:r>
-          <w:t>0</w:t>
-        </w:r>
-        <w:del w:id="105" w:author="Ian White" w:date="2026-07-06T10:46:00Z" w16du:dateUtc="2026-07-06T09:46:00Z">
-          <w:r>
-            <w:delText>.001</w:delText>
-          </w:r>
-        </w:del>
-      </w:ins>
-      <w:del w:id="106" w:author="Matt Sydes" w:date="2026-07-03T17:25:00Z" w16du:dateUtc="2026-07-03T16:25:00Z">
-        <w:r>
-          <w:delText>.001</w:delText>
-        </w:r>
-      </w:del>
+      <w:r>
+        <w:t>0</w:t>
+      </w:r>
       <w:r>
         <w:t>) prior0d(</w:t>
       </w:r>
-      <w:del w:id="107" w:author="Matt Sydes" w:date="2026-07-03T17:23:00Z" w16du:dateUtc="2026-07-03T16:23:00Z">
-        <w:r>
-          <w:delText xml:space="preserve">.5 </w:delText>
-        </w:r>
-      </w:del>
-      <w:ins w:id="108" w:author="Matt Sydes" w:date="2026-07-03T17:23:00Z" w16du:dateUtc="2026-07-03T16:23:00Z">
-        <w:r>
-          <w:t xml:space="preserve">0.50 </w:t>
-        </w:r>
-      </w:ins>
-      <w:ins w:id="109" w:author="Matt Sydes" w:date="2026-07-03T17:24:00Z" w16du:dateUtc="2026-07-03T16:24:00Z">
-        <w:r>
-          <w:t>0</w:t>
-        </w:r>
-      </w:ins>
-      <w:ins w:id="110" w:author="Matt Sydes" w:date="2026-07-03T17:25:00Z" w16du:dateUtc="2026-07-03T16:25:00Z">
-        <w:del w:id="111" w:author="Ian White" w:date="2026-07-06T10:46:00Z" w16du:dateUtc="2026-07-06T09:46:00Z">
-          <w:r>
-            <w:delText>.001</w:delText>
-          </w:r>
-        </w:del>
-      </w:ins>
-      <w:del w:id="112" w:author="Matt Sydes" w:date="2026-07-03T17:25:00Z" w16du:dateUtc="2026-07-03T16:25:00Z">
-        <w:r>
-          <w:delText>.001</w:delText>
-        </w:r>
-      </w:del>
+      <w:r>
+        <w:t xml:space="preserve">0.50 </w:t>
+      </w:r>
+      <w:r>
+        <w:t>0</w:t>
+      </w:r>
       <w:r>
         <w:t xml:space="preserve">) </w:t>
       </w:r>
-      <w:ins w:id="113" w:author="Ian White" w:date="2026-07-06T10:29:00Z" w16du:dateUtc="2026-07-06T09:29:00Z">
-        <w:r>
-          <w:t>///</w:t>
-        </w:r>
-      </w:ins>
+      <w:r>
+        <w:t>///</w:t>
+      </w:r>
     </w:p>
     <w:p>
       <w:pPr>
         <w:pStyle w:val="Typeface"/>
         <w:ind w:left="1440"/>
-        <w:rPr>
-          <w:ins w:id="114" w:author="Ian White" w:date="2026-07-06T10:30:00Z" w16du:dateUtc="2026-07-06T09:30:00Z"/>
-        </w:rPr>
-        <w:pPrChange w:id="115" w:author="Ian White" w:date="2026-07-06T10:52:00Z" w16du:dateUtc="2026-07-06T09:52:00Z">
-          <w:pPr>
-            <w:pStyle w:val="Typeface"/>
-          </w:pPr>
-        </w:pPrChange>
       </w:pPr>
       <w:r>
         <w:t>prior1a(</w:t>
       </w:r>
-      <w:del w:id="116" w:author="Matt Sydes" w:date="2026-07-03T17:23:00Z" w16du:dateUtc="2026-07-03T16:23:00Z">
-        <w:r>
-          <w:delText xml:space="preserve">.5 </w:delText>
-        </w:r>
-      </w:del>
-      <w:ins w:id="117" w:author="Matt Sydes" w:date="2026-07-03T17:23:00Z" w16du:dateUtc="2026-07-03T16:23:00Z">
-        <w:r>
-          <w:t xml:space="preserve">0.50 </w:t>
-        </w:r>
-      </w:ins>
-      <w:ins w:id="118" w:author="Matt Sydes" w:date="2026-07-03T17:25:00Z" w16du:dateUtc="2026-07-03T16:25:00Z">
-        <w:r>
-          <w:t>0</w:t>
-        </w:r>
-      </w:ins>
+      <w:r>
+        <w:t xml:space="preserve">0.50 </w:t>
+      </w:r>
+      <w:r>
+        <w:t>0</w:t>
+      </w:r>
       <w:r>
         <w:t>.2</w:t>
       </w:r>
-      <w:ins w:id="119" w:author="Ian White" w:date="2026-07-06T10:33:00Z" w16du:dateUtc="2026-07-06T09:33:00Z">
-        <w:r>
-          <w:t>9</w:t>
-        </w:r>
-      </w:ins>
-      <w:del w:id="120" w:author="Ian White" w:date="2026-07-06T10:33:00Z" w16du:dateUtc="2026-07-06T09:33:00Z">
-        <w:r>
-          <w:delText>8867513</w:delText>
-        </w:r>
-      </w:del>
+      <w:r>
+        <w:t>9</w:t>
+      </w:r>
       <w:r>
         <w:t>) prior0a(</w:t>
       </w:r>
-      <w:del w:id="121" w:author="Matt Sydes" w:date="2026-07-03T17:23:00Z" w16du:dateUtc="2026-07-03T16:23:00Z">
-        <w:r>
-          <w:delText xml:space="preserve">.5 </w:delText>
-        </w:r>
-      </w:del>
-      <w:ins w:id="122" w:author="Matt Sydes" w:date="2026-07-03T17:23:00Z" w16du:dateUtc="2026-07-03T16:23:00Z">
-        <w:r>
-          <w:t xml:space="preserve">0.50 </w:t>
-        </w:r>
-      </w:ins>
-      <w:ins w:id="123" w:author="Matt Sydes" w:date="2026-07-03T17:25:00Z" w16du:dateUtc="2026-07-03T16:25:00Z">
-        <w:r>
-          <w:t>0</w:t>
-        </w:r>
-      </w:ins>
+      <w:r>
+        <w:t xml:space="preserve">0.50 </w:t>
+      </w:r>
+      <w:r>
+        <w:t>0</w:t>
+      </w:r>
       <w:r>
         <w:t>.2</w:t>
       </w:r>
-      <w:ins w:id="124" w:author="Ian White" w:date="2026-07-06T10:33:00Z" w16du:dateUtc="2026-07-06T09:33:00Z">
-        <w:r>
-          <w:t>9</w:t>
-        </w:r>
-      </w:ins>
-      <w:del w:id="125" w:author="Ian White" w:date="2026-07-06T10:33:00Z" w16du:dateUtc="2026-07-06T09:33:00Z">
-        <w:r>
-          <w:delText>8867513</w:delText>
-        </w:r>
-      </w:del>
+      <w:r>
+        <w:t>9</w:t>
+      </w:r>
       <w:r>
         <w:t xml:space="preserve">) </w:t>
       </w:r>
-      <w:ins w:id="126" w:author="Ian White" w:date="2026-07-06T10:30:00Z" w16du:dateUtc="2026-07-06T09:30:00Z">
-        <w:r>
-          <w:t>///</w:t>
-        </w:r>
-      </w:ins>
+      <w:r>
+        <w:t>///</w:t>
+      </w:r>
     </w:p>
     <w:p>
       <w:pPr>
         <w:pStyle w:val="Typeface"/>
         <w:ind w:left="1440"/>
-        <w:pPrChange w:id="127" w:author="Ian White" w:date="2026-07-06T10:52:00Z" w16du:dateUtc="2026-07-06T09:52:00Z">
-          <w:pPr>
-            <w:pStyle w:val="Typeface"/>
-          </w:pPr>
-        </w:pPrChange>
       </w:pPr>
       <w:r>
         <w:t>seed(3) criteria(</w:t>
       </w:r>
-      <w:ins w:id="128" w:author="Matt Sydes" w:date="2026-07-03T17:25:00Z" w16du:dateUtc="2026-07-03T16:25:00Z">
-        <w:r>
-          <w:t>0</w:t>
-        </w:r>
-      </w:ins>
+      <w:r>
+        <w:t>0</w:t>
+      </w:r>
       <w:r>
         <w:t xml:space="preserve">.80) </w:t>
       </w:r>
@@ -1299,9 +828,6 @@
     <w:p>
       <w:pPr>
         <w:pStyle w:val="Heading3"/>
-        <w:rPr>
-          <w:ins w:id="129" w:author="Matt Sydes" w:date="2026-07-03T17:23:00Z" w16du:dateUtc="2026-07-03T16:23:00Z"/>
-        </w:rPr>
       </w:pPr>
     </w:p>
     <w:p>
@@ -1326,39 +852,16 @@
         </w:numPr>
       </w:pPr>
       <w:r>
-        <w:t>I</w:t>
-      </w:r>
-      <w:r>
-        <w:t>dentifying the better treatment based on point estimate alone</w:t>
-      </w:r>
-      <w:r>
-        <w:t xml:space="preserve"> is equivalent to testing at a highly non-standard </w:t>
-      </w:r>
-      <w:commentRangeStart w:id="130"/>
-      <w:commentRangeStart w:id="131"/>
-      <w:r>
-        <w:t>50% one-sided level</w:t>
-      </w:r>
-      <w:commentRangeEnd w:id="130"/>
-      <w:r>
-        <w:rPr>
-          <w:rStyle w:val="CommentReference"/>
-          <w:sz w:val="24"/>
-          <w:szCs w:val="22"/>
-        </w:rPr>
-        <w:commentReference w:id="130"/>
-      </w:r>
-      <w:commentRangeEnd w:id="131"/>
-      <w:r>
-        <w:rPr>
-          <w:rStyle w:val="CommentReference"/>
-          <w:sz w:val="24"/>
-          <w:szCs w:val="22"/>
-        </w:rPr>
-        <w:commentReference w:id="131"/>
-      </w:r>
-      <w:r>
-        <w:t xml:space="preserve">. So the </w:t>
+        <w:t xml:space="preserve">Decision theory proposes using the better treatment, regardless of the significance level. However, standard sample size software is based on significance levels. We use a trick to link these two approaches. Suppose treatment A is truly better, and we do a one-sided test of the null hypothesis that treatments are equal against the alternative that A is better. In this test, the one-sided p-value is below 0.5 if and only if </w:t>
+      </w:r>
+      <w:r>
+        <w:t xml:space="preserve">the estimated treatment difference </w:t>
+      </w:r>
+      <w:r>
+        <w:t xml:space="preserve">favours A. </w:t>
+      </w:r>
+      <w:r>
+        <w:t xml:space="preserve">So the </w:t>
       </w:r>
       <w:r>
         <w:t xml:space="preserve">probability of correctly identifying the better treatment </w:t>
@@ -1367,7 +870,13 @@
         <w:t>equals</w:t>
       </w:r>
       <w:r>
-        <w:t xml:space="preserve"> the power from a standard sample size calculation with 50% one-sided </w:t>
+        <w:t xml:space="preserve"> the power from a standard sample size calculation with </w:t>
+      </w:r>
+      <w:r>
+        <w:t xml:space="preserve">a highly non-standard </w:t>
+      </w:r>
+      <w:r>
+        <w:t xml:space="preserve">50% one-sided </w:t>
       </w:r>
       <w:r>
         <w:t>significance</w:t>
@@ -1430,6 +939,1110 @@
     <w:p>
       <w:pPr>
         <w:pStyle w:val="ListParagraph"/>
+        <w:ind w:left="360"/>
+        <w:rPr>
+          <w:rFonts w:eastAsiaTheme="minorEastAsia"/>
+        </w:rPr>
+      </w:pPr>
+      <w:r>
+        <w:t xml:space="preserve">A mathematical explanation follows. Let </w:t>
+      </w:r>
+      <m:oMath>
+        <m:sSub>
+          <m:sSubPr>
+            <m:ctrlPr>
+              <w:rPr>
+                <w:rFonts w:ascii="Cambria Math" w:hAnsi="Cambria Math"/>
+                <w:i/>
+              </w:rPr>
+            </m:ctrlPr>
+          </m:sSubPr>
+          <m:e>
+            <m:r>
+              <w:rPr>
+                <w:rFonts w:ascii="Cambria Math" w:hAnsi="Cambria Math"/>
+              </w:rPr>
+              <m:t>p</m:t>
+            </m:r>
+          </m:e>
+          <m:sub>
+            <m:r>
+              <w:rPr>
+                <w:rFonts w:ascii="Cambria Math" w:hAnsi="Cambria Math"/>
+              </w:rPr>
+              <m:t>A</m:t>
+            </m:r>
+          </m:sub>
+        </m:sSub>
+      </m:oMath>
+      <w:r>
+        <w:t xml:space="preserve">and </w:t>
+      </w:r>
+      <m:oMath>
+        <m:sSub>
+          <m:sSubPr>
+            <m:ctrlPr>
+              <w:rPr>
+                <w:rFonts w:ascii="Cambria Math" w:hAnsi="Cambria Math"/>
+                <w:i/>
+              </w:rPr>
+            </m:ctrlPr>
+          </m:sSubPr>
+          <m:e>
+            <m:r>
+              <w:rPr>
+                <w:rFonts w:ascii="Cambria Math" w:hAnsi="Cambria Math"/>
+              </w:rPr>
+              <m:t>p</m:t>
+            </m:r>
+          </m:e>
+          <m:sub>
+            <m:r>
+              <w:rPr>
+                <w:rFonts w:ascii="Cambria Math" w:hAnsi="Cambria Math"/>
+              </w:rPr>
+              <m:t>B</m:t>
+            </m:r>
+          </m:sub>
+        </m:sSub>
+      </m:oMath>
+      <w:r>
+        <w:t xml:space="preserve"> be the probabilities of the adverse outcome on treatments A and B respectively, and suppose </w:t>
+      </w:r>
+      <m:oMath>
+        <m:sSub>
+          <m:sSubPr>
+            <m:ctrlPr>
+              <w:rPr>
+                <w:rFonts w:ascii="Cambria Math" w:hAnsi="Cambria Math"/>
+                <w:i/>
+              </w:rPr>
+            </m:ctrlPr>
+          </m:sSubPr>
+          <m:e>
+            <m:r>
+              <w:rPr>
+                <w:rFonts w:ascii="Cambria Math" w:hAnsi="Cambria Math"/>
+              </w:rPr>
+              <m:t>p</m:t>
+            </m:r>
+          </m:e>
+          <m:sub>
+            <m:r>
+              <w:rPr>
+                <w:rFonts w:ascii="Cambria Math" w:hAnsi="Cambria Math"/>
+              </w:rPr>
+              <m:t>A</m:t>
+            </m:r>
+          </m:sub>
+        </m:sSub>
+        <m:r>
+          <w:rPr>
+            <w:rFonts w:ascii="Cambria Math" w:hAnsi="Cambria Math"/>
+          </w:rPr>
+          <m:t>&lt;</m:t>
+        </m:r>
+        <m:sSub>
+          <m:sSubPr>
+            <m:ctrlPr>
+              <w:rPr>
+                <w:rFonts w:ascii="Cambria Math" w:hAnsi="Cambria Math"/>
+                <w:i/>
+              </w:rPr>
+            </m:ctrlPr>
+          </m:sSubPr>
+          <m:e>
+            <m:r>
+              <w:rPr>
+                <w:rFonts w:ascii="Cambria Math" w:hAnsi="Cambria Math"/>
+              </w:rPr>
+              <m:t>p</m:t>
+            </m:r>
+          </m:e>
+          <m:sub>
+            <m:r>
+              <w:rPr>
+                <w:rFonts w:ascii="Cambria Math" w:hAnsi="Cambria Math"/>
+              </w:rPr>
+              <m:t>B</m:t>
+            </m:r>
+          </m:sub>
+        </m:sSub>
+      </m:oMath>
+      <w:r>
+        <w:t xml:space="preserve">. </w:t>
+      </w:r>
+      <w:r>
+        <w:t xml:space="preserve">The </w:t>
+      </w:r>
+      <w:r>
+        <w:t>table shows the probabilities of adverse outcome under various</w:t>
+      </w:r>
+      <w:r>
+        <w:t xml:space="preserve"> treatment</w:t>
+      </w:r>
+      <w:r>
+        <w:t xml:space="preserve"> settings. </w:t>
+      </w:r>
+    </w:p>
+    <w:tbl>
+      <w:tblPr>
+        <w:tblStyle w:val="GridTable4"/>
+        <w:tblW w:w="4612" w:type="pct"/>
+        <w:tblInd w:w="353" w:type="dxa"/>
+        <w:tblLook w:val="06A0" w:firstRow="1" w:lastRow="0" w:firstColumn="1" w:lastColumn="0" w:noHBand="1" w:noVBand="1"/>
+      </w:tblPr>
+      <w:tblGrid>
+        <w:gridCol w:w="4394"/>
+        <w:gridCol w:w="3922"/>
+      </w:tblGrid>
+      <w:tr>
+        <w:trPr>
+          <w:cnfStyle w:val="100000000000" w:firstRow="1" w:lastRow="0" w:firstColumn="0" w:lastColumn="0" w:oddVBand="0" w:evenVBand="0" w:oddHBand="0" w:evenHBand="0" w:firstRowFirstColumn="0" w:firstRowLastColumn="0" w:lastRowFirstColumn="0" w:lastRowLastColumn="0"/>
+        </w:trPr>
+        <w:tc>
+          <w:tcPr>
+            <w:cnfStyle w:val="001000000000" w:firstRow="0" w:lastRow="0" w:firstColumn="1" w:lastColumn="0" w:oddVBand="0" w:evenVBand="0" w:oddHBand="0" w:evenHBand="0" w:firstRowFirstColumn="0" w:firstRowLastColumn="0" w:lastRowFirstColumn="0" w:lastRowLastColumn="0"/>
+            <w:tcW w:w="2642" w:type="pct"/>
+          </w:tcPr>
+          <w:p>
+            <w:pPr>
+              <w:pStyle w:val="ListParagraph"/>
+              <w:keepNext/>
+              <w:ind w:left="0"/>
+            </w:pPr>
+            <w:r>
+              <w:lastRenderedPageBreak/>
+              <w:t>Treatment</w:t>
+            </w:r>
+          </w:p>
+        </w:tc>
+        <w:tc>
+          <w:tcPr>
+            <w:tcW w:w="2358" w:type="pct"/>
+          </w:tcPr>
+          <w:p>
+            <w:pPr>
+              <w:pStyle w:val="ListParagraph"/>
+              <w:keepNext/>
+              <w:ind w:left="0"/>
+              <w:jc w:val="center"/>
+              <w:cnfStyle w:val="100000000000" w:firstRow="1" w:lastRow="0" w:firstColumn="0" w:lastColumn="0" w:oddVBand="0" w:evenVBand="0" w:oddHBand="0" w:evenHBand="0" w:firstRowFirstColumn="0" w:firstRowLastColumn="0" w:lastRowFirstColumn="0" w:lastRowLastColumn="0"/>
+            </w:pPr>
+            <w:r>
+              <w:t>Probability of adverse outcome</w:t>
+            </w:r>
+          </w:p>
+        </w:tc>
+      </w:tr>
+      <w:tr>
+        <w:tc>
+          <w:tcPr>
+            <w:cnfStyle w:val="001000000000" w:firstRow="0" w:lastRow="0" w:firstColumn="1" w:lastColumn="0" w:oddVBand="0" w:evenVBand="0" w:oddHBand="0" w:evenHBand="0" w:firstRowFirstColumn="0" w:firstRowLastColumn="0" w:lastRowFirstColumn="0" w:lastRowLastColumn="0"/>
+            <w:tcW w:w="2642" w:type="pct"/>
+          </w:tcPr>
+          <w:p>
+            <w:pPr>
+              <w:pStyle w:val="ListParagraph"/>
+              <w:keepNext/>
+              <w:ind w:left="0"/>
+            </w:pPr>
+            <w:r>
+              <w:t>Use A (</w:t>
+            </w:r>
+            <w:r>
+              <w:t>perfect knowledge</w:t>
+            </w:r>
+            <w:r>
+              <w:t>)</w:t>
+            </w:r>
+          </w:p>
+        </w:tc>
+        <w:tc>
+          <w:tcPr>
+            <w:tcW w:w="2358" w:type="pct"/>
+          </w:tcPr>
+          <w:p>
+            <w:pPr>
+              <w:pStyle w:val="ListParagraph"/>
+              <w:keepNext/>
+              <w:ind w:left="0"/>
+              <w:cnfStyle w:val="000000000000" w:firstRow="0" w:lastRow="0" w:firstColumn="0" w:lastColumn="0" w:oddVBand="0" w:evenVBand="0" w:oddHBand="0" w:evenHBand="0" w:firstRowFirstColumn="0" w:firstRowLastColumn="0" w:lastRowFirstColumn="0" w:lastRowLastColumn="0"/>
+            </w:pPr>
+            <m:oMathPara>
+              <m:oMath>
+                <m:sSub>
+                  <m:sSubPr>
+                    <m:ctrlPr>
+                      <w:rPr>
+                        <w:rFonts w:ascii="Cambria Math" w:hAnsi="Cambria Math"/>
+                        <w:i/>
+                      </w:rPr>
+                    </m:ctrlPr>
+                  </m:sSubPr>
+                  <m:e>
+                    <m:r>
+                      <w:rPr>
+                        <w:rFonts w:ascii="Cambria Math" w:hAnsi="Cambria Math"/>
+                      </w:rPr>
+                      <m:t>p</m:t>
+                    </m:r>
+                  </m:e>
+                  <m:sub>
+                    <m:r>
+                      <w:rPr>
+                        <w:rFonts w:ascii="Cambria Math" w:hAnsi="Cambria Math"/>
+                      </w:rPr>
+                      <m:t>A</m:t>
+                    </m:r>
+                  </m:sub>
+                </m:sSub>
+              </m:oMath>
+            </m:oMathPara>
+          </w:p>
+        </w:tc>
+      </w:tr>
+      <w:tr>
+        <w:tc>
+          <w:tcPr>
+            <w:cnfStyle w:val="001000000000" w:firstRow="0" w:lastRow="0" w:firstColumn="1" w:lastColumn="0" w:oddVBand="0" w:evenVBand="0" w:oddHBand="0" w:evenHBand="0" w:firstRowFirstColumn="0" w:firstRowLastColumn="0" w:lastRowFirstColumn="0" w:lastRowLastColumn="0"/>
+            <w:tcW w:w="2642" w:type="pct"/>
+          </w:tcPr>
+          <w:p>
+            <w:pPr>
+              <w:pStyle w:val="ListParagraph"/>
+              <w:keepNext/>
+              <w:ind w:left="0"/>
+            </w:pPr>
+            <w:r>
+              <w:t>Use B</w:t>
+            </w:r>
+          </w:p>
+        </w:tc>
+        <w:tc>
+          <w:tcPr>
+            <w:tcW w:w="2358" w:type="pct"/>
+          </w:tcPr>
+          <w:p>
+            <w:pPr>
+              <w:pStyle w:val="ListParagraph"/>
+              <w:keepNext/>
+              <w:ind w:left="0"/>
+              <w:cnfStyle w:val="000000000000" w:firstRow="0" w:lastRow="0" w:firstColumn="0" w:lastColumn="0" w:oddVBand="0" w:evenVBand="0" w:oddHBand="0" w:evenHBand="0" w:firstRowFirstColumn="0" w:firstRowLastColumn="0" w:lastRowFirstColumn="0" w:lastRowLastColumn="0"/>
+            </w:pPr>
+            <m:oMathPara>
+              <m:oMath>
+                <m:sSub>
+                  <m:sSubPr>
+                    <m:ctrlPr>
+                      <w:rPr>
+                        <w:rFonts w:ascii="Cambria Math" w:hAnsi="Cambria Math"/>
+                        <w:i/>
+                      </w:rPr>
+                    </m:ctrlPr>
+                  </m:sSubPr>
+                  <m:e>
+                    <m:r>
+                      <w:rPr>
+                        <w:rFonts w:ascii="Cambria Math" w:hAnsi="Cambria Math"/>
+                      </w:rPr>
+                      <m:t>p</m:t>
+                    </m:r>
+                  </m:e>
+                  <m:sub>
+                    <m:r>
+                      <w:rPr>
+                        <w:rFonts w:ascii="Cambria Math" w:hAnsi="Cambria Math"/>
+                      </w:rPr>
+                      <m:t>B</m:t>
+                    </m:r>
+                  </m:sub>
+                </m:sSub>
+              </m:oMath>
+            </m:oMathPara>
+          </w:p>
+        </w:tc>
+      </w:tr>
+      <w:tr>
+        <w:tc>
+          <w:tcPr>
+            <w:cnfStyle w:val="001000000000" w:firstRow="0" w:lastRow="0" w:firstColumn="1" w:lastColumn="0" w:oddVBand="0" w:evenVBand="0" w:oddHBand="0" w:evenHBand="0" w:firstRowFirstColumn="0" w:firstRowLastColumn="0" w:lastRowFirstColumn="0" w:lastRowLastColumn="0"/>
+            <w:tcW w:w="2642" w:type="pct"/>
+            <w:tcBorders>
+              <w:bottom w:val="single" w:sz="4" w:space="0" w:color="666666" w:themeColor="text1" w:themeTint="99"/>
+            </w:tcBorders>
+          </w:tcPr>
+          <w:p>
+            <w:pPr>
+              <w:pStyle w:val="ListParagraph"/>
+              <w:keepNext/>
+              <w:ind w:left="0"/>
+            </w:pPr>
+            <w:r>
+              <w:t xml:space="preserve">No data: </w:t>
+            </w:r>
+            <w:r>
+              <w:t>equal use of A and B</w:t>
+            </w:r>
+          </w:p>
+        </w:tc>
+        <w:tc>
+          <w:tcPr>
+            <w:tcW w:w="2358" w:type="pct"/>
+            <w:tcBorders>
+              <w:bottom w:val="single" w:sz="4" w:space="0" w:color="666666" w:themeColor="text1" w:themeTint="99"/>
+            </w:tcBorders>
+          </w:tcPr>
+          <w:p>
+            <w:pPr>
+              <w:pStyle w:val="ListParagraph"/>
+              <w:keepNext/>
+              <w:ind w:left="0"/>
+              <w:cnfStyle w:val="000000000000" w:firstRow="0" w:lastRow="0" w:firstColumn="0" w:lastColumn="0" w:oddVBand="0" w:evenVBand="0" w:oddHBand="0" w:evenHBand="0" w:firstRowFirstColumn="0" w:firstRowLastColumn="0" w:lastRowFirstColumn="0" w:lastRowLastColumn="0"/>
+            </w:pPr>
+            <m:oMathPara>
+              <m:oMath>
+                <m:r>
+                  <w:rPr>
+                    <w:rFonts w:ascii="Cambria Math" w:hAnsi="Cambria Math"/>
+                  </w:rPr>
+                  <m:t>(</m:t>
+                </m:r>
+                <m:sSub>
+                  <m:sSubPr>
+                    <m:ctrlPr>
+                      <w:rPr>
+                        <w:rFonts w:ascii="Cambria Math" w:hAnsi="Cambria Math"/>
+                        <w:i/>
+                      </w:rPr>
+                    </m:ctrlPr>
+                  </m:sSubPr>
+                  <m:e>
+                    <m:r>
+                      <w:rPr>
+                        <w:rFonts w:ascii="Cambria Math" w:hAnsi="Cambria Math"/>
+                      </w:rPr>
+                      <m:t>p</m:t>
+                    </m:r>
+                  </m:e>
+                  <m:sub>
+                    <m:r>
+                      <w:rPr>
+                        <w:rFonts w:ascii="Cambria Math" w:hAnsi="Cambria Math"/>
+                      </w:rPr>
+                      <m:t>A</m:t>
+                    </m:r>
+                  </m:sub>
+                </m:sSub>
+                <m:r>
+                  <w:rPr>
+                    <w:rFonts w:ascii="Cambria Math" w:hAnsi="Cambria Math"/>
+                  </w:rPr>
+                  <m:t>+</m:t>
+                </m:r>
+                <m:sSub>
+                  <m:sSubPr>
+                    <m:ctrlPr>
+                      <w:rPr>
+                        <w:rFonts w:ascii="Cambria Math" w:hAnsi="Cambria Math"/>
+                        <w:i/>
+                      </w:rPr>
+                    </m:ctrlPr>
+                  </m:sSubPr>
+                  <m:e>
+                    <m:r>
+                      <w:rPr>
+                        <w:rFonts w:ascii="Cambria Math" w:hAnsi="Cambria Math"/>
+                      </w:rPr>
+                      <m:t>p</m:t>
+                    </m:r>
+                  </m:e>
+                  <m:sub>
+                    <m:r>
+                      <w:rPr>
+                        <w:rFonts w:ascii="Cambria Math" w:hAnsi="Cambria Math"/>
+                      </w:rPr>
+                      <m:t>B</m:t>
+                    </m:r>
+                  </m:sub>
+                </m:sSub>
+                <m:r>
+                  <w:rPr>
+                    <w:rFonts w:ascii="Cambria Math" w:hAnsi="Cambria Math"/>
+                  </w:rPr>
+                  <m:t>)/2</m:t>
+                </m:r>
+              </m:oMath>
+            </m:oMathPara>
+          </w:p>
+        </w:tc>
+      </w:tr>
+      <w:tr>
+        <w:tc>
+          <w:tcPr>
+            <w:cnfStyle w:val="001000000000" w:firstRow="0" w:lastRow="0" w:firstColumn="1" w:lastColumn="0" w:oddVBand="0" w:evenVBand="0" w:oddHBand="0" w:evenHBand="0" w:firstRowFirstColumn="0" w:firstRowLastColumn="0" w:lastRowFirstColumn="0" w:lastRowLastColumn="0"/>
+            <w:tcW w:w="2642" w:type="pct"/>
+            <w:tcBorders>
+              <w:bottom w:val="single" w:sz="18" w:space="0" w:color="666666" w:themeColor="text1" w:themeTint="99"/>
+            </w:tcBorders>
+          </w:tcPr>
+          <w:p>
+            <w:pPr>
+              <w:pStyle w:val="ListParagraph"/>
+              <w:keepNext/>
+              <w:ind w:left="0"/>
+            </w:pPr>
+            <w:r>
+              <w:t xml:space="preserve">Trial data: use A with probability </w:t>
+            </w:r>
+            <m:oMath>
+              <m:r>
+                <m:rPr>
+                  <m:sty m:val="bi"/>
+                </m:rPr>
+                <w:rPr>
+                  <w:rFonts w:ascii="Cambria Math" w:hAnsi="Cambria Math"/>
+                </w:rPr>
+                <m:t>power</m:t>
+              </m:r>
+            </m:oMath>
+          </w:p>
+        </w:tc>
+        <w:tc>
+          <w:tcPr>
+            <w:tcW w:w="2358" w:type="pct"/>
+            <w:tcBorders>
+              <w:bottom w:val="single" w:sz="18" w:space="0" w:color="666666" w:themeColor="text1" w:themeTint="99"/>
+            </w:tcBorders>
+          </w:tcPr>
+          <w:p>
+            <w:pPr>
+              <w:pStyle w:val="ListParagraph"/>
+              <w:keepNext/>
+              <w:ind w:left="0"/>
+              <w:cnfStyle w:val="000000000000" w:firstRow="0" w:lastRow="0" w:firstColumn="0" w:lastColumn="0" w:oddVBand="0" w:evenVBand="0" w:oddHBand="0" w:evenHBand="0" w:firstRowFirstColumn="0" w:firstRowLastColumn="0" w:lastRowFirstColumn="0" w:lastRowLastColumn="0"/>
+              <w:rPr>
+                <w:rFonts w:ascii="Calibri" w:eastAsia="Calibri" w:hAnsi="Calibri" w:cs="Arial"/>
+              </w:rPr>
+            </w:pPr>
+            <m:oMathPara>
+              <m:oMath>
+                <m:r>
+                  <w:rPr>
+                    <w:rFonts w:ascii="Cambria Math" w:eastAsia="Calibri" w:hAnsi="Cambria Math" w:cs="Arial"/>
+                  </w:rPr>
+                  <m:t>power×</m:t>
+                </m:r>
+                <m:sSub>
+                  <m:sSubPr>
+                    <m:ctrlPr>
+                      <w:rPr>
+                        <w:rFonts w:ascii="Cambria Math" w:eastAsia="Calibri" w:hAnsi="Cambria Math" w:cs="Arial"/>
+                        <w:i/>
+                      </w:rPr>
+                    </m:ctrlPr>
+                  </m:sSubPr>
+                  <m:e>
+                    <m:r>
+                      <w:rPr>
+                        <w:rFonts w:ascii="Cambria Math" w:eastAsia="Calibri" w:hAnsi="Cambria Math" w:cs="Arial"/>
+                      </w:rPr>
+                      <m:t>p</m:t>
+                    </m:r>
+                  </m:e>
+                  <m:sub>
+                    <m:r>
+                      <w:rPr>
+                        <w:rFonts w:ascii="Cambria Math" w:eastAsia="Calibri" w:hAnsi="Cambria Math" w:cs="Arial"/>
+                      </w:rPr>
+                      <m:t>A</m:t>
+                    </m:r>
+                  </m:sub>
+                </m:sSub>
+                <m:r>
+                  <w:rPr>
+                    <w:rFonts w:ascii="Cambria Math" w:eastAsia="Calibri" w:hAnsi="Cambria Math" w:cs="Arial"/>
+                  </w:rPr>
+                  <m:t>+</m:t>
+                </m:r>
+                <m:d>
+                  <m:dPr>
+                    <m:ctrlPr>
+                      <w:rPr>
+                        <w:rFonts w:ascii="Cambria Math" w:eastAsia="Calibri" w:hAnsi="Cambria Math" w:cs="Arial"/>
+                        <w:i/>
+                      </w:rPr>
+                    </m:ctrlPr>
+                  </m:dPr>
+                  <m:e>
+                    <m:r>
+                      <w:rPr>
+                        <w:rFonts w:ascii="Cambria Math" w:eastAsia="Calibri" w:hAnsi="Cambria Math" w:cs="Arial"/>
+                      </w:rPr>
+                      <m:t>1-power</m:t>
+                    </m:r>
+                  </m:e>
+                </m:d>
+                <m:r>
+                  <w:rPr>
+                    <w:rFonts w:ascii="Cambria Math" w:eastAsia="Calibri" w:hAnsi="Cambria Math" w:cs="Arial"/>
+                  </w:rPr>
+                  <m:t>×</m:t>
+                </m:r>
+                <m:sSub>
+                  <m:sSubPr>
+                    <m:ctrlPr>
+                      <w:rPr>
+                        <w:rFonts w:ascii="Cambria Math" w:eastAsia="Calibri" w:hAnsi="Cambria Math" w:cs="Arial"/>
+                        <w:i/>
+                      </w:rPr>
+                    </m:ctrlPr>
+                  </m:sSubPr>
+                  <m:e>
+                    <m:r>
+                      <w:rPr>
+                        <w:rFonts w:ascii="Cambria Math" w:eastAsia="Calibri" w:hAnsi="Cambria Math" w:cs="Arial"/>
+                      </w:rPr>
+                      <m:t>p</m:t>
+                    </m:r>
+                  </m:e>
+                  <m:sub>
+                    <m:r>
+                      <w:rPr>
+                        <w:rFonts w:ascii="Cambria Math" w:eastAsia="Calibri" w:hAnsi="Cambria Math" w:cs="Arial"/>
+                      </w:rPr>
+                      <m:t>B</m:t>
+                    </m:r>
+                  </m:sub>
+                </m:sSub>
+              </m:oMath>
+            </m:oMathPara>
+          </w:p>
+        </w:tc>
+      </w:tr>
+      <w:tr>
+        <w:tc>
+          <w:tcPr>
+            <w:cnfStyle w:val="001000000000" w:firstRow="0" w:lastRow="0" w:firstColumn="1" w:lastColumn="0" w:oddVBand="0" w:evenVBand="0" w:oddHBand="0" w:evenHBand="0" w:firstRowFirstColumn="0" w:firstRowLastColumn="0" w:lastRowFirstColumn="0" w:lastRowLastColumn="0"/>
+            <w:tcW w:w="2642" w:type="pct"/>
+            <w:tcBorders>
+              <w:top w:val="single" w:sz="18" w:space="0" w:color="666666" w:themeColor="text1" w:themeTint="99"/>
+              <w:bottom w:val="single" w:sz="4" w:space="0" w:color="666666" w:themeColor="text1" w:themeTint="99"/>
+            </w:tcBorders>
+          </w:tcPr>
+          <w:p>
+            <w:pPr>
+              <w:pStyle w:val="ListParagraph"/>
+              <w:keepNext/>
+              <w:ind w:left="0"/>
+            </w:pPr>
+            <w:r>
+              <w:t>Gain from perfect knowledge cf no data</w:t>
+            </w:r>
+          </w:p>
+        </w:tc>
+        <w:tc>
+          <w:tcPr>
+            <w:tcW w:w="2358" w:type="pct"/>
+            <w:tcBorders>
+              <w:top w:val="single" w:sz="18" w:space="0" w:color="666666" w:themeColor="text1" w:themeTint="99"/>
+              <w:bottom w:val="single" w:sz="4" w:space="0" w:color="666666" w:themeColor="text1" w:themeTint="99"/>
+            </w:tcBorders>
+          </w:tcPr>
+          <w:p>
+            <w:pPr>
+              <w:pStyle w:val="ListParagraph"/>
+              <w:keepNext/>
+              <w:ind w:left="0"/>
+              <w:cnfStyle w:val="000000000000" w:firstRow="0" w:lastRow="0" w:firstColumn="0" w:lastColumn="0" w:oddVBand="0" w:evenVBand="0" w:oddHBand="0" w:evenHBand="0" w:firstRowFirstColumn="0" w:firstRowLastColumn="0" w:lastRowFirstColumn="0" w:lastRowLastColumn="0"/>
+              <w:rPr>
+                <w:rFonts w:ascii="Calibri" w:eastAsia="Calibri" w:hAnsi="Calibri" w:cs="Arial"/>
+              </w:rPr>
+            </w:pPr>
+            <m:oMathPara>
+              <m:oMath>
+                <m:r>
+                  <w:rPr>
+                    <w:rFonts w:ascii="Cambria Math" w:eastAsia="Calibri" w:hAnsi="Cambria Math" w:cs="Arial"/>
+                  </w:rPr>
+                  <m:t>1/2×</m:t>
+                </m:r>
+                <m:d>
+                  <m:dPr>
+                    <m:ctrlPr>
+                      <w:rPr>
+                        <w:rFonts w:ascii="Cambria Math" w:eastAsia="Calibri" w:hAnsi="Cambria Math" w:cs="Arial"/>
+                        <w:i/>
+                      </w:rPr>
+                    </m:ctrlPr>
+                  </m:dPr>
+                  <m:e>
+                    <m:sSub>
+                      <m:sSubPr>
+                        <m:ctrlPr>
+                          <w:rPr>
+                            <w:rFonts w:ascii="Cambria Math" w:eastAsia="Calibri" w:hAnsi="Cambria Math" w:cs="Arial"/>
+                            <w:i/>
+                          </w:rPr>
+                        </m:ctrlPr>
+                      </m:sSubPr>
+                      <m:e>
+                        <m:r>
+                          <w:rPr>
+                            <w:rFonts w:ascii="Cambria Math" w:eastAsia="Calibri" w:hAnsi="Cambria Math" w:cs="Arial"/>
+                          </w:rPr>
+                          <m:t>p</m:t>
+                        </m:r>
+                      </m:e>
+                      <m:sub>
+                        <m:r>
+                          <w:rPr>
+                            <w:rFonts w:ascii="Cambria Math" w:eastAsia="Calibri" w:hAnsi="Cambria Math" w:cs="Arial"/>
+                          </w:rPr>
+                          <m:t>A</m:t>
+                        </m:r>
+                      </m:sub>
+                    </m:sSub>
+                    <m:r>
+                      <w:rPr>
+                        <w:rFonts w:ascii="Cambria Math" w:eastAsia="Calibri" w:hAnsi="Cambria Math" w:cs="Arial"/>
+                      </w:rPr>
+                      <m:t>-</m:t>
+                    </m:r>
+                    <m:sSub>
+                      <m:sSubPr>
+                        <m:ctrlPr>
+                          <w:rPr>
+                            <w:rFonts w:ascii="Cambria Math" w:eastAsia="Calibri" w:hAnsi="Cambria Math" w:cs="Arial"/>
+                            <w:i/>
+                          </w:rPr>
+                        </m:ctrlPr>
+                      </m:sSubPr>
+                      <m:e>
+                        <m:r>
+                          <w:rPr>
+                            <w:rFonts w:ascii="Cambria Math" w:eastAsia="Calibri" w:hAnsi="Cambria Math" w:cs="Arial"/>
+                          </w:rPr>
+                          <m:t>p</m:t>
+                        </m:r>
+                      </m:e>
+                      <m:sub>
+                        <m:r>
+                          <w:rPr>
+                            <w:rFonts w:ascii="Cambria Math" w:eastAsia="Calibri" w:hAnsi="Cambria Math" w:cs="Arial"/>
+                          </w:rPr>
+                          <m:t>B</m:t>
+                        </m:r>
+                      </m:sub>
+                    </m:sSub>
+                  </m:e>
+                </m:d>
+              </m:oMath>
+            </m:oMathPara>
+          </w:p>
+        </w:tc>
+      </w:tr>
+      <w:tr>
+        <w:tc>
+          <w:tcPr>
+            <w:cnfStyle w:val="001000000000" w:firstRow="0" w:lastRow="0" w:firstColumn="1" w:lastColumn="0" w:oddVBand="0" w:evenVBand="0" w:oddHBand="0" w:evenHBand="0" w:firstRowFirstColumn="0" w:firstRowLastColumn="0" w:lastRowFirstColumn="0" w:lastRowLastColumn="0"/>
+            <w:tcW w:w="2642" w:type="pct"/>
+            <w:tcBorders>
+              <w:bottom w:val="single" w:sz="18" w:space="0" w:color="666666" w:themeColor="text1" w:themeTint="99"/>
+            </w:tcBorders>
+          </w:tcPr>
+          <w:p>
+            <w:pPr>
+              <w:pStyle w:val="ListParagraph"/>
+              <w:ind w:left="0"/>
+            </w:pPr>
+            <w:r>
+              <w:t>Gain from trial data cf no data</w:t>
+            </w:r>
+          </w:p>
+        </w:tc>
+        <w:tc>
+          <w:tcPr>
+            <w:tcW w:w="2358" w:type="pct"/>
+            <w:tcBorders>
+              <w:bottom w:val="single" w:sz="18" w:space="0" w:color="666666" w:themeColor="text1" w:themeTint="99"/>
+            </w:tcBorders>
+          </w:tcPr>
+          <w:p>
+            <w:pPr>
+              <w:pStyle w:val="ListParagraph"/>
+              <w:ind w:left="0"/>
+              <w:cnfStyle w:val="000000000000" w:firstRow="0" w:lastRow="0" w:firstColumn="0" w:lastColumn="0" w:oddVBand="0" w:evenVBand="0" w:oddHBand="0" w:evenHBand="0" w:firstRowFirstColumn="0" w:firstRowLastColumn="0" w:lastRowFirstColumn="0" w:lastRowLastColumn="0"/>
+              <w:rPr>
+                <w:rFonts w:ascii="Calibri" w:eastAsia="Calibri" w:hAnsi="Calibri" w:cs="Arial"/>
+              </w:rPr>
+            </w:pPr>
+            <m:oMathPara>
+              <m:oMath>
+                <m:d>
+                  <m:dPr>
+                    <m:ctrlPr>
+                      <w:rPr>
+                        <w:rFonts w:ascii="Cambria Math" w:eastAsia="Calibri" w:hAnsi="Cambria Math" w:cs="Arial"/>
+                        <w:i/>
+                      </w:rPr>
+                    </m:ctrlPr>
+                  </m:dPr>
+                  <m:e>
+                    <m:r>
+                      <w:rPr>
+                        <w:rFonts w:ascii="Cambria Math" w:eastAsia="Calibri" w:hAnsi="Cambria Math" w:cs="Arial"/>
+                      </w:rPr>
+                      <m:t>power</m:t>
+                    </m:r>
+                    <m:r>
+                      <w:rPr>
+                        <w:rFonts w:ascii="Cambria Math" w:eastAsia="Calibri" w:hAnsi="Cambria Math" w:cs="Arial"/>
+                      </w:rPr>
+                      <m:t>-1/2</m:t>
+                    </m:r>
+                  </m:e>
+                </m:d>
+                <m:r>
+                  <w:rPr>
+                    <w:rFonts w:ascii="Cambria Math" w:eastAsia="Calibri" w:hAnsi="Cambria Math" w:cs="Arial"/>
+                  </w:rPr>
+                  <m:t>×</m:t>
+                </m:r>
+                <m:d>
+                  <m:dPr>
+                    <m:ctrlPr>
+                      <w:rPr>
+                        <w:rFonts w:ascii="Cambria Math" w:eastAsia="Calibri" w:hAnsi="Cambria Math" w:cs="Arial"/>
+                        <w:i/>
+                      </w:rPr>
+                    </m:ctrlPr>
+                  </m:dPr>
+                  <m:e>
+                    <m:sSub>
+                      <m:sSubPr>
+                        <m:ctrlPr>
+                          <w:rPr>
+                            <w:rFonts w:ascii="Cambria Math" w:eastAsia="Calibri" w:hAnsi="Cambria Math" w:cs="Arial"/>
+                            <w:i/>
+                          </w:rPr>
+                        </m:ctrlPr>
+                      </m:sSubPr>
+                      <m:e>
+                        <m:r>
+                          <w:rPr>
+                            <w:rFonts w:ascii="Cambria Math" w:eastAsia="Calibri" w:hAnsi="Cambria Math" w:cs="Arial"/>
+                          </w:rPr>
+                          <m:t>p</m:t>
+                        </m:r>
+                      </m:e>
+                      <m:sub>
+                        <m:r>
+                          <w:rPr>
+                            <w:rFonts w:ascii="Cambria Math" w:eastAsia="Calibri" w:hAnsi="Cambria Math" w:cs="Arial"/>
+                          </w:rPr>
+                          <m:t>A</m:t>
+                        </m:r>
+                      </m:sub>
+                    </m:sSub>
+                    <m:r>
+                      <w:rPr>
+                        <w:rFonts w:ascii="Cambria Math" w:eastAsia="Calibri" w:hAnsi="Cambria Math" w:cs="Arial"/>
+                      </w:rPr>
+                      <m:t>-</m:t>
+                    </m:r>
+                    <m:sSub>
+                      <m:sSubPr>
+                        <m:ctrlPr>
+                          <w:rPr>
+                            <w:rFonts w:ascii="Cambria Math" w:eastAsia="Calibri" w:hAnsi="Cambria Math" w:cs="Arial"/>
+                            <w:i/>
+                          </w:rPr>
+                        </m:ctrlPr>
+                      </m:sSubPr>
+                      <m:e>
+                        <m:r>
+                          <w:rPr>
+                            <w:rFonts w:ascii="Cambria Math" w:eastAsia="Calibri" w:hAnsi="Cambria Math" w:cs="Arial"/>
+                          </w:rPr>
+                          <m:t>p</m:t>
+                        </m:r>
+                      </m:e>
+                      <m:sub>
+                        <m:r>
+                          <w:rPr>
+                            <w:rFonts w:ascii="Cambria Math" w:eastAsia="Calibri" w:hAnsi="Cambria Math" w:cs="Arial"/>
+                          </w:rPr>
+                          <m:t>B</m:t>
+                        </m:r>
+                      </m:sub>
+                    </m:sSub>
+                  </m:e>
+                </m:d>
+              </m:oMath>
+            </m:oMathPara>
+          </w:p>
+        </w:tc>
+      </w:tr>
+    </w:tbl>
+    <w:p>
+      <w:pPr>
+        <w:pStyle w:val="ListParagraph"/>
+        <w:ind w:left="360"/>
+      </w:pPr>
+      <w:r>
+        <w:t>The gain from trial data, expressed as a fraction of the gain from perfect data, is</w:t>
+      </w:r>
+      <w:r>
+        <w:t xml:space="preserve"> therefore</w:t>
+      </w:r>
+    </w:p>
+    <w:p>
+      <w:pPr>
+        <w:pStyle w:val="ListParagraph"/>
+      </w:pPr>
+      <m:oMathPara>
+        <m:oMath>
+          <m:f>
+            <m:fPr>
+              <m:ctrlPr>
+                <w:rPr>
+                  <w:rFonts w:ascii="Cambria Math" w:hAnsi="Cambria Math"/>
+                  <w:i/>
+                </w:rPr>
+              </m:ctrlPr>
+            </m:fPr>
+            <m:num>
+              <m:d>
+                <m:dPr>
+                  <m:ctrlPr>
+                    <w:rPr>
+                      <w:rFonts w:ascii="Cambria Math" w:eastAsia="Calibri" w:hAnsi="Cambria Math" w:cs="Arial"/>
+                      <w:i/>
+                    </w:rPr>
+                  </m:ctrlPr>
+                </m:dPr>
+                <m:e>
+                  <m:r>
+                    <w:rPr>
+                      <w:rFonts w:ascii="Cambria Math" w:eastAsia="Calibri" w:hAnsi="Cambria Math" w:cs="Arial"/>
+                    </w:rPr>
+                    <m:t>power-1/2</m:t>
+                  </m:r>
+                </m:e>
+              </m:d>
+              <m:r>
+                <w:rPr>
+                  <w:rFonts w:ascii="Cambria Math" w:eastAsia="Calibri" w:hAnsi="Cambria Math" w:cs="Arial"/>
+                </w:rPr>
+                <m:t>×</m:t>
+              </m:r>
+              <m:d>
+                <m:dPr>
+                  <m:ctrlPr>
+                    <w:rPr>
+                      <w:rFonts w:ascii="Cambria Math" w:eastAsia="Calibri" w:hAnsi="Cambria Math" w:cs="Arial"/>
+                      <w:i/>
+                    </w:rPr>
+                  </m:ctrlPr>
+                </m:dPr>
+                <m:e>
+                  <m:sSub>
+                    <m:sSubPr>
+                      <m:ctrlPr>
+                        <w:rPr>
+                          <w:rFonts w:ascii="Cambria Math" w:eastAsia="Calibri" w:hAnsi="Cambria Math" w:cs="Arial"/>
+                          <w:i/>
+                        </w:rPr>
+                      </m:ctrlPr>
+                    </m:sSubPr>
+                    <m:e>
+                      <m:r>
+                        <w:rPr>
+                          <w:rFonts w:ascii="Cambria Math" w:eastAsia="Calibri" w:hAnsi="Cambria Math" w:cs="Arial"/>
+                        </w:rPr>
+                        <m:t>p</m:t>
+                      </m:r>
+                    </m:e>
+                    <m:sub>
+                      <m:r>
+                        <w:rPr>
+                          <w:rFonts w:ascii="Cambria Math" w:eastAsia="Calibri" w:hAnsi="Cambria Math" w:cs="Arial"/>
+                        </w:rPr>
+                        <m:t>A</m:t>
+                      </m:r>
+                    </m:sub>
+                  </m:sSub>
+                  <m:r>
+                    <w:rPr>
+                      <w:rFonts w:ascii="Cambria Math" w:eastAsia="Calibri" w:hAnsi="Cambria Math" w:cs="Arial"/>
+                    </w:rPr>
+                    <m:t>-</m:t>
+                  </m:r>
+                  <m:sSub>
+                    <m:sSubPr>
+                      <m:ctrlPr>
+                        <w:rPr>
+                          <w:rFonts w:ascii="Cambria Math" w:eastAsia="Calibri" w:hAnsi="Cambria Math" w:cs="Arial"/>
+                          <w:i/>
+                        </w:rPr>
+                      </m:ctrlPr>
+                    </m:sSubPr>
+                    <m:e>
+                      <m:r>
+                        <w:rPr>
+                          <w:rFonts w:ascii="Cambria Math" w:eastAsia="Calibri" w:hAnsi="Cambria Math" w:cs="Arial"/>
+                        </w:rPr>
+                        <m:t>p</m:t>
+                      </m:r>
+                    </m:e>
+                    <m:sub>
+                      <m:r>
+                        <w:rPr>
+                          <w:rFonts w:ascii="Cambria Math" w:eastAsia="Calibri" w:hAnsi="Cambria Math" w:cs="Arial"/>
+                        </w:rPr>
+                        <m:t>B</m:t>
+                      </m:r>
+                    </m:sub>
+                  </m:sSub>
+                </m:e>
+              </m:d>
+            </m:num>
+            <m:den>
+              <m:r>
+                <w:rPr>
+                  <w:rFonts w:ascii="Cambria Math" w:eastAsia="Calibri" w:hAnsi="Cambria Math" w:cs="Arial"/>
+                </w:rPr>
+                <m:t>1/2×</m:t>
+              </m:r>
+              <m:d>
+                <m:dPr>
+                  <m:ctrlPr>
+                    <w:rPr>
+                      <w:rFonts w:ascii="Cambria Math" w:eastAsia="Calibri" w:hAnsi="Cambria Math" w:cs="Arial"/>
+                      <w:i/>
+                    </w:rPr>
+                  </m:ctrlPr>
+                </m:dPr>
+                <m:e>
+                  <m:sSub>
+                    <m:sSubPr>
+                      <m:ctrlPr>
+                        <w:rPr>
+                          <w:rFonts w:ascii="Cambria Math" w:eastAsia="Calibri" w:hAnsi="Cambria Math" w:cs="Arial"/>
+                          <w:i/>
+                        </w:rPr>
+                      </m:ctrlPr>
+                    </m:sSubPr>
+                    <m:e>
+                      <m:r>
+                        <w:rPr>
+                          <w:rFonts w:ascii="Cambria Math" w:eastAsia="Calibri" w:hAnsi="Cambria Math" w:cs="Arial"/>
+                        </w:rPr>
+                        <m:t>p</m:t>
+                      </m:r>
+                    </m:e>
+                    <m:sub>
+                      <m:r>
+                        <w:rPr>
+                          <w:rFonts w:ascii="Cambria Math" w:eastAsia="Calibri" w:hAnsi="Cambria Math" w:cs="Arial"/>
+                        </w:rPr>
+                        <m:t>A</m:t>
+                      </m:r>
+                    </m:sub>
+                  </m:sSub>
+                  <m:r>
+                    <w:rPr>
+                      <w:rFonts w:ascii="Cambria Math" w:eastAsia="Calibri" w:hAnsi="Cambria Math" w:cs="Arial"/>
+                    </w:rPr>
+                    <m:t>-</m:t>
+                  </m:r>
+                  <m:sSub>
+                    <m:sSubPr>
+                      <m:ctrlPr>
+                        <w:rPr>
+                          <w:rFonts w:ascii="Cambria Math" w:eastAsia="Calibri" w:hAnsi="Cambria Math" w:cs="Arial"/>
+                          <w:i/>
+                        </w:rPr>
+                      </m:ctrlPr>
+                    </m:sSubPr>
+                    <m:e>
+                      <m:r>
+                        <w:rPr>
+                          <w:rFonts w:ascii="Cambria Math" w:eastAsia="Calibri" w:hAnsi="Cambria Math" w:cs="Arial"/>
+                        </w:rPr>
+                        <m:t>p</m:t>
+                      </m:r>
+                    </m:e>
+                    <m:sub>
+                      <m:r>
+                        <w:rPr>
+                          <w:rFonts w:ascii="Cambria Math" w:eastAsia="Calibri" w:hAnsi="Cambria Math" w:cs="Arial"/>
+                        </w:rPr>
+                        <m:t>B</m:t>
+                      </m:r>
+                    </m:sub>
+                  </m:sSub>
+                </m:e>
+              </m:d>
+            </m:den>
+          </m:f>
+          <m:r>
+            <w:rPr>
+              <w:rFonts w:ascii="Cambria Math" w:eastAsiaTheme="minorEastAsia" w:hAnsi="Cambria Math"/>
+            </w:rPr>
+            <m:t>=</m:t>
+          </m:r>
+          <m:f>
+            <m:fPr>
+              <m:ctrlPr>
+                <w:rPr>
+                  <w:rFonts w:ascii="Cambria Math" w:hAnsi="Cambria Math"/>
+                  <w:i/>
+                </w:rPr>
+              </m:ctrlPr>
+            </m:fPr>
+            <m:num>
+              <m:d>
+                <m:dPr>
+                  <m:ctrlPr>
+                    <w:rPr>
+                      <w:rFonts w:ascii="Cambria Math" w:eastAsia="Calibri" w:hAnsi="Cambria Math" w:cs="Arial"/>
+                      <w:i/>
+                    </w:rPr>
+                  </m:ctrlPr>
+                </m:dPr>
+                <m:e>
+                  <m:r>
+                    <w:rPr>
+                      <w:rFonts w:ascii="Cambria Math" w:eastAsia="Calibri" w:hAnsi="Cambria Math" w:cs="Arial"/>
+                    </w:rPr>
+                    <m:t>power-1/2</m:t>
+                  </m:r>
+                </m:e>
+              </m:d>
+            </m:num>
+            <m:den>
+              <m:r>
+                <w:rPr>
+                  <w:rFonts w:ascii="Cambria Math" w:eastAsia="Calibri" w:hAnsi="Cambria Math" w:cs="Arial"/>
+                </w:rPr>
+                <m:t>1/2</m:t>
+              </m:r>
+            </m:den>
+          </m:f>
+          <m:r>
+            <w:rPr>
+              <w:rFonts w:ascii="Cambria Math" w:hAnsi="Cambria Math"/>
+            </w:rPr>
+            <m:t>=2×power-1.</m:t>
+          </m:r>
+        </m:oMath>
+      </m:oMathPara>
+    </w:p>
+    <w:p>
+      <w:pPr>
+        <w:pStyle w:val="ListParagraph"/>
         <w:numPr>
           <w:ilvl w:val="0"/>
           <w:numId w:val="21"/>
@@ -1448,21 +2061,20 @@
         <w:t xml:space="preserve">fit of 80% of the maximum, </w:t>
       </w:r>
       <w:r>
-        <w:t xml:space="preserve">we can use standard sample size software </w:t>
-      </w:r>
-      <w:r>
-        <w:t xml:space="preserve"> with the power set to </w:t>
-      </w:r>
-      <w:del w:id="132" w:author="Matt Sydes" w:date="2026-07-03T17:24:00Z" w16du:dateUtc="2026-07-03T16:24:00Z">
-        <w:r>
-          <w:delText>.9</w:delText>
-        </w:r>
-      </w:del>
-      <w:ins w:id="133" w:author="Matt Sydes" w:date="2026-07-03T17:24:00Z" w16du:dateUtc="2026-07-03T16:24:00Z">
-        <w:r>
-          <w:t>90%</w:t>
-        </w:r>
-      </w:ins>
+        <w:t>we can use standard sample size software</w:t>
+      </w:r>
+      <w:r>
+        <w:t xml:space="preserve"> with </w:t>
+      </w:r>
+      <w:r>
+        <w:t xml:space="preserve">one-soded significance level set to 0.5 and </w:t>
+      </w:r>
+      <w:r>
+        <w:t xml:space="preserve">the power set to </w:t>
+      </w:r>
+      <w:r>
+        <w:t>90%</w:t>
+      </w:r>
       <w:r>
         <w:t>:</w:t>
       </w:r>
@@ -1474,52 +2086,21 @@
       <w:r>
         <w:t>artbin, pr(</w:t>
       </w:r>
-      <w:del w:id="134" w:author="Matt Sydes" w:date="2026-07-03T17:23:00Z" w16du:dateUtc="2026-07-03T16:23:00Z">
-        <w:r>
-          <w:delText xml:space="preserve">.5 </w:delText>
-        </w:r>
-      </w:del>
-      <w:ins w:id="135" w:author="Matt Sydes" w:date="2026-07-03T17:23:00Z" w16du:dateUtc="2026-07-03T16:23:00Z">
-        <w:r>
-          <w:t xml:space="preserve">0.50 </w:t>
-        </w:r>
-      </w:ins>
-      <w:del w:id="136" w:author="Matt Sydes" w:date="2026-07-03T17:24:00Z" w16du:dateUtc="2026-07-03T16:24:00Z">
-        <w:r>
-          <w:delText>.55</w:delText>
-        </w:r>
-      </w:del>
-      <w:ins w:id="137" w:author="Matt Sydes" w:date="2026-07-03T17:24:00Z" w16du:dateUtc="2026-07-03T16:24:00Z">
-        <w:r>
-          <w:t>0.55</w:t>
-        </w:r>
-      </w:ins>
+      <w:r>
+        <w:t>0.50 0.55</w:t>
+      </w:r>
       <w:r>
         <w:t>) power(</w:t>
       </w:r>
-      <w:del w:id="138" w:author="Matt Sydes" w:date="2026-07-03T17:24:00Z" w16du:dateUtc="2026-07-03T16:24:00Z">
-        <w:r>
-          <w:delText>.9</w:delText>
-        </w:r>
-      </w:del>
-      <w:ins w:id="139" w:author="Matt Sydes" w:date="2026-07-03T17:24:00Z" w16du:dateUtc="2026-07-03T16:24:00Z">
-        <w:r>
-          <w:t>0.90</w:t>
-        </w:r>
-      </w:ins>
+      <w:r>
+        <w:t>0.90</w:t>
+      </w:r>
       <w:r>
         <w:t>) alpha(</w:t>
       </w:r>
-      <w:del w:id="140" w:author="Matt Sydes" w:date="2026-07-03T17:24:00Z" w16du:dateUtc="2026-07-03T16:24:00Z">
-        <w:r>
-          <w:delText>.5</w:delText>
-        </w:r>
-      </w:del>
-      <w:ins w:id="141" w:author="Matt Sydes" w:date="2026-07-03T17:24:00Z" w16du:dateUtc="2026-07-03T16:24:00Z">
-        <w:r>
-          <w:t>0.50</w:t>
-        </w:r>
-      </w:ins>
+      <w:r>
+        <w:t>0.50</w:t>
+      </w:r>
       <w:r>
         <w:t>) onesided</w:t>
       </w:r>
@@ -1573,7 +2154,6 @@
         <w:pStyle w:val="Bibliography"/>
       </w:pPr>
       <w:r>
-        <w:lastRenderedPageBreak/>
         <w:t>2.</w:t>
       </w:r>
       <w:r>
@@ -1594,7 +2174,7 @@
     <w:p>
       <w:pPr>
         <w:sectPr>
-          <w:footerReference w:type="default" r:id="rId13"/>
+          <w:footerReference w:type="default" r:id="rId9"/>
           <w:pgSz w:w="11906" w:h="16838" w:code="9"/>
           <w:pgMar w:top="1440" w:right="1440" w:bottom="1440" w:left="1440" w:header="709" w:footer="709" w:gutter="0"/>
           <w:cols w:space="708"/>
@@ -2640,7 +3220,7 @@
       <w:r>
         <w:t>should be considered as reference intervention</w:t>
       </w:r>
-      <w:bookmarkStart w:id="142" w:name="_Ref169885346"/>
+      <w:bookmarkStart w:id="1" w:name="_Ref169885346"/>
       <w:r>
         <w:t>.</w:t>
       </w:r>
@@ -2648,7 +3228,7 @@
         <w:br w:type="page"/>
       </w:r>
     </w:p>
-    <w:bookmarkEnd w:id="142"/>
+    <w:bookmarkEnd w:id="1"/>
     <w:p>
       <w:pPr>
         <w:pStyle w:val="Caption"/>
@@ -2685,7 +3265,7 @@
       <w:r>
         <w:t>more or less appropriate than a standard approach</w:t>
       </w:r>
-      <w:bookmarkStart w:id="143" w:name="_Ref169884017"/>
+      <w:bookmarkStart w:id="2" w:name="_Ref169884017"/>
       <w:r>
         <w:t>.</w:t>
       </w:r>
@@ -3043,7 +3623,7 @@
           </w:p>
         </w:tc>
       </w:tr>
-      <w:bookmarkEnd w:id="143"/>
+      <w:bookmarkEnd w:id="2"/>
     </w:tbl>
     <w:p>
       <w:pPr>
@@ -3059,134 +3639,6 @@
     </w:sectPr>
   </w:body>
 </w:document>
-</file>
-
-<file path=word/comments.xml><?xml version="1.0" encoding="utf-8"?>
-<w:comments xmlns:wpc="http://schemas.microsoft.com/office/word/2010/wordprocessingCanvas" xmlns:cx="http://schemas.microsoft.com/office/drawing/2014/chartex" xmlns:cx1="http://schemas.microsoft.com/office/drawing/2015/9/8/chartex" xmlns:cx2="http://schemas.microsoft.com/office/drawing/2015/10/21/chartex" xmlns:cx3="http://schemas.microsoft.com/office/drawing/2016/5/9/chartex" xmlns:cx4="http://schemas.microsoft.com/office/drawing/2016/5/10/chartex" xmlns:cx5="http://schemas.microsoft.com/office/drawing/2016/5/11/chartex" xmlns:cx6="http://schemas.microsoft.com/office/drawing/2016/5/12/chartex" xmlns:cx7="http://schemas.microsoft.com/office/drawing/2016/5/13/chartex" xmlns:cx8="http://schemas.microsoft.com/office/drawing/2016/5/14/chartex" xmlns:mc="http://schemas.openxmlformats.org/markup-compatibility/2006" xmlns:aink="http://schemas.microsoft.com/office/drawing/2016/ink" xmlns:am3d="http://schemas.microsoft.com/office/drawing/2017/model3d" xmlns:o="urn:schemas-microsoft-com:office:office" xmlns:oel="http://schemas.microsoft.com/office/2019/extlst" xmlns:r="http://schemas.openxmlformats.org/officeDocument/2006/relationships" xmlns:m="http://schemas.openxmlformats.org/officeDocument/2006/math" xmlns:v="urn:schemas-microsoft-com:vml" xmlns:wp14="http://schemas.microsoft.com/office/word/2010/wordprocessingDrawing" xmlns:wp="http://schemas.openxmlformats.org/drawingml/2006/wordprocessingDrawing" xmlns:w10="urn:schemas-microsoft-com:office:word" xmlns:w="http://schemas.openxmlformats.org/wordprocessingml/2006/main" xmlns:w14="http://schemas.microsoft.com/office/word/2010/wordml" xmlns:w15="http://schemas.microsoft.com/office/word/2012/wordml" xmlns:w16cex="http://schemas.microsoft.com/office/word/2018/wordml/cex" xmlns:w16cid="http://schemas.microsoft.com/office/word/2016/wordml/cid" xmlns:w16="http://schemas.microsoft.com/office/word/2018/wordml" xmlns:w16du="http://schemas.microsoft.com/office/word/2023/wordml/word16du" xmlns:w16sdtdh="http://schemas.microsoft.com/office/word/2020/wordml/sdtdatahash" xmlns:w16sdtfl="http://schemas.microsoft.com/office/word/2024/wordml/sdtformatlock" xmlns:w16se="http://schemas.microsoft.com/office/word/2015/wordml/symex" xmlns:wpg="http://schemas.microsoft.com/office/word/2010/wordprocessingGroup" xmlns:wpi="http://schemas.microsoft.com/office/word/2010/wordprocessingInk" xmlns:wne="http://schemas.microsoft.com/office/word/2006/wordml" xmlns:wps="http://schemas.microsoft.com/office/word/2010/wordprocessingShape" mc:Ignorable="w14 w15 w16se w16cid w16 w16cex w16sdtdh w16sdtfl w16du wp14">
-  <w:comment w:id="35" w:author="Matt Sydes" w:date="2026-07-03T17:29:00Z" w:initials="MSy">
-    <w:p>
-      <w:pPr>
-        <w:pStyle w:val="CommentText"/>
-      </w:pPr>
-      <w:r>
-        <w:rPr>
-          <w:rStyle w:val="CommentReference"/>
-        </w:rPr>
-        <w:annotationRef/>
-      </w:r>
-      <w:r>
-        <w:rPr>
-          <w:b/>
-          <w:bCs/>
-        </w:rPr>
-        <w:t>NOTE</w:t>
-      </w:r>
-    </w:p>
-    <w:p>
-      <w:pPr>
-        <w:pStyle w:val="CommentText"/>
-      </w:pPr>
-      <w:r>
-        <w:t>This link gives me a 404 error</w:t>
-      </w:r>
-    </w:p>
-    <w:p>
-      <w:pPr>
-        <w:pStyle w:val="CommentText"/>
-      </w:pPr>
-      <w:r>
-        <w:t>Is this also going into SSC?</w:t>
-      </w:r>
-    </w:p>
-  </w:comment>
-  <w:comment w:id="36" w:author="Ian White" w:date="2026-07-06T10:28:00Z" w:initials="IW">
-    <w:p>
-      <w:pPr>
-        <w:pStyle w:val="CommentText"/>
-      </w:pPr>
-      <w:r>
-        <w:rPr>
-          <w:rStyle w:val="CommentReference"/>
-        </w:rPr>
-        <w:annotationRef/>
-      </w:r>
-      <w:r>
-        <w:t>The repo is not yet public, but I can give access to anyone who sends me their github id</w:t>
-      </w:r>
-    </w:p>
-  </w:comment>
-  <w:comment w:id="130" w:author="Matt Sydes" w:date="2026-07-03T17:30:00Z" w:initials="MSy">
-    <w:p>
-      <w:pPr>
-        <w:pStyle w:val="CommentText"/>
-      </w:pPr>
-      <w:r>
-        <w:rPr>
-          <w:rStyle w:val="CommentReference"/>
-        </w:rPr>
-        <w:annotationRef/>
-      </w:r>
-      <w:r>
-        <w:rPr>
-          <w:b/>
-          <w:bCs/>
-        </w:rPr>
-        <w:t>SUGGESTION</w:t>
-      </w:r>
-    </w:p>
-    <w:p>
-      <w:pPr>
-        <w:pStyle w:val="CommentText"/>
-      </w:pPr>
-      <w:r>
-        <w:t>Should this be 0.05 rather than 50%?</w:t>
-      </w:r>
-    </w:p>
-  </w:comment>
-  <w:comment w:id="131" w:author="Ian White" w:date="2026-07-06T10:51:00Z" w:initials="IW">
-    <w:p>
-      <w:pPr>
-        <w:pStyle w:val="CommentText"/>
-      </w:pPr>
-      <w:r>
-        <w:rPr>
-          <w:rStyle w:val="CommentReference"/>
-        </w:rPr>
-        <w:annotationRef/>
-      </w:r>
-      <w:r>
-        <w:t>No, it really is 50%</w:t>
-      </w:r>
-    </w:p>
-  </w:comment>
-</w:comments>
-</file>
-
-<file path=word/commentsExtended.xml><?xml version="1.0" encoding="utf-8"?>
-<w15:commentsEx xmlns:wpc="http://schemas.microsoft.com/office/word/2010/wordprocessingCanvas" xmlns:cx="http://schemas.microsoft.com/office/drawing/2014/chartex" xmlns:cx1="http://schemas.microsoft.com/office/drawing/2015/9/8/chartex" xmlns:cx2="http://schemas.microsoft.com/office/drawing/2015/10/21/chartex" xmlns:cx3="http://schemas.microsoft.com/office/drawing/2016/5/9/chartex" xmlns:cx4="http://schemas.microsoft.com/office/drawing/2016/5/10/chartex" xmlns:cx5="http://schemas.microsoft.com/office/drawing/2016/5/11/chartex" xmlns:cx6="http://schemas.microsoft.com/office/drawing/2016/5/12/chartex" xmlns:cx7="http://schemas.microsoft.com/office/drawing/2016/5/13/chartex" xmlns:cx8="http://schemas.microsoft.com/office/drawing/2016/5/14/chartex" xmlns:mc="http://schemas.openxmlformats.org/markup-compatibility/2006" xmlns:aink="http://schemas.microsoft.com/office/drawing/2016/ink" xmlns:am3d="http://schemas.microsoft.com/office/drawing/2017/model3d" xmlns:o="urn:schemas-microsoft-com:office:office" xmlns:oel="http://schemas.microsoft.com/office/2019/extlst" xmlns:r="http://schemas.openxmlformats.org/officeDocument/2006/relationships" xmlns:m="http://schemas.openxmlformats.org/officeDocument/2006/math" xmlns:v="urn:schemas-microsoft-com:vml" xmlns:wp14="http://schemas.microsoft.com/office/word/2010/wordprocessingDrawing" xmlns:wp="http://schemas.openxmlformats.org/drawingml/2006/wordprocessingDrawing" xmlns:w10="urn:schemas-microsoft-com:office:word" xmlns:w="http://schemas.openxmlformats.org/wordprocessingml/2006/main" xmlns:w14="http://schemas.microsoft.com/office/word/2010/wordml" xmlns:w15="http://schemas.microsoft.com/office/word/2012/wordml" xmlns:w16cex="http://schemas.microsoft.com/office/word/2018/wordml/cex" xmlns:w16cid="http://schemas.microsoft.com/office/word/2016/wordml/cid" xmlns:w16="http://schemas.microsoft.com/office/word/2018/wordml" xmlns:w16du="http://schemas.microsoft.com/office/word/2023/wordml/word16du" xmlns:w16sdtdh="http://schemas.microsoft.com/office/word/2020/wordml/sdtdatahash" xmlns:w16sdtfl="http://schemas.microsoft.com/office/word/2024/wordml/sdtformatlock" xmlns:w16se="http://schemas.microsoft.com/office/word/2015/wordml/symex" xmlns:wpg="http://schemas.microsoft.com/office/word/2010/wordprocessingGroup" xmlns:wpi="http://schemas.microsoft.com/office/word/2010/wordprocessingInk" xmlns:wne="http://schemas.microsoft.com/office/word/2006/wordml" xmlns:wps="http://schemas.microsoft.com/office/word/2010/wordprocessingShape" mc:Ignorable="w14 w15 w16se w16cid w16 w16cex w16sdtdh w16sdtfl w16du wp14">
-  <w15:commentEx w15:paraId="73708A25" w15:done="0"/>
-  <w15:commentEx w15:paraId="5BFF4A43" w15:paraIdParent="73708A25" w15:done="0"/>
-  <w15:commentEx w15:paraId="02E71140" w15:done="0"/>
-  <w15:commentEx w15:paraId="07BDD65C" w15:paraIdParent="02E71140" w15:done="0"/>
-</w15:commentsEx>
-</file>
-
-<file path=word/commentsExtensible.xml><?xml version="1.0" encoding="utf-8"?>
-<w16cex:commentsExtensible xmlns:wpc="http://schemas.microsoft.com/office/word/2010/wordprocessingCanvas" xmlns:cx="http://schemas.microsoft.com/office/drawing/2014/chartex" xmlns:cx1="http://schemas.microsoft.com/office/drawing/2015/9/8/chartex" xmlns:cx2="http://schemas.microsoft.com/office/drawing/2015/10/21/chartex" xmlns:cx3="http://schemas.microsoft.com/office/drawing/2016/5/9/chartex" xmlns:cx4="http://schemas.microsoft.com/office/drawing/2016/5/10/chartex" xmlns:cx5="http://schemas.microsoft.com/office/drawing/2016/5/11/chartex" xmlns:cx6="http://schemas.microsoft.com/office/drawing/2016/5/12/chartex" xmlns:cx7="http://schemas.microsoft.com/office/drawing/2016/5/13/chartex" xmlns:cx8="http://schemas.microsoft.com/office/drawing/2016/5/14/chartex" xmlns:cr="http://schemas.microsoft.com/office/comments/2020/reactions" xmlns:mc="http://schemas.openxmlformats.org/markup-compatibility/2006" xmlns:aink="http://schemas.microsoft.com/office/drawing/2016/ink" xmlns:am3d="http://schemas.microsoft.com/office/drawing/2017/model3d" xmlns:o="urn:schemas-microsoft-com:office:office" xmlns:oel="http://schemas.microsoft.com/office/2019/extlst" xmlns:r="http://schemas.openxmlformats.org/officeDocument/2006/relationships" xmlns:m="http://schemas.openxmlformats.org/officeDocument/2006/math" xmlns:v="urn:schemas-microsoft-com:vml" xmlns:wp14="http://schemas.microsoft.com/office/word/2010/wordprocessingDrawing" xmlns:wp="http://schemas.openxmlformats.org/drawingml/2006/wordprocessingDrawing" xmlns:w10="urn:schemas-microsoft-com:office:word" xmlns:w="http://schemas.openxmlformats.org/wordprocessingml/2006/main" xmlns:w14="http://schemas.microsoft.com/office/word/2010/wordml" xmlns:w15="http://schemas.microsoft.com/office/word/2012/wordml" xmlns:w16cex="http://schemas.microsoft.com/office/word/2018/wordml/cex" xmlns:w16cid="http://schemas.microsoft.com/office/word/2016/wordml/cid" xmlns:w16="http://schemas.microsoft.com/office/word/2018/wordml" xmlns:w16du="http://schemas.microsoft.com/office/word/2023/wordml/word16du" xmlns:w16sdtdh="http://schemas.microsoft.com/office/word/2020/wordml/sdtdatahash" xmlns:w16sdtfl="http://schemas.microsoft.com/office/word/2024/wordml/sdtformatlock" xmlns:w16se="http://schemas.microsoft.com/office/word/2015/wordml/symex" xmlns:wpg="http://schemas.microsoft.com/office/word/2010/wordprocessingGroup" xmlns:wpi="http://schemas.microsoft.com/office/word/2010/wordprocessingInk" xmlns:wne="http://schemas.microsoft.com/office/word/2006/wordml" xmlns:wps="http://schemas.microsoft.com/office/word/2010/wordprocessingShape" mc:Ignorable="w14 w15 w16se w16cid w16 w16cex w16sdtdh w16sdtfl cr w16du wp14">
-  <w16cex:commentExtensible w16cex:durableId="3E9AB7B5" w16cex:dateUtc="2026-07-03T16:29:00Z"/>
-  <w16cex:commentExtensible w16cex:durableId="52CEFB89" w16cex:dateUtc="2026-07-06T09:28:00Z"/>
-  <w16cex:commentExtensible w16cex:durableId="556B1CC6" w16cex:dateUtc="2026-07-03T16:30:00Z"/>
-  <w16cex:commentExtensible w16cex:durableId="75CE6124" w16cex:dateUtc="2026-07-06T09:51:00Z"/>
-</w16cex:commentsExtensible>
-</file>
-
-<file path=word/commentsIds.xml><?xml version="1.0" encoding="utf-8"?>
-<w16cid:commentsIds xmlns:wpc="http://schemas.microsoft.com/office/word/2010/wordprocessingCanvas" xmlns:cx="http://schemas.microsoft.com/office/drawing/2014/chartex" xmlns:cx1="http://schemas.microsoft.com/office/drawing/2015/9/8/chartex" xmlns:cx2="http://schemas.microsoft.com/office/drawing/2015/10/21/chartex" xmlns:cx3="http://schemas.microsoft.com/office/drawing/2016/5/9/chartex" xmlns:cx4="http://schemas.microsoft.com/office/drawing/2016/5/10/chartex" xmlns:cx5="http://schemas.microsoft.com/office/drawing/2016/5/11/chartex" xmlns:cx6="http://schemas.microsoft.com/office/drawing/2016/5/12/chartex" xmlns:cx7="http://schemas.microsoft.com/office/drawing/2016/5/13/chartex" xmlns:cx8="http://schemas.microsoft.com/office/drawing/2016/5/14/chartex" xmlns:mc="http://schemas.openxmlformats.org/markup-compatibility/2006" xmlns:aink="http://schemas.microsoft.com/office/drawing/2016/ink" xmlns:am3d="http://schemas.microsoft.com/office/drawing/2017/model3d" xmlns:o="urn:schemas-microsoft-com:office:office" xmlns:oel="http://schemas.microsoft.com/office/2019/extlst" xmlns:r="http://schemas.openxmlformats.org/officeDocument/2006/relationships" xmlns:m="http://schemas.openxmlformats.org/officeDocument/2006/math" xmlns:v="urn:schemas-microsoft-com:vml" xmlns:wp14="http://schemas.microsoft.com/office/word/2010/wordprocessingDrawing" xmlns:wp="http://schemas.openxmlformats.org/drawingml/2006/wordprocessingDrawing" xmlns:w10="urn:schemas-microsoft-com:office:word" xmlns:w="http://schemas.openxmlformats.org/wordprocessingml/2006/main" xmlns:w14="http://schemas.microsoft.com/office/word/2010/wordml" xmlns:w15="http://schemas.microsoft.com/office/word/2012/wordml" xmlns:w16cex="http://schemas.microsoft.com/office/word/2018/wordml/cex" xmlns:w16cid="http://schemas.microsoft.com/office/word/2016/wordml/cid" xmlns:w16="http://schemas.microsoft.com/office/word/2018/wordml" xmlns:w16du="http://schemas.microsoft.com/office/word/2023/wordml/word16du" xmlns:w16sdtdh="http://schemas.microsoft.com/office/word/2020/wordml/sdtdatahash" xmlns:w16sdtfl="http://schemas.microsoft.com/office/word/2024/wordml/sdtformatlock" xmlns:w16se="http://schemas.microsoft.com/office/word/2015/wordml/symex" xmlns:wpg="http://schemas.microsoft.com/office/word/2010/wordprocessingGroup" xmlns:wpi="http://schemas.microsoft.com/office/word/2010/wordprocessingInk" xmlns:wne="http://schemas.microsoft.com/office/word/2006/wordml" xmlns:wps="http://schemas.microsoft.com/office/word/2010/wordprocessingShape" mc:Ignorable="w14 w15 w16se w16cid w16 w16cex w16sdtdh w16sdtfl w16du wp14">
-  <w16cid:commentId w16cid:paraId="73708A25" w16cid:durableId="3E9AB7B5"/>
-  <w16cid:commentId w16cid:paraId="5BFF4A43" w16cid:durableId="52CEFB89"/>
-  <w16cid:commentId w16cid:paraId="02E71140" w16cid:durableId="556B1CC6"/>
-  <w16cid:commentId w16cid:paraId="07BDD65C" w16cid:durableId="75CE6124"/>
-</w16cid:commentsIds>
 </file>
 
 <file path=word/endnotes.xml><?xml version="1.0" encoding="utf-8"?>
@@ -3318,7 +3770,7 @@
       <w:lvlText w:val="%1."/>
       <w:lvlJc w:val="left"/>
       <w:pPr>
-        <w:ind w:left="720" w:hanging="360"/>
+        <w:ind w:left="360" w:hanging="360"/>
       </w:pPr>
       <w:rPr>
         <w:rFonts w:hint="default"/>
@@ -3330,7 +3782,7 @@
       <w:lvlText w:val="%2."/>
       <w:lvlJc w:val="left"/>
       <w:pPr>
-        <w:ind w:left="1440" w:hanging="360"/>
+        <w:ind w:left="1080" w:hanging="360"/>
       </w:pPr>
     </w:lvl>
     <w:lvl w:ilvl="2" w:tplc="0809001B" w:tentative="1">
@@ -3339,7 +3791,7 @@
       <w:lvlText w:val="%3."/>
       <w:lvlJc w:val="right"/>
       <w:pPr>
-        <w:ind w:left="2160" w:hanging="180"/>
+        <w:ind w:left="1800" w:hanging="180"/>
       </w:pPr>
     </w:lvl>
     <w:lvl w:ilvl="3" w:tplc="0809000F" w:tentative="1">
@@ -3348,7 +3800,7 @@
       <w:lvlText w:val="%4."/>
       <w:lvlJc w:val="left"/>
       <w:pPr>
-        <w:ind w:left="2880" w:hanging="360"/>
+        <w:ind w:left="2520" w:hanging="360"/>
       </w:pPr>
     </w:lvl>
     <w:lvl w:ilvl="4" w:tplc="08090019" w:tentative="1">
@@ -3357,7 +3809,7 @@
       <w:lvlText w:val="%5."/>
       <w:lvlJc w:val="left"/>
       <w:pPr>
-        <w:ind w:left="3600" w:hanging="360"/>
+        <w:ind w:left="3240" w:hanging="360"/>
       </w:pPr>
     </w:lvl>
     <w:lvl w:ilvl="5" w:tplc="0809001B" w:tentative="1">
@@ -3366,7 +3818,7 @@
       <w:lvlText w:val="%6."/>
       <w:lvlJc w:val="right"/>
       <w:pPr>
-        <w:ind w:left="4320" w:hanging="180"/>
+        <w:ind w:left="3960" w:hanging="180"/>
       </w:pPr>
     </w:lvl>
     <w:lvl w:ilvl="6" w:tplc="0809000F" w:tentative="1">
@@ -3375,7 +3827,7 @@
       <w:lvlText w:val="%7."/>
       <w:lvlJc w:val="left"/>
       <w:pPr>
-        <w:ind w:left="5040" w:hanging="360"/>
+        <w:ind w:left="4680" w:hanging="360"/>
       </w:pPr>
     </w:lvl>
     <w:lvl w:ilvl="7" w:tplc="08090019" w:tentative="1">
@@ -3384,7 +3836,7 @@
       <w:lvlText w:val="%8."/>
       <w:lvlJc w:val="left"/>
       <w:pPr>
-        <w:ind w:left="5760" w:hanging="360"/>
+        <w:ind w:left="5400" w:hanging="360"/>
       </w:pPr>
     </w:lvl>
     <w:lvl w:ilvl="8" w:tplc="0809001B" w:tentative="1">
@@ -3393,7 +3845,7 @@
       <w:lvlText w:val="%9."/>
       <w:lvlJc w:val="right"/>
       <w:pPr>
-        <w:ind w:left="6480" w:hanging="180"/>
+        <w:ind w:left="6120" w:hanging="180"/>
       </w:pPr>
     </w:lvl>
   </w:abstractNum>
@@ -5461,17 +5913,6 @@
     <w:abstractNumId w:val="0"/>
   </w:num>
 </w:numbering>
-</file>
-
-<file path=word/people.xml><?xml version="1.0" encoding="utf-8"?>
-<w15:people xmlns:wpc="http://schemas.microsoft.com/office/word/2010/wordprocessingCanvas" xmlns:cx="http://schemas.microsoft.com/office/drawing/2014/chartex" xmlns:cx1="http://schemas.microsoft.com/office/drawing/2015/9/8/chartex" xmlns:cx2="http://schemas.microsoft.com/office/drawing/2015/10/21/chartex" xmlns:cx3="http://schemas.microsoft.com/office/drawing/2016/5/9/chartex" xmlns:cx4="http://schemas.microsoft.com/office/drawing/2016/5/10/chartex" xmlns:cx5="http://schemas.microsoft.com/office/drawing/2016/5/11/chartex" xmlns:cx6="http://schemas.microsoft.com/office/drawing/2016/5/12/chartex" xmlns:cx7="http://schemas.microsoft.com/office/drawing/2016/5/13/chartex" xmlns:cx8="http://schemas.microsoft.com/office/drawing/2016/5/14/chartex" xmlns:mc="http://schemas.openxmlformats.org/markup-compatibility/2006" xmlns:aink="http://schemas.microsoft.com/office/drawing/2016/ink" xmlns:am3d="http://schemas.microsoft.com/office/drawing/2017/model3d" xmlns:o="urn:schemas-microsoft-com:office:office" xmlns:oel="http://schemas.microsoft.com/office/2019/extlst" xmlns:r="http://schemas.openxmlformats.org/officeDocument/2006/relationships" xmlns:m="http://schemas.openxmlformats.org/officeDocument/2006/math" xmlns:v="urn:schemas-microsoft-com:vml" xmlns:wp14="http://schemas.microsoft.com/office/word/2010/wordprocessingDrawing" xmlns:wp="http://schemas.openxmlformats.org/drawingml/2006/wordprocessingDrawing" xmlns:w10="urn:schemas-microsoft-com:office:word" xmlns:w="http://schemas.openxmlformats.org/wordprocessingml/2006/main" xmlns:w14="http://schemas.microsoft.com/office/word/2010/wordml" xmlns:w15="http://schemas.microsoft.com/office/word/2012/wordml" xmlns:w16cex="http://schemas.microsoft.com/office/word/2018/wordml/cex" xmlns:w16cid="http://schemas.microsoft.com/office/word/2016/wordml/cid" xmlns:w16="http://schemas.microsoft.com/office/word/2018/wordml" xmlns:w16du="http://schemas.microsoft.com/office/word/2023/wordml/word16du" xmlns:w16sdtdh="http://schemas.microsoft.com/office/word/2020/wordml/sdtdatahash" xmlns:w16sdtfl="http://schemas.microsoft.com/office/word/2024/wordml/sdtformatlock" xmlns:w16se="http://schemas.microsoft.com/office/word/2015/wordml/symex" xmlns:wpg="http://schemas.microsoft.com/office/word/2010/wordprocessingGroup" xmlns:wpi="http://schemas.microsoft.com/office/word/2010/wordprocessingInk" xmlns:wne="http://schemas.microsoft.com/office/word/2006/wordml" xmlns:wps="http://schemas.microsoft.com/office/word/2010/wordprocessingShape" mc:Ignorable="w14 w15 w16se w16cid w16 w16cex w16sdtdh w16sdtfl w16du wp14">
-  <w15:person w15:author="Matt Sydes">
-    <w15:presenceInfo w15:providerId="None" w15:userId="Matt Sydes"/>
-  </w15:person>
-  <w15:person w15:author="Ian White">
-    <w15:presenceInfo w15:providerId="None" w15:userId="Ian White"/>
-  </w15:person>
-</w15:people>
 </file>
 
 <file path=word/styles.xml><?xml version="1.0" encoding="utf-8"?>
@@ -6445,6 +6886,162 @@
       <w:ind w:left="384" w:hanging="384"/>
     </w:pPr>
   </w:style>
+  <w:style w:type="table" w:styleId="PlainTable2">
+    <w:name w:val="Plain Table 2"/>
+    <w:basedOn w:val="TableNormal"/>
+    <w:uiPriority w:val="42"/>
+    <w:rsid w:val="004611D6"/>
+    <w:pPr>
+      <w:spacing w:after="0" w:line="240" w:lineRule="auto"/>
+    </w:pPr>
+    <w:tblPr>
+      <w:tblStyleRowBandSize w:val="1"/>
+      <w:tblStyleColBandSize w:val="1"/>
+      <w:tblBorders>
+        <w:top w:val="single" w:sz="4" w:space="0" w:color="7F7F7F" w:themeColor="text1" w:themeTint="80"/>
+        <w:bottom w:val="single" w:sz="4" w:space="0" w:color="7F7F7F" w:themeColor="text1" w:themeTint="80"/>
+      </w:tblBorders>
+    </w:tblPr>
+    <w:tblStylePr w:type="firstRow">
+      <w:rPr>
+        <w:b/>
+        <w:bCs/>
+      </w:rPr>
+      <w:tblPr/>
+      <w:tcPr>
+        <w:tcBorders>
+          <w:bottom w:val="single" w:sz="4" w:space="0" w:color="7F7F7F" w:themeColor="text1" w:themeTint="80"/>
+        </w:tcBorders>
+      </w:tcPr>
+    </w:tblStylePr>
+    <w:tblStylePr w:type="lastRow">
+      <w:rPr>
+        <w:b/>
+        <w:bCs/>
+      </w:rPr>
+      <w:tblPr/>
+      <w:tcPr>
+        <w:tcBorders>
+          <w:top w:val="single" w:sz="4" w:space="0" w:color="7F7F7F" w:themeColor="text1" w:themeTint="80"/>
+        </w:tcBorders>
+      </w:tcPr>
+    </w:tblStylePr>
+    <w:tblStylePr w:type="firstCol">
+      <w:rPr>
+        <w:b/>
+        <w:bCs/>
+      </w:rPr>
+    </w:tblStylePr>
+    <w:tblStylePr w:type="lastCol">
+      <w:rPr>
+        <w:b/>
+        <w:bCs/>
+      </w:rPr>
+    </w:tblStylePr>
+    <w:tblStylePr w:type="band1Vert">
+      <w:tblPr/>
+      <w:tcPr>
+        <w:tcBorders>
+          <w:left w:val="single" w:sz="4" w:space="0" w:color="7F7F7F" w:themeColor="text1" w:themeTint="80"/>
+          <w:right w:val="single" w:sz="4" w:space="0" w:color="7F7F7F" w:themeColor="text1" w:themeTint="80"/>
+        </w:tcBorders>
+      </w:tcPr>
+    </w:tblStylePr>
+    <w:tblStylePr w:type="band2Vert">
+      <w:tblPr/>
+      <w:tcPr>
+        <w:tcBorders>
+          <w:left w:val="single" w:sz="4" w:space="0" w:color="7F7F7F" w:themeColor="text1" w:themeTint="80"/>
+          <w:right w:val="single" w:sz="4" w:space="0" w:color="7F7F7F" w:themeColor="text1" w:themeTint="80"/>
+        </w:tcBorders>
+      </w:tcPr>
+    </w:tblStylePr>
+    <w:tblStylePr w:type="band1Horz">
+      <w:tblPr/>
+      <w:tcPr>
+        <w:tcBorders>
+          <w:top w:val="single" w:sz="4" w:space="0" w:color="7F7F7F" w:themeColor="text1" w:themeTint="80"/>
+          <w:bottom w:val="single" w:sz="4" w:space="0" w:color="7F7F7F" w:themeColor="text1" w:themeTint="80"/>
+        </w:tcBorders>
+      </w:tcPr>
+    </w:tblStylePr>
+  </w:style>
+  <w:style w:type="table" w:styleId="GridTable4">
+    <w:name w:val="Grid Table 4"/>
+    <w:basedOn w:val="TableNormal"/>
+    <w:uiPriority w:val="49"/>
+    <w:rsid w:val="004611D6"/>
+    <w:pPr>
+      <w:spacing w:after="0" w:line="240" w:lineRule="auto"/>
+    </w:pPr>
+    <w:tblPr>
+      <w:tblStyleRowBandSize w:val="1"/>
+      <w:tblStyleColBandSize w:val="1"/>
+      <w:tblBorders>
+        <w:top w:val="single" w:sz="4" w:space="0" w:color="666666" w:themeColor="text1" w:themeTint="99"/>
+        <w:left w:val="single" w:sz="4" w:space="0" w:color="666666" w:themeColor="text1" w:themeTint="99"/>
+        <w:bottom w:val="single" w:sz="4" w:space="0" w:color="666666" w:themeColor="text1" w:themeTint="99"/>
+        <w:right w:val="single" w:sz="4" w:space="0" w:color="666666" w:themeColor="text1" w:themeTint="99"/>
+        <w:insideH w:val="single" w:sz="4" w:space="0" w:color="666666" w:themeColor="text1" w:themeTint="99"/>
+        <w:insideV w:val="single" w:sz="4" w:space="0" w:color="666666" w:themeColor="text1" w:themeTint="99"/>
+      </w:tblBorders>
+    </w:tblPr>
+    <w:tblStylePr w:type="firstRow">
+      <w:rPr>
+        <w:b/>
+        <w:bCs/>
+        <w:color w:val="FFFFFF" w:themeColor="background1"/>
+      </w:rPr>
+      <w:tblPr/>
+      <w:tcPr>
+        <w:tcBorders>
+          <w:top w:val="single" w:sz="4" w:space="0" w:color="000000" w:themeColor="text1"/>
+          <w:left w:val="single" w:sz="4" w:space="0" w:color="000000" w:themeColor="text1"/>
+          <w:bottom w:val="single" w:sz="4" w:space="0" w:color="000000" w:themeColor="text1"/>
+          <w:right w:val="single" w:sz="4" w:space="0" w:color="000000" w:themeColor="text1"/>
+          <w:insideH w:val="nil"/>
+          <w:insideV w:val="nil"/>
+        </w:tcBorders>
+        <w:shd w:val="clear" w:color="auto" w:fill="000000" w:themeFill="text1"/>
+      </w:tcPr>
+    </w:tblStylePr>
+    <w:tblStylePr w:type="lastRow">
+      <w:rPr>
+        <w:b/>
+        <w:bCs/>
+      </w:rPr>
+      <w:tblPr/>
+      <w:tcPr>
+        <w:tcBorders>
+          <w:top w:val="double" w:sz="4" w:space="0" w:color="000000" w:themeColor="text1"/>
+        </w:tcBorders>
+      </w:tcPr>
+    </w:tblStylePr>
+    <w:tblStylePr w:type="firstCol">
+      <w:rPr>
+        <w:b/>
+        <w:bCs/>
+      </w:rPr>
+    </w:tblStylePr>
+    <w:tblStylePr w:type="lastCol">
+      <w:rPr>
+        <w:b/>
+        <w:bCs/>
+      </w:rPr>
+    </w:tblStylePr>
+    <w:tblStylePr w:type="band1Vert">
+      <w:tblPr/>
+      <w:tcPr>
+        <w:shd w:val="clear" w:color="auto" w:fill="CCCCCC" w:themeFill="text1" w:themeFillTint="33"/>
+      </w:tcPr>
+    </w:tblStylePr>
+    <w:tblStylePr w:type="band1Horz">
+      <w:tblPr/>
+      <w:tcPr>
+        <w:shd w:val="clear" w:color="auto" w:fill="CCCCCC" w:themeFill="text1" w:themeFillTint="33"/>
+      </w:tcPr>
+    </w:tblStylePr>
+  </w:style>
 </w:styles>
 </file>
 

</xml_diff>